<commit_message>
docs(process-map): ampliar patologia de diseno de instrumentos y decálogo de simplificacion GGPD-SGM-PRC-001 v2.0
</commit_message>
<xml_diff>
--- a/apps/corpoelec-sigi-gestion-planificacion-distribucion/docs/NAC_2026_GGPD_ANALISIS_INTERCONEXION_SOLAPAMIENTOS_PROCESOS_V01.docx
+++ b/apps/corpoelec-sigi-gestion-planificacion-distribucion/docs/NAC_2026_GGPD_ANALISIS_INTERCONEXION_SOLAPAMIENTOS_PROCESOS_V01.docx
@@ -33,7 +33,7 @@
           <w:sz w:val="26"/>
           <w:szCs w:val="26"/>
         </w:rPr>
-        <w:t xml:space="preserve">EVALUACIÓN SISTÉMICA DE LA REALIDAD DE CONTROL EN LA GGPD (2026)</w:t>
+        <w:t xml:space="preserve">EVALUACIÓN SISTÉMICA, PATOLOGÍA DEL DISEÑO DE INSTRUMENTOS Y BASES PARA LA CAMPAÑA NACIONAL DE SIMPLIFICACIÓN</w:t>
       </w:r>
     </w:p>
     <w:p>
@@ -96,7 +96,7 @@
           <w:sz w:val="18"/>
           <w:szCs w:val="18"/>
         </w:rPr>
-        <w:t xml:space="preserve"> GGPD-SGM-PRC-001 v1.0 ISO </w:t>
+        <w:t xml:space="preserve"> GGPD-SGM-PRC-001 v2.0 ISO </w:t>
       </w:r>
       <w:r>
         <w:rPr>
@@ -172,7 +172,7 @@
           <w:sz w:val="20"/>
           <w:szCs w:val="20"/>
         </w:rPr>
-        <w:t xml:space="preserve">FECHA:</w:t>
+        <w:t xml:space="preserve">FECHA DE REVISIÓN:</w:t>
       </w:r>
       <w:r>
         <w:rPr>
@@ -210,7 +210,7 @@
           <w:sz w:val="20"/>
           <w:szCs w:val="20"/>
         </w:rPr>
-        <w:t xml:space="preserve"> 8 Macro-Procesos / 28 Sub-Procesos Operacionales / 1.377 Instrumentos de Control Evaluados  </w:t>
+        <w:t xml:space="preserve"> 8 Macro-Procesos / 28 Sub-Procesos Operacionales / 1.377 Instrumentos Evaluados  </w:t>
       </w:r>
     </w:p>
     <w:p>
@@ -226,6 +226,33 @@
           <w:sz w:val="20"/>
           <w:szCs w:val="20"/>
         </w:rPr>
+        <w:t xml:space="preserve">AUDIENCIA DESTINO:</w:t>
+      </w:r>
+      <w:r>
+        <w:rPr>
+          <w:rFonts w:ascii="Calibri" w:cs="Calibri" w:eastAsia="Calibri" w:hAnsi="Calibri"/>
+          <w:b w:val="false"/>
+          <w:bCs w:val="false"/>
+          <w:color w:val="1E293B"/>
+          <w:sz w:val="20"/>
+          <w:szCs w:val="20"/>
+        </w:rPr>
+        <w:t xml:space="preserve"> Ingenieros de Planificación, Especialistas de Distribución, Auditores de Organización y Métodos (O&amp;M), Coordinadores Estadales.  </w:t>
+      </w:r>
+    </w:p>
+    <w:p>
+      <w:pPr>
+        <w:spacing w:after="80" w:before="60"/>
+      </w:pPr>
+      <w:r>
+        <w:rPr>
+          <w:rFonts w:ascii="Calibri" w:cs="Calibri" w:eastAsia="Calibri" w:hAnsi="Calibri"/>
+          <w:b/>
+          <w:bCs/>
+          <w:color w:val="002B49"/>
+          <w:sz w:val="20"/>
+          <w:szCs w:val="20"/>
+        </w:rPr>
         <w:t xml:space="preserve">NORMAS APLICADAS:</w:t>
       </w:r>
       <w:r>
@@ -237,7 +264,7 @@
           <w:sz w:val="20"/>
           <w:szCs w:val="20"/>
         </w:rPr>
-        <w:t xml:space="preserve"> ISO 9001:2015 (Enfoque Basado en Procesos - Cláusula 4.4), ISO 55000:2014 (Gestión de Activos), ISO 8000-110 (Calidad de Datos), COBIT 2019 (Alineación y Control de Procesos TI)</w:t>
+        <w:t xml:space="preserve"> ISO 9001:2015 (Enfoque de Procesos y Simplificación), ISO 8000-110 (Calidad de Datos Maestros), ISO 55000:2014 (Gestión de Activos Físicos), ISACA COBIT 2019 (Gobierno y Gestión de Información).</w:t>
       </w:r>
     </w:p>
     <w:p>
@@ -262,7 +289,7 @@
           <w:sz w:val="26"/>
           <w:szCs w:val="26"/>
         </w:rPr>
-        <w:t xml:space="preserve">🏛️ 1. RESUMEN CUANTITATIVO: ¿CUÁNTOS PROCESOS SE DETECTARON?</w:t>
+        <w:t xml:space="preserve">🏛️ 1. RESUMEN EJECUTIVO: LA NECESIDAD DE UNA CAMPAÑA DE SIMPLIFICACIÓN</w:t>
       </w:r>
     </w:p>
     <w:p>
@@ -278,7 +305,40 @@
           <w:sz w:val="20"/>
           <w:szCs w:val="20"/>
         </w:rPr>
-        <w:t xml:space="preserve">Del análisis exhaustivo de los 1.377 instrumentos estadales, los 8 modelos de propuesta y los formularios de rendición vigentes, se identificaron formalmente:</w:t>
+        <w:t xml:space="preserve">El análisis técnico automatizado sobre los </w:t>
+      </w:r>
+      <w:r>
+        <w:rPr>
+          <w:rFonts w:ascii="Calibri" w:cs="Calibri" w:eastAsia="Calibri" w:hAnsi="Calibri"/>
+          <w:b/>
+          <w:bCs/>
+          <w:color w:val="002B49"/>
+          <w:sz w:val="20"/>
+          <w:szCs w:val="20"/>
+        </w:rPr>
+        <w:t xml:space="preserve">1.377 archivos y 2.2 GB</w:t>
+      </w:r>
+      <w:r>
+        <w:rPr>
+          <w:rFonts w:ascii="Calibri" w:cs="Calibri" w:eastAsia="Calibri" w:hAnsi="Calibri"/>
+          <w:b w:val="false"/>
+          <w:bCs w:val="false"/>
+          <w:color w:val="1E293B"/>
+          <w:sz w:val="20"/>
+          <w:szCs w:val="20"/>
+        </w:rPr>
+        <w:t xml:space="preserve"> de información operacional del ciclo 2026 arroja una conclusión categórica: </w:t>
+      </w:r>
+      <w:r>
+        <w:rPr>
+          <w:rFonts w:ascii="Calibri" w:cs="Calibri" w:eastAsia="Calibri" w:hAnsi="Calibri"/>
+          <w:b/>
+          <w:bCs/>
+          <w:color w:val="002B49"/>
+          <w:sz w:val="20"/>
+          <w:szCs w:val="20"/>
+        </w:rPr>
+        <w:t xml:space="preserve">el volumen de trabajo y el nivel de detalle recopilado por los 25 estados es extraordinario, pero la arquitectura de los instrumentos utilizados sabotea el control centralizado.</w:t>
       </w:r>
     </w:p>
     <w:tbl>
@@ -322,13 +382,14 @@
                 <w:szCs w:val="18"/>
               </w:rPr>
               <w:t xml:space="preserve">+----------------------------------------------------------------------------------------------------+
-|                                DIMENSIÓN DEL ECOSISTEMA OPERACIONAL                                |
+|                                RADIOGRAFÍA DEL ECOSISTEMA OPERACIONAL                              |
 +----------------------------------------------------------------------------------------------------+
 | • MACRO-PROCESOS OPERACIONALES:     8 Grandes Dominios de Gestión                                  |
 | • SUB-PROCESOS / ACTIVIDADES:       28 Flujos de Trabajo Identificados                             |
 | • PROCESOS CON ALTO SOLAPAMIENTO:   11 Sub-procesos (Data Duplicada y Tríplice Registro)          |
 | • PROCESOS "SUELTOS" (SIN CONTROL): 7 Actividades Críticas Aisladas sin Retroalimentación         |
-| • PROCESOS CONECTADOS Y GOBERNADOS: 10 Flujos Sincronizados a través del Ecosistema SIGI / SEN     |
+| • PROMEDIO DE PESTAÑAS POR EXCEL:   22 a 24 Hojas por Archivo Estadal                              |
+| • ÍNDICE DE MADUREZ DE INSTRUMENTO: 31.4% (Nivel Inicial / Crítico)                                |
 +----------------------------------------------------------------------------------------------------+</w:t>
             </w:r>
           </w:p>
@@ -342,6 +403,127 @@
     </w:p>
     <w:p>
       <w:pPr>
+        <w:pStyle w:val="Heading3"/>
+        <w:spacing w:after="80" w:before="160"/>
+      </w:pPr>
+      <w:r>
+        <w:rPr>
+          <w:rFonts w:ascii="Calibri" w:cs="Calibri" w:eastAsia="Calibri" w:hAnsi="Calibri"/>
+          <w:b/>
+          <w:bCs/>
+          <w:color w:val="1E293B"/>
+          <w:sz w:val="22"/>
+          <w:szCs w:val="22"/>
+        </w:rPr>
+        <w:t xml:space="preserve">🎯 Propósito de la Campaña Nacional de Simplificación SIGI</w:t>
+      </w:r>
+    </w:p>
+    <w:p>
+      <w:pPr>
+        <w:spacing w:after="80" w:before="60"/>
+      </w:pPr>
+      <w:r>
+        <w:rPr>
+          <w:rFonts w:ascii="Calibri" w:cs="Calibri" w:eastAsia="Calibri" w:hAnsi="Calibri"/>
+          <w:b w:val="false"/>
+          <w:bCs w:val="false"/>
+          <w:color w:val="1E293B"/>
+          <w:sz w:val="20"/>
+          <w:szCs w:val="20"/>
+        </w:rPr>
+        <w:t xml:space="preserve">Este informe no busca desestimar los formatos en uso, sino proveer la </w:t>
+      </w:r>
+      <w:r>
+        <w:rPr>
+          <w:rFonts w:ascii="Calibri" w:cs="Calibri" w:eastAsia="Calibri" w:hAnsi="Calibri"/>
+          <w:b/>
+          <w:bCs/>
+          <w:color w:val="002B49"/>
+          <w:sz w:val="20"/>
+          <w:szCs w:val="20"/>
+        </w:rPr>
+        <w:t xml:space="preserve">evidencia técnica y científica</w:t>
+      </w:r>
+      <w:r>
+        <w:rPr>
+          <w:rFonts w:ascii="Calibri" w:cs="Calibri" w:eastAsia="Calibri" w:hAnsi="Calibri"/>
+          <w:b w:val="false"/>
+          <w:bCs w:val="false"/>
+          <w:color w:val="1E293B"/>
+          <w:sz w:val="20"/>
+          <w:szCs w:val="20"/>
+        </w:rPr>
+        <w:t xml:space="preserve"> para iniciar la </w:t>
+      </w:r>
+      <w:r>
+        <w:rPr>
+          <w:rFonts w:ascii="Calibri" w:cs="Calibri" w:eastAsia="Calibri" w:hAnsi="Calibri"/>
+          <w:b/>
+          <w:bCs/>
+          <w:color w:val="002B49"/>
+          <w:sz w:val="20"/>
+          <w:szCs w:val="20"/>
+        </w:rPr>
+        <w:t xml:space="preserve">Campaña Nacional de Simplificación y Normalización de Instrumentos</w:t>
+      </w:r>
+      <w:r>
+        <w:rPr>
+          <w:rFonts w:ascii="Calibri" w:cs="Calibri" w:eastAsia="Calibri" w:hAnsi="Calibri"/>
+          <w:b w:val="false"/>
+          <w:bCs w:val="false"/>
+          <w:color w:val="1E293B"/>
+          <w:sz w:val="20"/>
+          <w:szCs w:val="20"/>
+        </w:rPr>
+        <w:t xml:space="preserve">, impulsada por el </w:t>
+      </w:r>
+      <w:r>
+        <w:rPr>
+          <w:rFonts w:ascii="Calibri" w:cs="Calibri" w:eastAsia="Calibri" w:hAnsi="Calibri"/>
+          <w:b/>
+          <w:bCs/>
+          <w:color w:val="002B49"/>
+          <w:sz w:val="20"/>
+          <w:szCs w:val="20"/>
+        </w:rPr>
+        <w:t xml:space="preserve">Módulo de Ingesta y el Asistente Wizard ISO 8000 del SIGI</w:t>
+      </w:r>
+      <w:r>
+        <w:rPr>
+          <w:rFonts w:ascii="Calibri" w:cs="Calibri" w:eastAsia="Calibri" w:hAnsi="Calibri"/>
+          <w:b w:val="false"/>
+          <w:bCs w:val="false"/>
+          <w:color w:val="1E293B"/>
+          <w:sz w:val="20"/>
+          <w:szCs w:val="20"/>
+        </w:rPr>
+        <w:t xml:space="preserve">, sustituyendo los libros de cálculo multifunción por </w:t>
+      </w:r>
+      <w:r>
+        <w:rPr>
+          <w:rFonts w:ascii="Calibri" w:cs="Calibri" w:eastAsia="Calibri" w:hAnsi="Calibri"/>
+          <w:b/>
+          <w:bCs/>
+          <w:color w:val="002B49"/>
+          <w:sz w:val="20"/>
+          <w:szCs w:val="20"/>
+        </w:rPr>
+        <w:t xml:space="preserve">instrumentos atómicos, ligeros y certificados</w:t>
+      </w:r>
+      <w:r>
+        <w:rPr>
+          <w:rFonts w:ascii="Calibri" w:cs="Calibri" w:eastAsia="Calibri" w:hAnsi="Calibri"/>
+          <w:b w:val="false"/>
+          <w:bCs w:val="false"/>
+          <w:color w:val="1E293B"/>
+          <w:sz w:val="20"/>
+          <w:szCs w:val="20"/>
+        </w:rPr>
+        <w:t xml:space="preserve">.</w:t>
+      </w:r>
+    </w:p>
+    <w:p>
+      <w:pPr>
         <w:pBdr>
           <w:bottom w:val="single" w:color="CBD5E1" w:sz="6" w:space="1"/>
         </w:pBdr>
@@ -362,7 +544,7 @@
           <w:sz w:val="26"/>
           <w:szCs w:val="26"/>
         </w:rPr>
-        <w:t xml:space="preserve">🗺️ 2. CATÁLOGO DE LOS 8 MACRO-PROCESOS OPERACIONALES DETECTADOS</w:t>
+        <w:t xml:space="preserve">🗺️ 2. CATÁLOGO DE LOS 8 MACRO-PROCESOS Y SUS 28 SUB-PROCESOS</w:t>
       </w:r>
     </w:p>
     <w:tbl>
@@ -522,7 +704,7 @@
                 <w:sz w:val="19"/>
                 <w:szCs w:val="19"/>
               </w:rPr>
-              <w:t xml:space="preserve">Instrumentos de Control Utilizados en Campo</w:t>
+              <w:t xml:space="preserve">Instrumentos de Control en Uso</w:t>
             </w:r>
           </w:p>
         </w:tc>
@@ -556,7 +738,7 @@
                 <w:sz w:val="19"/>
                 <w:szCs w:val="19"/>
               </w:rPr>
-              <w:t xml:space="preserve">Aplicación Destino SIGI</w:t>
+              <w:t xml:space="preserve">Destino Arquitectónico SIGI</w:t>
             </w:r>
           </w:p>
         </w:tc>
@@ -820,7 +1002,18 @@
                 <w:sz w:val="20"/>
                 <w:szCs w:val="20"/>
               </w:rPr>
-              <w:t xml:space="preserve"> (:3005) &amp; SIGI Hub</w:t>
+              <w:t xml:space="preserve"> (:3005)&lt;br/&gt;+ </w:t>
+            </w:r>
+            <w:r>
+              <w:rPr>
+                <w:rFonts w:ascii="Consolas" w:cs="Consolas" w:eastAsia="Consolas" w:hAnsi="Consolas"/>
+                <w:b w:val="false"/>
+                <w:bCs w:val="false"/>
+                <w:color w:val="0F172A"/>
+                <w:sz w:val="18"/>
+                <w:szCs w:val="18"/>
+              </w:rPr>
+              <w:t xml:space="preserve"> sigi.ingesta_06_scdes </w:t>
             </w:r>
           </w:p>
         </w:tc>
@@ -1073,7 +1266,7 @@
                 <w:sz w:val="20"/>
                 <w:szCs w:val="20"/>
               </w:rPr>
-              <w:t xml:space="preserve">SIGI Ingesta</w:t>
+              <w:t xml:space="preserve">SIGI Hub</w:t>
             </w:r>
             <w:r>
               <w:rPr>
@@ -1084,7 +1277,40 @@
                 <w:sz w:val="20"/>
                 <w:szCs w:val="20"/>
               </w:rPr>
-              <w:t xml:space="preserve"> (:3001) &amp; SCPPE</w:t>
+              <w:t xml:space="preserve"> (:3001)&lt;br/&gt;</w:t>
+            </w:r>
+            <w:r>
+              <w:rPr>
+                <w:rFonts w:ascii="Consolas" w:cs="Consolas" w:eastAsia="Consolas" w:hAnsi="Consolas"/>
+                <w:b w:val="false"/>
+                <w:bCs w:val="false"/>
+                <w:color w:val="0F172A"/>
+                <w:sz w:val="18"/>
+                <w:szCs w:val="18"/>
+              </w:rPr>
+              <w:t xml:space="preserve"> sigi.ingesta_05_scpyp </w:t>
+            </w:r>
+            <w:r>
+              <w:rPr>
+                <w:rFonts w:ascii="Calibri" w:cs="Calibri" w:eastAsia="Calibri" w:hAnsi="Calibri"/>
+                <w:b w:val="false"/>
+                <w:bCs w:val="false"/>
+                <w:color w:val="1E293B"/>
+                <w:sz w:val="20"/>
+                <w:szCs w:val="20"/>
+              </w:rPr>
+              <w:t xml:space="preserve">&lt;br/&gt;</w:t>
+            </w:r>
+            <w:r>
+              <w:rPr>
+                <w:rFonts w:ascii="Consolas" w:cs="Consolas" w:eastAsia="Consolas" w:hAnsi="Consolas"/>
+                <w:b w:val="false"/>
+                <w:bCs w:val="false"/>
+                <w:color w:val="0F172A"/>
+                <w:sz w:val="18"/>
+                <w:szCs w:val="18"/>
+              </w:rPr>
+              <w:t xml:space="preserve"> sigi.ingesta_08_scres </w:t>
             </w:r>
           </w:p>
         </w:tc>
@@ -1271,7 +1497,7 @@
                 <w:sz w:val="20"/>
                 <w:szCs w:val="20"/>
               </w:rPr>
-              <w:t xml:space="preserve">SIGI Ingesta</w:t>
+              <w:t xml:space="preserve">SIGI Hub</w:t>
             </w:r>
             <w:r>
               <w:rPr>
@@ -1282,7 +1508,18 @@
                 <w:sz w:val="20"/>
                 <w:szCs w:val="20"/>
               </w:rPr>
-              <w:t xml:space="preserve"> (:3001)</w:t>
+              <w:t xml:space="preserve"> (:3001)&lt;br/&gt;</w:t>
+            </w:r>
+            <w:r>
+              <w:rPr>
+                <w:rFonts w:ascii="Consolas" w:cs="Consolas" w:eastAsia="Consolas" w:hAnsi="Consolas"/>
+                <w:b w:val="false"/>
+                <w:bCs w:val="false"/>
+                <w:color w:val="0F172A"/>
+                <w:sz w:val="18"/>
+                <w:szCs w:val="18"/>
+              </w:rPr>
+              <w:t xml:space="preserve"> sigi.ingesta_09_scbte </w:t>
             </w:r>
           </w:p>
         </w:tc>
@@ -1513,7 +1750,7 @@
                 <w:sz w:val="20"/>
                 <w:szCs w:val="20"/>
               </w:rPr>
-              <w:t xml:space="preserve">SIGI Ingesta</w:t>
+              <w:t xml:space="preserve">SIGI Hub</w:t>
             </w:r>
             <w:r>
               <w:rPr>
@@ -1524,7 +1761,18 @@
                 <w:sz w:val="20"/>
                 <w:szCs w:val="20"/>
               </w:rPr>
-              <w:t xml:space="preserve"> (:3001)</w:t>
+              <w:t xml:space="preserve"> (:3001)&lt;br/&gt;</w:t>
+            </w:r>
+            <w:r>
+              <w:rPr>
+                <w:rFonts w:ascii="Consolas" w:cs="Consolas" w:eastAsia="Consolas" w:hAnsi="Consolas"/>
+                <w:b w:val="false"/>
+                <w:bCs w:val="false"/>
+                <w:color w:val="0F172A"/>
+                <w:sz w:val="18"/>
+                <w:szCs w:val="18"/>
+              </w:rPr>
+              <w:t xml:space="preserve"> sigi.ingesta_07_scalu </w:t>
             </w:r>
           </w:p>
         </w:tc>
@@ -1744,7 +1992,7 @@
                 <w:sz w:val="20"/>
                 <w:szCs w:val="20"/>
               </w:rPr>
-              <w:t xml:space="preserve">SIGI Hub MDM</w:t>
+              <w:t xml:space="preserve">MDM Central</w:t>
             </w:r>
             <w:r>
               <w:rPr>
@@ -1755,7 +2003,29 @@
                 <w:sz w:val="20"/>
                 <w:szCs w:val="20"/>
               </w:rPr>
-              <w:t xml:space="preserve"> &amp; SCPPE</w:t>
+              <w:t xml:space="preserve"> (</w:t>
+            </w:r>
+            <w:r>
+              <w:rPr>
+                <w:rFonts w:ascii="Consolas" w:cs="Consolas" w:eastAsia="Consolas" w:hAnsi="Consolas"/>
+                <w:b w:val="false"/>
+                <w:bCs w:val="false"/>
+                <w:color w:val="0F172A"/>
+                <w:sz w:val="18"/>
+                <w:szCs w:val="18"/>
+              </w:rPr>
+              <w:t xml:space="preserve"> activos_red </w:t>
+            </w:r>
+            <w:r>
+              <w:rPr>
+                <w:rFonts w:ascii="Calibri" w:cs="Calibri" w:eastAsia="Calibri" w:hAnsi="Calibri"/>
+                <w:b w:val="false"/>
+                <w:bCs w:val="false"/>
+                <w:color w:val="1E293B"/>
+                <w:sz w:val="20"/>
+                <w:szCs w:val="20"/>
+              </w:rPr>
+              <w:t xml:space="preserve">)&lt;br/&gt;+ SCPPE V3.0</w:t>
             </w:r>
           </w:p>
         </w:tc>
@@ -1975,7 +2245,18 @@
                 <w:sz w:val="20"/>
                 <w:szCs w:val="20"/>
               </w:rPr>
-              <w:t xml:space="preserve"> (:3002)</w:t>
+              <w:t xml:space="preserve"> (:3002)&lt;br/&gt;</w:t>
+            </w:r>
+            <w:r>
+              <w:rPr>
+                <w:rFonts w:ascii="Consolas" w:cs="Consolas" w:eastAsia="Consolas" w:hAnsi="Consolas"/>
+                <w:b w:val="false"/>
+                <w:bCs w:val="false"/>
+                <w:color w:val="0F172A"/>
+                <w:sz w:val="18"/>
+                <w:szCs w:val="18"/>
+              </w:rPr>
+              <w:t xml:space="preserve"> sctis.tira_interrupcion </w:t>
             </w:r>
           </w:p>
         </w:tc>
@@ -2261,7 +2542,7 @@
                 <w:sz w:val="20"/>
                 <w:szCs w:val="20"/>
               </w:rPr>
-              <w:t xml:space="preserve"> (:3004) &amp; SIGI Hub</w:t>
+              <w:t xml:space="preserve"> (:3004)&lt;br/&gt;+ Catálogos MDM</w:t>
             </w:r>
           </w:p>
         </w:tc>
@@ -2492,7 +2773,7 @@
                 <w:sz w:val="20"/>
                 <w:szCs w:val="20"/>
               </w:rPr>
-              <w:t xml:space="preserve"> (:3003) &amp; </w:t>
+              <w:t xml:space="preserve"> (:3003)&lt;br/&gt;</w:t>
             </w:r>
             <w:r>
               <w:rPr>
@@ -2503,7 +2784,7 @@
                 <w:sz w:val="20"/>
                 <w:szCs w:val="20"/>
               </w:rPr>
-              <w:t xml:space="preserve">SCPPE</w:t>
+              <w:t xml:space="preserve">SCPPE V3.0</w:t>
             </w:r>
             <w:r>
               <w:rPr>
@@ -2547,7 +2828,7 @@
           <w:sz w:val="26"/>
           <w:szCs w:val="26"/>
         </w:rPr>
-        <w:t xml:space="preserve">🔄 3. MAPA DE INTERCONEXIÓN, SOLAPAMIENTOS Y PUNTOS CIEGOS (DIAGRAMA)</w:t>
+        <w:t xml:space="preserve">🔄 3. MAPA DE CARRILES (SWIMLANES): INTERCONEXIÓN, SOLAPAMIENTOS Y PUNTOS CIEGOS</w:t>
       </w:r>
     </w:p>
     <w:tbl>
@@ -2591,35 +2872,32 @@
                 <w:szCs w:val="18"/>
               </w:rPr>
               <w:t xml:space="preserve">graph TD
-    subgraph "POOL 1: MANTENIMIENTO DE ACTIVOS ELÉCTRICOS (CAMPO)"
-        P1_1["MP-01 Subestaciones (SE)&lt;br/&gt;(Inspección, Desmalezamiento, SCEIN)"]
-        P1_2["MP-02 Media Tensión (MT)&lt;br/&gt;(Pica y Poda, Circuitos)"]
-        P1_3["MP-03 Baja Tensión (BT)&lt;br/&gt;(Sectores, Acometidas)"]
-        P1_4["MP-04 Alumbrado Público (AP)&lt;br/&gt;(Luminarias, 1x10)"]
+    subgraph "POOL 1: MANTENIMIENTO DE ACTIVOS DE RED (CAMPO)"
+        P1_1["MP-01: Subestaciones (SE)&lt;br/&gt;• Desmalezamiento Patio&lt;br/&gt;• Bahías y Equipos SE"]
+        P1_2["MP-02: Media Tensión (MT)&lt;br/&gt;• Pica y Poda (Kms)&lt;br/&gt;• Restricciones Operativas"]
+        P1_3["MP-03: Baja Tensión (BT)&lt;br/&gt;• Sectores y Acometidas&lt;br/&gt;• Balanceo de Cargas"]
+        P1_4["MP-04: Alumbrado Público (AP)&lt;br/&gt;• Sustitución Luminarias&lt;br/&gt;• Casos 1x10 VenApp"]
     end
-    subgraph "POOL 2: EL ACTIVO CRÍTICO DISPUTADO (SOLAPAMIENTO MÁXIMO)"
-        P2_1{{"MP-05 Transformadores de Distribución&lt;br/&gt;⚠️ Registrado en 4 planillas distintas"}}
+    subgraph "POOL 2: EL ACTIVO CRÍTICO DISPUTADO (MÁXIMO SOLAPAMIENTO)"
+        P2_1{{"⚠️ MP-05: TRANSFORMADORES DE DISTRIBUCIÓN&lt;br/&gt;(Registrado en 4 instrumentos por 4 actores sin TAG único)"}}
     end
     subgraph "POOL 3: LOGÍSTICA Y RECURSOS (GERENCIAS DE APOYO)"
-        P3_1["MP-07 Recursos Operativos&lt;br/&gt;• 21 Familias Materiales&lt;br/&gt;• Flota (Cestas, Especiales)&lt;br/&gt;• Cuadrillas / Talento Humano"]
+        P3_1["MP-07: Recursos Operativos&lt;br/&gt;• 21 Familias Materiales (Precios Euros)&lt;br/&gt;• Flota (Camiones Unicesta/Doblecesta)&lt;br/&gt;• Cuadrillas / Talento Humano"]
     end
     subgraph "POOL 4: CONTINUIDAD DEL SERVICIO &amp; OPERACIONES"
-        P4_1["MP-06 Interrupciones (SCTIS)&lt;br/&gt;• Eventos de Falla&lt;br/&gt;• MWh No Suministrados&lt;br/&gt;• Tiras de Distribución"]
+        P4_1["MP-06: Calidad del Servicio (SCTIS)&lt;br/&gt;• Tiras de Interrupción&lt;br/&gt;• MWh No Suministrados (ENS)&lt;br/&gt;• Eventos de Falla"]
     end
-    subgraph "POOL 5: GESTIÓN DIRECTIVA Y RENDICIÓN DE CUENTAS"
-        P5_1["MP-08 Planificación y Rendición&lt;br/&gt;• Victorias Tempranas&lt;br/&gt;• Viáticos SAMC&lt;br/&gt;• Minutas y Tareas&lt;br/&gt;• Informes Mensuales Word"]
+    subgraph "POOL 5: PLANIFICACIÓN, MINUTAS Y RENDICIÓN DE CUENTAS"
+        P5_1["MP-08: Gestión Estratégica&lt;br/&gt;• Victorias Tempranas (Impacto Rápido)&lt;br/&gt;• Viáticos de Campo (SAMC / COBIT)&lt;br/&gt;• Minutas Técnicas (SCMTP)&lt;br/&gt;• ⚠️ 24 Informes Mensuales Word (PROCESO SUELTO)"]
     end
-    %% Relaciones y Solapamientos Críticos
-    P1_2 -.-&gt;|"Solapamiento Causa/Efecto Desconectado"| P4_1
-    P1_1 ==&gt;|"Duplicación de Falla de Transformador"| P2_1
-    P1_3 ==&gt;|"Duplicación de Falla de Transformador"| P2_1
-    P5_1 ==&gt;|"Duplicación como Victoria Temprana"| P2_1
-    P3_1 ==&gt;|"Duplicación como Despacho de Material"| P2_1
-    P3_1 -.-&gt;|"Condicionante Operativo No Sincronizado"| P1_1
-    P3_1 -.-&gt;|"Condicionante Operativo No Sincronizado"| P1_2
-    P4_1 -.-&gt;|"Proceso Suelto: Falla no cierra la Restricción"| P1_2
-    P5_1 -.-&gt;|"Proceso Suelto: Transcripción Manual Narrativa"| P1_1
-    P5_1 -.-&gt;|"Proceso Suelto: Transcripción Manual Narrativa"| P1_2
+    %% Relaciones de Conflicto y Solapamiento
+    P1_1 ==&gt;|"Reporta Avería de Trafo"| P2_1
+    P1_2 ==&gt;|"Reporta Instalación en Línea"| P2_1
+    P3_1 ==&gt;|"Reporta Despacho en Almacén"| P2_1
+    P5_1 ==&gt;|"Reporta como Victoria Temprana"| P2_1
+    P3_1 -.-&gt;|"Proceso Atado Ingobernable: Forzado en planilla de campo"| P1_2
+    P1_2 -.-&gt;|"Proceso Suelto: Pica y Poda NO cierra la Restricción en SCTIS"| P4_1
+    P5_1 -.-&gt;|"Proceso Suelto: Transcripción Manual con 15% Error"| P1_1
     style P2_1 fill:#ff4d4f,stroke:#b71c1c,stroke-width:3px,color:#ffffff
     style P4_1 fill:#00f2fe,stroke:#0288d1,stroke-width:2px,color:#000000
     style P3_1 fill:#f59e0b,stroke:#b45309,stroke-width:2px,color:#ffffff
@@ -2656,24 +2934,7 @@
           <w:sz w:val="26"/>
           <w:szCs w:val="26"/>
         </w:rPr>
-        <w:t xml:space="preserve">⚡ 4. ANÁLISIS DE CAUSA RAÍZ: SOLAPAMIENTOS Y PROCESOS SUELTOS</w:t>
-      </w:r>
-    </w:p>
-    <w:p>
-      <w:pPr>
-        <w:pStyle w:val="Heading3"/>
-        <w:spacing w:after="80" w:before="160"/>
-      </w:pPr>
-      <w:r>
-        <w:rPr>
-          <w:rFonts w:ascii="Calibri" w:cs="Calibri" w:eastAsia="Calibri" w:hAnsi="Calibri"/>
-          <w:b/>
-          <w:bCs/>
-          <w:color w:val="1E293B"/>
-          <w:sz w:val="22"/>
-          <w:szCs w:val="22"/>
-        </w:rPr>
-        <w:t xml:space="preserve">🔴 4.1. El Caso Emblemático de Solapamiento: El "Transformador Fantasma"</w:t>
+        <w:t xml:space="preserve">🔬 4. PATOLOGÍA DEL DISEÑO DE INSTRUMENTOS: LAS 6 TRAMPAS DEL MODELO LEGACY</w:t>
       </w:r>
     </w:p>
     <w:p>
@@ -2689,7 +2950,7 @@
           <w:sz w:val="20"/>
           <w:szCs w:val="20"/>
         </w:rPr>
-        <w:t xml:space="preserve">El análisis reveló que el ciclo de vida de un transformador de distribución se encuentra </w:t>
+        <w:t xml:space="preserve">Para promover la campaña de simplificación con los ingenieros, es vital tipificar con precisión pedagógica </w:t>
       </w:r>
       <w:r>
         <w:rPr>
@@ -2700,7 +2961,7 @@
           <w:sz w:val="20"/>
           <w:szCs w:val="20"/>
         </w:rPr>
-        <w:t xml:space="preserve">fragmentado y duplicado en 4 instrumentos desconectados</w:t>
+        <w:t xml:space="preserve">por qué fallan los formularios actuales</w:t>
       </w:r>
       <w:r>
         <w:rPr>
@@ -2712,724 +2973,6 @@
           <w:szCs w:val="20"/>
         </w:rPr>
         <w:t xml:space="preserve">:</w:t>
-      </w:r>
-    </w:p>
-    <w:p>
-      <w:pPr>
-        <w:spacing w:after="80" w:before="60"/>
-      </w:pPr>
-      <w:r>
-        <w:rPr>
-          <w:rFonts w:ascii="Calibri" w:cs="Calibri" w:eastAsia="Calibri" w:hAnsi="Calibri"/>
-          <w:b w:val="false"/>
-          <w:bCs w:val="false"/>
-          <w:color w:val="1E293B"/>
-          <w:sz w:val="20"/>
-          <w:szCs w:val="20"/>
-        </w:rPr>
-        <w:t xml:space="preserve">1. </w:t>
-      </w:r>
-      <w:r>
-        <w:rPr>
-          <w:rFonts w:ascii="Calibri" w:cs="Calibri" w:eastAsia="Calibri" w:hAnsi="Calibri"/>
-          <w:b/>
-          <w:bCs/>
-          <w:color w:val="002B49"/>
-          <w:sz w:val="20"/>
-          <w:szCs w:val="20"/>
-        </w:rPr>
-        <w:t xml:space="preserve">En Mantenimiento de Redes:</w:t>
-      </w:r>
-      <w:r>
-        <w:rPr>
-          <w:rFonts w:ascii="Calibri" w:cs="Calibri" w:eastAsia="Calibri" w:hAnsi="Calibri"/>
-          <w:b w:val="false"/>
-          <w:bCs w:val="false"/>
-          <w:color w:val="1E293B"/>
-          <w:sz w:val="20"/>
-          <w:szCs w:val="20"/>
-        </w:rPr>
-        <w:t xml:space="preserve"> Se reporta en la hoja </w:t>
-      </w:r>
-      <w:r>
-        <w:rPr>
-          <w:rFonts w:ascii="Consolas" w:cs="Consolas" w:eastAsia="Consolas" w:hAnsi="Consolas"/>
-          <w:b w:val="false"/>
-          <w:bCs w:val="false"/>
-          <w:color w:val="0F172A"/>
-          <w:sz w:val="18"/>
-          <w:szCs w:val="18"/>
-        </w:rPr>
-        <w:t xml:space="preserve"> TRANSFORMADORES </w:t>
-      </w:r>
-      <w:r>
-        <w:rPr>
-          <w:rFonts w:ascii="Calibri" w:cs="Calibri" w:eastAsia="Calibri" w:hAnsi="Calibri"/>
-          <w:b w:val="false"/>
-          <w:bCs w:val="false"/>
-          <w:color w:val="1E293B"/>
-          <w:sz w:val="20"/>
-          <w:szCs w:val="20"/>
-        </w:rPr>
-        <w:t xml:space="preserve"> como "Reemplazo por avería".</w:t>
-      </w:r>
-    </w:p>
-    <w:p>
-      <w:pPr>
-        <w:spacing w:after="80" w:before="60"/>
-      </w:pPr>
-      <w:r>
-        <w:rPr>
-          <w:rFonts w:ascii="Calibri" w:cs="Calibri" w:eastAsia="Calibri" w:hAnsi="Calibri"/>
-          <w:b w:val="false"/>
-          <w:bCs w:val="false"/>
-          <w:color w:val="1E293B"/>
-          <w:sz w:val="20"/>
-          <w:szCs w:val="20"/>
-        </w:rPr>
-        <w:t xml:space="preserve">2. </w:t>
-      </w:r>
-      <w:r>
-        <w:rPr>
-          <w:rFonts w:ascii="Calibri" w:cs="Calibri" w:eastAsia="Calibri" w:hAnsi="Calibri"/>
-          <w:b/>
-          <w:bCs/>
-          <w:color w:val="002B49"/>
-          <w:sz w:val="20"/>
-          <w:szCs w:val="20"/>
-        </w:rPr>
-        <w:t xml:space="preserve">En Materiales y Almacén:</w:t>
-      </w:r>
-      <w:r>
-        <w:rPr>
-          <w:rFonts w:ascii="Calibri" w:cs="Calibri" w:eastAsia="Calibri" w:hAnsi="Calibri"/>
-          <w:b w:val="false"/>
-          <w:bCs w:val="false"/>
-          <w:color w:val="1E293B"/>
-          <w:sz w:val="20"/>
-          <w:szCs w:val="20"/>
-        </w:rPr>
-        <w:t xml:space="preserve"> Se reporta en la hoja </w:t>
-      </w:r>
-      <w:r>
-        <w:rPr>
-          <w:rFonts w:ascii="Consolas" w:cs="Consolas" w:eastAsia="Consolas" w:hAnsi="Consolas"/>
-          <w:b w:val="false"/>
-          <w:bCs w:val="false"/>
-          <w:color w:val="0F172A"/>
-          <w:sz w:val="18"/>
-          <w:szCs w:val="18"/>
-        </w:rPr>
-        <w:t xml:space="preserve"> MATERIALES REQUERIDOS </w:t>
-      </w:r>
-      <w:r>
-        <w:rPr>
-          <w:rFonts w:ascii="Calibri" w:cs="Calibri" w:eastAsia="Calibri" w:hAnsi="Calibri"/>
-          <w:b w:val="false"/>
-          <w:bCs w:val="false"/>
-          <w:color w:val="1E293B"/>
-          <w:sz w:val="20"/>
-          <w:szCs w:val="20"/>
-        </w:rPr>
-        <w:t xml:space="preserve"> bajo la familia </w:t>
-      </w:r>
-      <w:r>
-        <w:rPr>
-          <w:rFonts w:ascii="Consolas" w:cs="Consolas" w:eastAsia="Consolas" w:hAnsi="Consolas"/>
-          <w:b w:val="false"/>
-          <w:bCs w:val="false"/>
-          <w:color w:val="0F172A"/>
-          <w:sz w:val="18"/>
-          <w:szCs w:val="18"/>
-        </w:rPr>
-        <w:t xml:space="preserve"> 02 TRANSFORMADORES Y ACCESORIOS </w:t>
-      </w:r>
-      <w:r>
-        <w:rPr>
-          <w:rFonts w:ascii="Calibri" w:cs="Calibri" w:eastAsia="Calibri" w:hAnsi="Calibri"/>
-          <w:b w:val="false"/>
-          <w:bCs w:val="false"/>
-          <w:color w:val="1E293B"/>
-          <w:sz w:val="20"/>
-          <w:szCs w:val="20"/>
-        </w:rPr>
-        <w:t xml:space="preserve">.</w:t>
-      </w:r>
-    </w:p>
-    <w:p>
-      <w:pPr>
-        <w:spacing w:after="80" w:before="60"/>
-      </w:pPr>
-      <w:r>
-        <w:rPr>
-          <w:rFonts w:ascii="Calibri" w:cs="Calibri" w:eastAsia="Calibri" w:hAnsi="Calibri"/>
-          <w:b w:val="false"/>
-          <w:bCs w:val="false"/>
-          <w:color w:val="1E293B"/>
-          <w:sz w:val="20"/>
-          <w:szCs w:val="20"/>
-        </w:rPr>
-        <w:t xml:space="preserve">3. </w:t>
-      </w:r>
-      <w:r>
-        <w:rPr>
-          <w:rFonts w:ascii="Calibri" w:cs="Calibri" w:eastAsia="Calibri" w:hAnsi="Calibri"/>
-          <w:b/>
-          <w:bCs/>
-          <w:color w:val="002B49"/>
-          <w:sz w:val="20"/>
-          <w:szCs w:val="20"/>
-        </w:rPr>
-        <w:t xml:space="preserve">En Victorias Tempranas:</w:t>
-      </w:r>
-      <w:r>
-        <w:rPr>
-          <w:rFonts w:ascii="Calibri" w:cs="Calibri" w:eastAsia="Calibri" w:hAnsi="Calibri"/>
-          <w:b w:val="false"/>
-          <w:bCs w:val="false"/>
-          <w:color w:val="1E293B"/>
-          <w:sz w:val="20"/>
-          <w:szCs w:val="20"/>
-        </w:rPr>
-        <w:t xml:space="preserve"> Se reporta en el archivo </w:t>
-      </w:r>
-      <w:r>
-        <w:rPr>
-          <w:rFonts w:ascii="Consolas" w:cs="Consolas" w:eastAsia="Consolas" w:hAnsi="Consolas"/>
-          <w:b w:val="false"/>
-          <w:bCs w:val="false"/>
-          <w:color w:val="0F172A"/>
-          <w:sz w:val="18"/>
-          <w:szCs w:val="18"/>
-        </w:rPr>
-        <w:t xml:space="preserve"> VICTORIAS TEMPRANAS.xlsx </w:t>
-      </w:r>
-      <w:r>
-        <w:rPr>
-          <w:rFonts w:ascii="Calibri" w:cs="Calibri" w:eastAsia="Calibri" w:hAnsi="Calibri"/>
-          <w:b w:val="false"/>
-          <w:bCs w:val="false"/>
-          <w:color w:val="1E293B"/>
-          <w:sz w:val="20"/>
-          <w:szCs w:val="20"/>
-        </w:rPr>
-        <w:t xml:space="preserve"> como "Logro de gestión comunitaria".</w:t>
-      </w:r>
-    </w:p>
-    <w:p>
-      <w:pPr>
-        <w:spacing w:after="80" w:before="60"/>
-      </w:pPr>
-      <w:r>
-        <w:rPr>
-          <w:rFonts w:ascii="Calibri" w:cs="Calibri" w:eastAsia="Calibri" w:hAnsi="Calibri"/>
-          <w:b w:val="false"/>
-          <w:bCs w:val="false"/>
-          <w:color w:val="1E293B"/>
-          <w:sz w:val="20"/>
-          <w:szCs w:val="20"/>
-        </w:rPr>
-        <w:t xml:space="preserve">4. </w:t>
-      </w:r>
-      <w:r>
-        <w:rPr>
-          <w:rFonts w:ascii="Calibri" w:cs="Calibri" w:eastAsia="Calibri" w:hAnsi="Calibri"/>
-          <w:b/>
-          <w:bCs/>
-          <w:color w:val="002B49"/>
-          <w:sz w:val="20"/>
-          <w:szCs w:val="20"/>
-        </w:rPr>
-        <w:t xml:space="preserve">En Calidad de Servicio:</w:t>
-      </w:r>
-      <w:r>
-        <w:rPr>
-          <w:rFonts w:ascii="Calibri" w:cs="Calibri" w:eastAsia="Calibri" w:hAnsi="Calibri"/>
-          <w:b w:val="false"/>
-          <w:bCs w:val="false"/>
-          <w:color w:val="1E293B"/>
-          <w:sz w:val="20"/>
-          <w:szCs w:val="20"/>
-        </w:rPr>
-        <w:t xml:space="preserve"> Se reporta en el </w:t>
-      </w:r>
-      <w:r>
-        <w:rPr>
-          <w:rFonts w:ascii="Consolas" w:cs="Consolas" w:eastAsia="Consolas" w:hAnsi="Consolas"/>
-          <w:b w:val="false"/>
-          <w:bCs w:val="false"/>
-          <w:color w:val="0F172A"/>
-          <w:sz w:val="18"/>
-          <w:szCs w:val="18"/>
-        </w:rPr>
-        <w:t xml:space="preserve"> SCTIS </w:t>
-      </w:r>
-      <w:r>
-        <w:rPr>
-          <w:rFonts w:ascii="Calibri" w:cs="Calibri" w:eastAsia="Calibri" w:hAnsi="Calibri"/>
-          <w:b w:val="false"/>
-          <w:bCs w:val="false"/>
-          <w:color w:val="1E293B"/>
-          <w:sz w:val="20"/>
-          <w:szCs w:val="20"/>
-        </w:rPr>
-        <w:t xml:space="preserve"> como la causa del corte de energía.</w:t>
-      </w:r>
-    </w:p>
-    <w:p>
-      <w:pPr>
-        <w:spacing w:after="80" w:before="60"/>
-      </w:pPr>
-      <w:r>
-        <w:rPr>
-          <w:rFonts w:ascii="Calibri" w:cs="Calibri" w:eastAsia="Calibri" w:hAnsi="Calibri"/>
-          <w:b w:val="false"/>
-          <w:bCs w:val="false"/>
-          <w:color w:val="1E293B"/>
-          <w:sz w:val="20"/>
-          <w:szCs w:val="20"/>
-        </w:rPr>
-        <w:t xml:space="preserve">&gt; </w:t>
-      </w:r>
-      <w:r>
-        <w:rPr>
-          <w:rFonts w:ascii="Calibri" w:cs="Calibri" w:eastAsia="Calibri" w:hAnsi="Calibri"/>
-          <w:b/>
-          <w:bCs/>
-          <w:color w:val="002B49"/>
-          <w:sz w:val="20"/>
-          <w:szCs w:val="20"/>
-        </w:rPr>
-        <w:t xml:space="preserve">Impacto Real:</w:t>
-      </w:r>
-      <w:r>
-        <w:rPr>
-          <w:rFonts w:ascii="Calibri" w:cs="Calibri" w:eastAsia="Calibri" w:hAnsi="Calibri"/>
-          <w:b w:val="false"/>
-          <w:bCs w:val="false"/>
-          <w:color w:val="1E293B"/>
-          <w:sz w:val="20"/>
-          <w:szCs w:val="20"/>
-        </w:rPr>
-        <w:t xml:space="preserve"> Al consolidar a nivel nacional, la Dirección General recibe </w:t>
-      </w:r>
-      <w:r>
-        <w:rPr>
-          <w:rFonts w:ascii="Calibri" w:cs="Calibri" w:eastAsia="Calibri" w:hAnsi="Calibri"/>
-          <w:b/>
-          <w:bCs/>
-          <w:color w:val="002B49"/>
-          <w:sz w:val="20"/>
-          <w:szCs w:val="20"/>
-        </w:rPr>
-        <w:t xml:space="preserve">4 números diferentes para la misma operación</w:t>
-      </w:r>
-      <w:r>
-        <w:rPr>
-          <w:rFonts w:ascii="Calibri" w:cs="Calibri" w:eastAsia="Calibri" w:hAnsi="Calibri"/>
-          <w:b w:val="false"/>
-          <w:bCs w:val="false"/>
-          <w:color w:val="1E293B"/>
-          <w:sz w:val="20"/>
-          <w:szCs w:val="20"/>
-        </w:rPr>
-        <w:t xml:space="preserve">: el Almacén dice que despachó 100 transformadores, Victorias Tempranas reporta 140 instalados, Mantenimiento reporta 85 averiados y SCTIS registra 60 eventos de falla. </w:t>
-      </w:r>
-      <w:r>
-        <w:rPr>
-          <w:rFonts w:ascii="Calibri" w:cs="Calibri" w:eastAsia="Calibri" w:hAnsi="Calibri"/>
-          <w:b/>
-          <w:bCs/>
-          <w:color w:val="002B49"/>
-          <w:sz w:val="20"/>
-          <w:szCs w:val="20"/>
-        </w:rPr>
-        <w:t xml:space="preserve">Ninguno de los 4 instrumentos comparte una clave única de activo (TAG / Serial).</w:t>
-      </w:r>
-    </w:p>
-    <w:p>
-      <w:pPr>
-        <w:pBdr>
-          <w:bottom w:val="single" w:color="CBD5E1" w:sz="6" w:space="1"/>
-        </w:pBdr>
-        <w:spacing w:after="120" w:before="120"/>
-      </w:pPr>
-    </w:p>
-    <w:p>
-      <w:pPr>
-        <w:pStyle w:val="Heading3"/>
-        <w:spacing w:after="80" w:before="160"/>
-      </w:pPr>
-      <w:r>
-        <w:rPr>
-          <w:rFonts w:ascii="Calibri" w:cs="Calibri" w:eastAsia="Calibri" w:hAnsi="Calibri"/>
-          <w:b/>
-          <w:bCs/>
-          <w:color w:val="1E293B"/>
-          <w:sz w:val="22"/>
-          <w:szCs w:val="22"/>
-        </w:rPr>
-        <w:t xml:space="preserve">🟡 4.2. Procesos "Atados" pero Ingobernables (Fricción de Recursos)</w:t>
-      </w:r>
-    </w:p>
-    <w:p>
-      <w:pPr>
-        <w:spacing w:after="80" w:before="60"/>
-      </w:pPr>
-      <w:r>
-        <w:rPr>
-          <w:rFonts w:ascii="Calibri" w:cs="Calibri" w:eastAsia="Calibri" w:hAnsi="Calibri"/>
-          <w:b w:val="false"/>
-          <w:bCs w:val="false"/>
-          <w:color w:val="1E293B"/>
-          <w:sz w:val="20"/>
-          <w:szCs w:val="20"/>
-        </w:rPr>
-        <w:t xml:space="preserve">En los formularios borrador 2026 se intentó "atar" en una sola hoja la actividad técnica con los recursos:</w:t>
-      </w:r>
-    </w:p>
-    <w:p>
-      <w:pPr>
-        <w:pStyle w:val="ListParagraph"/>
-        <w:numPr>
-          <w:ilvl w:val="0"/>
-          <w:numId w:val="1"/>
-        </w:numPr>
-        <w:spacing w:after="40" w:before="40"/>
-      </w:pPr>
-      <w:r>
-        <w:rPr>
-          <w:rFonts w:ascii="Consolas" w:cs="Consolas" w:eastAsia="Consolas" w:hAnsi="Consolas"/>
-          <w:b w:val="false"/>
-          <w:bCs w:val="false"/>
-          <w:color w:val="0F172A"/>
-          <w:sz w:val="18"/>
-          <w:szCs w:val="18"/>
-        </w:rPr>
-        <w:t xml:space="preserve"> ACTIVIDAD: PICA Y PODA </w:t>
-      </w:r>
-      <w:r>
-        <w:rPr>
-          <w:rFonts w:ascii="Calibri" w:cs="Calibri" w:eastAsia="Calibri" w:hAnsi="Calibri"/>
-          <w:b w:val="false"/>
-          <w:bCs w:val="false"/>
-          <w:color w:val="1E293B"/>
-          <w:sz w:val="20"/>
-          <w:szCs w:val="20"/>
-        </w:rPr>
-        <w:t xml:space="preserve"> ➔ </w:t>
-      </w:r>
-      <w:r>
-        <w:rPr>
-          <w:rFonts w:ascii="Consolas" w:cs="Consolas" w:eastAsia="Consolas" w:hAnsi="Consolas"/>
-          <w:b w:val="false"/>
-          <w:bCs w:val="false"/>
-          <w:color w:val="0F172A"/>
-          <w:sz w:val="18"/>
-          <w:szCs w:val="18"/>
-        </w:rPr>
-        <w:t xml:space="preserve"> CAMIÓN ASOCIADO: UNICESTA PLACA X </w:t>
-      </w:r>
-      <w:r>
-        <w:rPr>
-          <w:rFonts w:ascii="Calibri" w:cs="Calibri" w:eastAsia="Calibri" w:hAnsi="Calibri"/>
-          <w:b w:val="false"/>
-          <w:bCs w:val="false"/>
-          <w:color w:val="1E293B"/>
-          <w:sz w:val="20"/>
-          <w:szCs w:val="20"/>
-        </w:rPr>
-        <w:t xml:space="preserve"> ➔ </w:t>
-      </w:r>
-      <w:r>
-        <w:rPr>
-          <w:rFonts w:ascii="Consolas" w:cs="Consolas" w:eastAsia="Consolas" w:hAnsi="Consolas"/>
-          <w:b w:val="false"/>
-          <w:bCs w:val="false"/>
-          <w:color w:val="0F172A"/>
-          <w:sz w:val="18"/>
-          <w:szCs w:val="18"/>
-        </w:rPr>
-        <w:t xml:space="preserve"> MATERIAL: MOTOSIERRA / COMBUSTIBLE </w:t>
-      </w:r>
-      <w:r>
-        <w:rPr>
-          <w:rFonts w:ascii="Calibri" w:cs="Calibri" w:eastAsia="Calibri" w:hAnsi="Calibri"/>
-          <w:b w:val="false"/>
-          <w:bCs w:val="false"/>
-          <w:color w:val="1E293B"/>
-          <w:sz w:val="20"/>
-          <w:szCs w:val="20"/>
-        </w:rPr>
-        <w:t xml:space="preserve"> ➔ </w:t>
-      </w:r>
-      <w:r>
-        <w:rPr>
-          <w:rFonts w:ascii="Consolas" w:cs="Consolas" w:eastAsia="Consolas" w:hAnsi="Consolas"/>
-          <w:b w:val="false"/>
-          <w:bCs w:val="false"/>
-          <w:color w:val="0F172A"/>
-          <w:sz w:val="18"/>
-          <w:szCs w:val="18"/>
-        </w:rPr>
-        <w:t xml:space="preserve"> ESTATUS: CON RECURSO / SIN RECURSO </w:t>
-      </w:r>
-      <w:r>
-        <w:rPr>
-          <w:rFonts w:ascii="Calibri" w:cs="Calibri" w:eastAsia="Calibri" w:hAnsi="Calibri"/>
-          <w:b w:val="false"/>
-          <w:bCs w:val="false"/>
-          <w:color w:val="1E293B"/>
-          <w:sz w:val="20"/>
-          <w:szCs w:val="20"/>
-        </w:rPr>
-        <w:t xml:space="preserve">.</w:t>
-      </w:r>
-    </w:p>
-    <w:p>
-      <w:pPr>
-        <w:spacing w:after="80" w:before="60"/>
-      </w:pPr>
-      <w:r>
-        <w:rPr>
-          <w:rFonts w:ascii="Calibri" w:cs="Calibri" w:eastAsia="Calibri" w:hAnsi="Calibri"/>
-          <w:b w:val="false"/>
-          <w:bCs w:val="false"/>
-          <w:color w:val="1E293B"/>
-          <w:sz w:val="20"/>
-          <w:szCs w:val="20"/>
-        </w:rPr>
-        <w:t xml:space="preserve">&gt; </w:t>
-      </w:r>
-      <w:r>
-        <w:rPr>
-          <w:rFonts w:ascii="Calibri" w:cs="Calibri" w:eastAsia="Calibri" w:hAnsi="Calibri"/>
-          <w:b/>
-          <w:bCs/>
-          <w:color w:val="002B49"/>
-          <w:sz w:val="20"/>
-          <w:szCs w:val="20"/>
-        </w:rPr>
-        <w:t xml:space="preserve">Por qué no se puede controlar:</w:t>
-      </w:r>
-      <w:r>
-        <w:rPr>
-          <w:rFonts w:ascii="Calibri" w:cs="Calibri" w:eastAsia="Calibri" w:hAnsi="Calibri"/>
-          <w:b w:val="false"/>
-          <w:bCs w:val="false"/>
-          <w:color w:val="1E293B"/>
-          <w:sz w:val="20"/>
-          <w:szCs w:val="20"/>
-        </w:rPr>
-        <w:t xml:space="preserve"> La flota de vehículos y los almacenes de combustible dependen de la Gerencia de Bienes y Servicios y de Logística, no del Coordinador de Distribución. Al obligar al ingeniero de líneas a reportar el estatus administrativo de la flota en la misma celda donde reporta los metros de ramas cortadas, el instrumento colapsa por falta de información de soporte.</w:t>
-      </w:r>
-    </w:p>
-    <w:p>
-      <w:pPr>
-        <w:pBdr>
-          <w:bottom w:val="single" w:color="CBD5E1" w:sz="6" w:space="1"/>
-        </w:pBdr>
-        <w:spacing w:after="120" w:before="120"/>
-      </w:pPr>
-    </w:p>
-    <w:p>
-      <w:pPr>
-        <w:pStyle w:val="Heading3"/>
-        <w:spacing w:after="80" w:before="160"/>
-      </w:pPr>
-      <w:r>
-        <w:rPr>
-          <w:rFonts w:ascii="Calibri" w:cs="Calibri" w:eastAsia="Calibri" w:hAnsi="Calibri"/>
-          <w:b/>
-          <w:bCs/>
-          <w:color w:val="1E293B"/>
-          <w:sz w:val="22"/>
-          <w:szCs w:val="22"/>
-        </w:rPr>
-        <w:t xml:space="preserve">⚪ 4.3. Procesos "Sueltos" (Islas sin Retroalimentación)</w:t>
-      </w:r>
-    </w:p>
-    <w:p>
-      <w:pPr>
-        <w:spacing w:after="80" w:before="60"/>
-      </w:pPr>
-      <w:r>
-        <w:rPr>
-          <w:rFonts w:ascii="Calibri" w:cs="Calibri" w:eastAsia="Calibri" w:hAnsi="Calibri"/>
-          <w:b w:val="false"/>
-          <w:bCs w:val="false"/>
-          <w:color w:val="1E293B"/>
-          <w:sz w:val="20"/>
-          <w:szCs w:val="20"/>
-        </w:rPr>
-        <w:t xml:space="preserve">1. </w:t>
-      </w:r>
-      <w:r>
-        <w:rPr>
-          <w:rFonts w:ascii="Calibri" w:cs="Calibri" w:eastAsia="Calibri" w:hAnsi="Calibri"/>
-          <w:b/>
-          <w:bCs/>
-          <w:color w:val="002B49"/>
-          <w:sz w:val="20"/>
-          <w:szCs w:val="20"/>
-        </w:rPr>
-        <w:t xml:space="preserve">Pica y Poda vs. Restricciones de Circuito:</w:t>
-      </w:r>
-      <w:r>
-        <w:rPr>
-          <w:rFonts w:ascii="Calibri" w:cs="Calibri" w:eastAsia="Calibri" w:hAnsi="Calibri"/>
-          <w:b w:val="false"/>
-          <w:bCs w:val="false"/>
-          <w:color w:val="1E293B"/>
-          <w:sz w:val="20"/>
-          <w:szCs w:val="20"/>
-        </w:rPr>
-        <w:t xml:space="preserve"> Se podan 50 km en el Circuito El Placer (Miranda), pero en la planilla de </w:t>
-      </w:r>
-      <w:r>
-        <w:rPr>
-          <w:rFonts w:ascii="Consolas" w:cs="Consolas" w:eastAsia="Consolas" w:hAnsi="Consolas"/>
-          <w:b w:val="false"/>
-          <w:bCs w:val="false"/>
-          <w:color w:val="0F172A"/>
-          <w:sz w:val="18"/>
-          <w:szCs w:val="18"/>
-        </w:rPr>
-        <w:t xml:space="preserve"> RESTRICCIONES OPERATIVAS </w:t>
-      </w:r>
-      <w:r>
-        <w:rPr>
-          <w:rFonts w:ascii="Calibri" w:cs="Calibri" w:eastAsia="Calibri" w:hAnsi="Calibri"/>
-          <w:b w:val="false"/>
-          <w:bCs w:val="false"/>
-          <w:color w:val="1E293B"/>
-          <w:sz w:val="20"/>
-          <w:szCs w:val="20"/>
-        </w:rPr>
-        <w:t xml:space="preserve"> el circuito sigue marcado como "Restringido por maleza" durante 3 meses más porque la planilla de restricciones la actualiza otra unidad.</w:t>
-      </w:r>
-    </w:p>
-    <w:p>
-      <w:pPr>
-        <w:spacing w:after="80" w:before="60"/>
-      </w:pPr>
-      <w:r>
-        <w:rPr>
-          <w:rFonts w:ascii="Calibri" w:cs="Calibri" w:eastAsia="Calibri" w:hAnsi="Calibri"/>
-          <w:b w:val="false"/>
-          <w:bCs w:val="false"/>
-          <w:color w:val="1E293B"/>
-          <w:sz w:val="20"/>
-          <w:szCs w:val="20"/>
-        </w:rPr>
-        <w:t xml:space="preserve">2. </w:t>
-      </w:r>
-      <w:r>
-        <w:rPr>
-          <w:rFonts w:ascii="Calibri" w:cs="Calibri" w:eastAsia="Calibri" w:hAnsi="Calibri"/>
-          <w:b/>
-          <w:bCs/>
-          <w:color w:val="002B49"/>
-          <w:sz w:val="20"/>
-          <w:szCs w:val="20"/>
-        </w:rPr>
-        <w:t xml:space="preserve">Informes de Gestión en Word (.docx):</w:t>
-      </w:r>
-      <w:r>
-        <w:rPr>
-          <w:rFonts w:ascii="Calibri" w:cs="Calibri" w:eastAsia="Calibri" w:hAnsi="Calibri"/>
-          <w:b w:val="false"/>
-          <w:bCs w:val="false"/>
-          <w:color w:val="1E293B"/>
-          <w:sz w:val="20"/>
-          <w:szCs w:val="20"/>
-        </w:rPr>
-        <w:t xml:space="preserve"> Cada mes, los 24 estados redactan informes narrativos en Word. Los analistas toman los números del Excel y los transcriben a mano en tablas de Word. Esta transcripción manual introduce entre un </w:t>
-      </w:r>
-      <w:r>
-        <w:rPr>
-          <w:rFonts w:ascii="Calibri" w:cs="Calibri" w:eastAsia="Calibri" w:hAnsi="Calibri"/>
-          <w:b/>
-          <w:bCs/>
-          <w:color w:val="002B49"/>
-          <w:sz w:val="20"/>
-          <w:szCs w:val="20"/>
-        </w:rPr>
-        <w:t xml:space="preserve">12% y un 18% de error tipográfico humano</w:t>
-      </w:r>
-      <w:r>
-        <w:rPr>
-          <w:rFonts w:ascii="Calibri" w:cs="Calibri" w:eastAsia="Calibri" w:hAnsi="Calibri"/>
-          <w:b w:val="false"/>
-          <w:bCs w:val="false"/>
-          <w:color w:val="1E293B"/>
-          <w:sz w:val="20"/>
-          <w:szCs w:val="20"/>
-        </w:rPr>
-        <w:t xml:space="preserve"> entre lo reportado en Excel y lo presentado a la Junta Directiva.</w:t>
-      </w:r>
-    </w:p>
-    <w:p>
-      <w:pPr>
-        <w:pBdr>
-          <w:bottom w:val="single" w:color="CBD5E1" w:sz="6" w:space="1"/>
-        </w:pBdr>
-        <w:spacing w:after="120" w:before="120"/>
-      </w:pPr>
-    </w:p>
-    <w:p>
-      <w:pPr>
-        <w:pStyle w:val="Heading2"/>
-        <w:spacing w:after="100" w:before="200"/>
-      </w:pPr>
-      <w:r>
-        <w:rPr>
-          <w:rFonts w:ascii="Calibri" w:cs="Calibri" w:eastAsia="Calibri" w:hAnsi="Calibri"/>
-          <w:b/>
-          <w:bCs/>
-          <w:color w:val="004488"/>
-          <w:sz w:val="26"/>
-          <w:szCs w:val="26"/>
-        </w:rPr>
-        <w:t xml:space="preserve">🎯 5. ALINEACIÓN CON EL MANUAL DE ORGANIZACIÓN Y MÉTODOS (O&amp;M)</w:t>
-      </w:r>
-    </w:p>
-    <w:p>
-      <w:pPr>
-        <w:spacing w:after="80" w:before="60"/>
-      </w:pPr>
-      <w:r>
-        <w:rPr>
-          <w:rFonts w:ascii="Calibri" w:cs="Calibri" w:eastAsia="Calibri" w:hAnsi="Calibri"/>
-          <w:b w:val="false"/>
-          <w:bCs w:val="false"/>
-          <w:color w:val="1E293B"/>
-          <w:sz w:val="20"/>
-          <w:szCs w:val="20"/>
-        </w:rPr>
-        <w:t xml:space="preserve">Para que la Gerencia General y la unidad de </w:t>
-      </w:r>
-      <w:r>
-        <w:rPr>
-          <w:rFonts w:ascii="Calibri" w:cs="Calibri" w:eastAsia="Calibri" w:hAnsi="Calibri"/>
-          <w:b/>
-          <w:bCs/>
-          <w:color w:val="002B49"/>
-          <w:sz w:val="20"/>
-          <w:szCs w:val="20"/>
-        </w:rPr>
-        <w:t xml:space="preserve">Organización y Métodos (O&amp;M)</w:t>
-      </w:r>
-      <w:r>
-        <w:rPr>
-          <w:rFonts w:ascii="Calibri" w:cs="Calibri" w:eastAsia="Calibri" w:hAnsi="Calibri"/>
-          <w:b w:val="false"/>
-          <w:bCs w:val="false"/>
-          <w:color w:val="1E293B"/>
-          <w:sz w:val="20"/>
-          <w:szCs w:val="20"/>
-        </w:rPr>
-        <w:t xml:space="preserve"> validen este diagnóstico, la reestructuración del SIGI establece las siguientes fronteras de proceso claras:</w:t>
       </w:r>
     </w:p>
     <w:tbl>
@@ -3473,7 +3016,7 @@
                 <w:szCs w:val="18"/>
               </w:rPr>
               <w:t xml:space="preserve">+----------------------------------------------------------------------------------------------------+
-|                                MATRIZ DE REORDENAMIENTO DE PROCESOS (O&amp;M)                          |
+|                               LAS 6 PATOLOGÍAS ESTRUCTURALES DEL DISEÑO EXCEL                      |
 +----------------------------------------------------------------------------------------------------+</w:t>
             </w:r>
           </w:p>
@@ -3484,6 +3027,1408 @@
       <w:pPr>
         <w:spacing w:after="160"/>
       </w:pPr>
+    </w:p>
+    <w:p>
+      <w:pPr>
+        <w:pStyle w:val="Heading3"/>
+        <w:spacing w:after="80" w:before="160"/>
+      </w:pPr>
+      <w:r>
+        <w:rPr>
+          <w:rFonts w:ascii="Calibri" w:cs="Calibri" w:eastAsia="Calibri" w:hAnsi="Calibri"/>
+          <w:b/>
+          <w:bCs/>
+          <w:color w:val="1E293B"/>
+          <w:sz w:val="22"/>
+          <w:szCs w:val="22"/>
+        </w:rPr>
+        <w:t xml:space="preserve">🔴 Trampa 1: El Instrumento "Mosaico Multifunción" (24 Pestañas)</w:t>
+      </w:r>
+    </w:p>
+    <w:p>
+      <w:pPr>
+        <w:pStyle w:val="ListParagraph"/>
+        <w:numPr>
+          <w:ilvl w:val="0"/>
+          <w:numId w:val="1"/>
+        </w:numPr>
+        <w:spacing w:after="40" w:before="40"/>
+      </w:pPr>
+      <w:r>
+        <w:rPr>
+          <w:rFonts w:ascii="Calibri" w:cs="Calibri" w:eastAsia="Calibri" w:hAnsi="Calibri"/>
+          <w:b/>
+          <w:bCs/>
+          <w:color w:val="002B49"/>
+          <w:sz w:val="20"/>
+          <w:szCs w:val="20"/>
+        </w:rPr>
+        <w:t xml:space="preserve">Descripción:</w:t>
+      </w:r>
+      <w:r>
+        <w:rPr>
+          <w:rFonts w:ascii="Calibri" w:cs="Calibri" w:eastAsia="Calibri" w:hAnsi="Calibri"/>
+          <w:b w:val="false"/>
+          <w:bCs w:val="false"/>
+          <w:color w:val="1E293B"/>
+          <w:sz w:val="20"/>
+          <w:szCs w:val="20"/>
+        </w:rPr>
+        <w:t xml:space="preserve"> Cada archivo de estado agrupa 24 hojas desconectadas entre sí en un solo libro </w:t>
+      </w:r>
+      <w:r>
+        <w:rPr>
+          <w:rFonts w:ascii="Consolas" w:cs="Consolas" w:eastAsia="Consolas" w:hAnsi="Consolas"/>
+          <w:b w:val="false"/>
+          <w:bCs w:val="false"/>
+          <w:color w:val="0F172A"/>
+          <w:sz w:val="18"/>
+          <w:szCs w:val="18"/>
+        </w:rPr>
+        <w:t xml:space="preserve"> .xls </w:t>
+      </w:r>
+      <w:r>
+        <w:rPr>
+          <w:rFonts w:ascii="Calibri" w:cs="Calibri" w:eastAsia="Calibri" w:hAnsi="Calibri"/>
+          <w:b w:val="false"/>
+          <w:bCs w:val="false"/>
+          <w:color w:val="1E293B"/>
+          <w:sz w:val="20"/>
+          <w:szCs w:val="20"/>
+        </w:rPr>
+        <w:t xml:space="preserve">.</w:t>
+      </w:r>
+    </w:p>
+    <w:p>
+      <w:pPr>
+        <w:pStyle w:val="ListParagraph"/>
+        <w:numPr>
+          <w:ilvl w:val="0"/>
+          <w:numId w:val="1"/>
+        </w:numPr>
+        <w:spacing w:after="40" w:before="40"/>
+      </w:pPr>
+      <w:r>
+        <w:rPr>
+          <w:rFonts w:ascii="Calibri" w:cs="Calibri" w:eastAsia="Calibri" w:hAnsi="Calibri"/>
+          <w:b/>
+          <w:bCs/>
+          <w:color w:val="002B49"/>
+          <w:sz w:val="20"/>
+          <w:szCs w:val="20"/>
+        </w:rPr>
+        <w:t xml:space="preserve">Efecto Operativo:</w:t>
+      </w:r>
+      <w:r>
+        <w:rPr>
+          <w:rFonts w:ascii="Calibri" w:cs="Calibri" w:eastAsia="Calibri" w:hAnsi="Calibri"/>
+          <w:b w:val="false"/>
+          <w:bCs w:val="false"/>
+          <w:color w:val="1E293B"/>
+          <w:sz w:val="20"/>
+          <w:szCs w:val="20"/>
+        </w:rPr>
+        <w:t xml:space="preserve"> Para registrar 10 km de pica y poda ejecutados hoy, el ingeniero debe abrir un archivo de 4.5 MB, navegar entre 24 pestañas, sortear macros viejas y guardar. Esto propicia la omisión de datos y la fatiga administrativa.</w:t>
+      </w:r>
+    </w:p>
+    <w:p>
+      <w:pPr>
+        <w:pStyle w:val="ListParagraph"/>
+        <w:numPr>
+          <w:ilvl w:val="0"/>
+          <w:numId w:val="1"/>
+        </w:numPr>
+        <w:spacing w:after="40" w:before="40"/>
+      </w:pPr>
+      <w:r>
+        <w:rPr>
+          <w:rFonts w:ascii="Calibri" w:cs="Calibri" w:eastAsia="Calibri" w:hAnsi="Calibri"/>
+          <w:b/>
+          <w:bCs/>
+          <w:color w:val="002B49"/>
+          <w:sz w:val="20"/>
+          <w:szCs w:val="20"/>
+        </w:rPr>
+        <w:t xml:space="preserve">Solución de Simplificación:</w:t>
+      </w:r>
+      <w:r>
+        <w:rPr>
+          <w:rFonts w:ascii="Calibri" w:cs="Calibri" w:eastAsia="Calibri" w:hAnsi="Calibri"/>
+          <w:b w:val="false"/>
+          <w:bCs w:val="false"/>
+          <w:color w:val="1E293B"/>
+          <w:sz w:val="20"/>
+          <w:szCs w:val="20"/>
+        </w:rPr>
+        <w:t xml:space="preserve"> </w:t>
+      </w:r>
+      <w:r>
+        <w:rPr>
+          <w:rFonts w:ascii="Calibri" w:cs="Calibri" w:eastAsia="Calibri" w:hAnsi="Calibri"/>
+          <w:b/>
+          <w:bCs/>
+          <w:color w:val="002B49"/>
+          <w:sz w:val="20"/>
+          <w:szCs w:val="20"/>
+        </w:rPr>
+        <w:t xml:space="preserve">Atomicidad.</w:t>
+      </w:r>
+      <w:r>
+        <w:rPr>
+          <w:rFonts w:ascii="Calibri" w:cs="Calibri" w:eastAsia="Calibri" w:hAnsi="Calibri"/>
+          <w:b w:val="false"/>
+          <w:bCs w:val="false"/>
+          <w:color w:val="1E293B"/>
+          <w:sz w:val="20"/>
+          <w:szCs w:val="20"/>
+        </w:rPr>
+        <w:t xml:space="preserve"> Un instrumento es </w:t>
+      </w:r>
+      <w:r>
+        <w:rPr>
+          <w:rFonts w:ascii="Calibri" w:cs="Calibri" w:eastAsia="Calibri" w:hAnsi="Calibri"/>
+          <w:b/>
+          <w:bCs/>
+          <w:color w:val="002B49"/>
+          <w:sz w:val="20"/>
+          <w:szCs w:val="20"/>
+        </w:rPr>
+        <w:t xml:space="preserve">1 solo archivo con 1 sola pestaña</w:t>
+      </w:r>
+      <w:r>
+        <w:rPr>
+          <w:rFonts w:ascii="Calibri" w:cs="Calibri" w:eastAsia="Calibri" w:hAnsi="Calibri"/>
+          <w:b w:val="false"/>
+          <w:bCs w:val="false"/>
+          <w:color w:val="1E293B"/>
+          <w:sz w:val="20"/>
+          <w:szCs w:val="20"/>
+        </w:rPr>
+        <w:t xml:space="preserve"> especializada en ese sub-proceso.</w:t>
+      </w:r>
+    </w:p>
+    <w:p>
+      <w:pPr>
+        <w:pStyle w:val="Heading3"/>
+        <w:spacing w:after="80" w:before="160"/>
+      </w:pPr>
+      <w:r>
+        <w:rPr>
+          <w:rFonts w:ascii="Calibri" w:cs="Calibri" w:eastAsia="Calibri" w:hAnsi="Calibri"/>
+          <w:b/>
+          <w:bCs/>
+          <w:color w:val="1E293B"/>
+          <w:sz w:val="22"/>
+          <w:szCs w:val="22"/>
+        </w:rPr>
+        <w:t xml:space="preserve">🔴 Trampa 2: Celdas Combinadas y Encabezados en Múltiples Niveles</w:t>
+      </w:r>
+    </w:p>
+    <w:p>
+      <w:pPr>
+        <w:pStyle w:val="ListParagraph"/>
+        <w:numPr>
+          <w:ilvl w:val="0"/>
+          <w:numId w:val="1"/>
+        </w:numPr>
+        <w:spacing w:after="40" w:before="40"/>
+      </w:pPr>
+      <w:r>
+        <w:rPr>
+          <w:rFonts w:ascii="Calibri" w:cs="Calibri" w:eastAsia="Calibri" w:hAnsi="Calibri"/>
+          <w:b/>
+          <w:bCs/>
+          <w:color w:val="002B49"/>
+          <w:sz w:val="20"/>
+          <w:szCs w:val="20"/>
+        </w:rPr>
+        <w:t xml:space="preserve">Descripción:</w:t>
+      </w:r>
+      <w:r>
+        <w:rPr>
+          <w:rFonts w:ascii="Calibri" w:cs="Calibri" w:eastAsia="Calibri" w:hAnsi="Calibri"/>
+          <w:b w:val="false"/>
+          <w:bCs w:val="false"/>
+          <w:color w:val="1E293B"/>
+          <w:sz w:val="20"/>
+          <w:szCs w:val="20"/>
+        </w:rPr>
+        <w:t xml:space="preserve"> Encabezados en 3 o 4 filas combinadas (</w:t>
+      </w:r>
+      <w:r>
+        <w:rPr>
+          <w:rFonts w:ascii="Consolas" w:cs="Consolas" w:eastAsia="Consolas" w:hAnsi="Consolas"/>
+          <w:b w:val="false"/>
+          <w:bCs w:val="false"/>
+          <w:color w:val="0F172A"/>
+          <w:sz w:val="18"/>
+          <w:szCs w:val="18"/>
+        </w:rPr>
+        <w:t xml:space="preserve"> MANTENIMIENTO PREVENTIVO &gt; CORREDORES &gt; MEDIA TENSIÓN &gt; TRAMO </w:t>
+      </w:r>
+      <w:r>
+        <w:rPr>
+          <w:rFonts w:ascii="Calibri" w:cs="Calibri" w:eastAsia="Calibri" w:hAnsi="Calibri"/>
+          <w:b w:val="false"/>
+          <w:bCs w:val="false"/>
+          <w:color w:val="1E293B"/>
+          <w:sz w:val="20"/>
+          <w:szCs w:val="20"/>
+        </w:rPr>
+        <w:t xml:space="preserve">), seguidos de títulos fusionados verticalmente.</w:t>
+      </w:r>
+    </w:p>
+    <w:p>
+      <w:pPr>
+        <w:pStyle w:val="ListParagraph"/>
+        <w:numPr>
+          <w:ilvl w:val="0"/>
+          <w:numId w:val="1"/>
+        </w:numPr>
+        <w:spacing w:after="40" w:before="40"/>
+      </w:pPr>
+      <w:r>
+        <w:rPr>
+          <w:rFonts w:ascii="Calibri" w:cs="Calibri" w:eastAsia="Calibri" w:hAnsi="Calibri"/>
+          <w:b/>
+          <w:bCs/>
+          <w:color w:val="002B49"/>
+          <w:sz w:val="20"/>
+          <w:szCs w:val="20"/>
+        </w:rPr>
+        <w:t xml:space="preserve">Efecto Operativo:</w:t>
+      </w:r>
+      <w:r>
+        <w:rPr>
+          <w:rFonts w:ascii="Calibri" w:cs="Calibri" w:eastAsia="Calibri" w:hAnsi="Calibri"/>
+          <w:b w:val="false"/>
+          <w:bCs w:val="false"/>
+          <w:color w:val="1E293B"/>
+          <w:sz w:val="20"/>
+          <w:szCs w:val="20"/>
+        </w:rPr>
+        <w:t xml:space="preserve"> Invalida cualquier conector automatizado (Python, Node, PowerBI, SQL), forzando a que la consolidación de datos deba hacerse obligatoriamente a mano.</w:t>
+      </w:r>
+    </w:p>
+    <w:p>
+      <w:pPr>
+        <w:pStyle w:val="ListParagraph"/>
+        <w:numPr>
+          <w:ilvl w:val="0"/>
+          <w:numId w:val="1"/>
+        </w:numPr>
+        <w:spacing w:after="40" w:before="40"/>
+      </w:pPr>
+      <w:r>
+        <w:rPr>
+          <w:rFonts w:ascii="Calibri" w:cs="Calibri" w:eastAsia="Calibri" w:hAnsi="Calibri"/>
+          <w:b/>
+          <w:bCs/>
+          <w:color w:val="002B49"/>
+          <w:sz w:val="20"/>
+          <w:szCs w:val="20"/>
+        </w:rPr>
+        <w:t xml:space="preserve">Solución de Simplificación:</w:t>
+      </w:r>
+      <w:r>
+        <w:rPr>
+          <w:rFonts w:ascii="Calibri" w:cs="Calibri" w:eastAsia="Calibri" w:hAnsi="Calibri"/>
+          <w:b w:val="false"/>
+          <w:bCs w:val="false"/>
+          <w:color w:val="1E293B"/>
+          <w:sz w:val="20"/>
+          <w:szCs w:val="20"/>
+        </w:rPr>
+        <w:t xml:space="preserve"> </w:t>
+      </w:r>
+      <w:r>
+        <w:rPr>
+          <w:rFonts w:ascii="Calibri" w:cs="Calibri" w:eastAsia="Calibri" w:hAnsi="Calibri"/>
+          <w:b/>
+          <w:bCs/>
+          <w:color w:val="002B49"/>
+          <w:sz w:val="20"/>
+          <w:szCs w:val="20"/>
+        </w:rPr>
+        <w:t xml:space="preserve">Fila Única de Encabezado (Fila 1).</w:t>
+      </w:r>
+      <w:r>
+        <w:rPr>
+          <w:rFonts w:ascii="Calibri" w:cs="Calibri" w:eastAsia="Calibri" w:hAnsi="Calibri"/>
+          <w:b w:val="false"/>
+          <w:bCs w:val="false"/>
+          <w:color w:val="1E293B"/>
+          <w:sz w:val="20"/>
+          <w:szCs w:val="20"/>
+        </w:rPr>
+        <w:t xml:space="preserve"> Nombres de columna técnicos, unívocos y en mayúsculas (</w:t>
+      </w:r>
+      <w:r>
+        <w:rPr>
+          <w:rFonts w:ascii="Consolas" w:cs="Consolas" w:eastAsia="Consolas" w:hAnsi="Consolas"/>
+          <w:b w:val="false"/>
+          <w:bCs w:val="false"/>
+          <w:color w:val="0F172A"/>
+          <w:sz w:val="18"/>
+          <w:szCs w:val="18"/>
+        </w:rPr>
+        <w:t xml:space="preserve"> COD_ESTADO </w:t>
+      </w:r>
+      <w:r>
+        <w:rPr>
+          <w:rFonts w:ascii="Calibri" w:cs="Calibri" w:eastAsia="Calibri" w:hAnsi="Calibri"/>
+          <w:b w:val="false"/>
+          <w:bCs w:val="false"/>
+          <w:color w:val="1E293B"/>
+          <w:sz w:val="20"/>
+          <w:szCs w:val="20"/>
+        </w:rPr>
+        <w:t xml:space="preserve">, </w:t>
+      </w:r>
+      <w:r>
+        <w:rPr>
+          <w:rFonts w:ascii="Consolas" w:cs="Consolas" w:eastAsia="Consolas" w:hAnsi="Consolas"/>
+          <w:b w:val="false"/>
+          <w:bCs w:val="false"/>
+          <w:color w:val="0F172A"/>
+          <w:sz w:val="18"/>
+          <w:szCs w:val="18"/>
+        </w:rPr>
+        <w:t xml:space="preserve"> SUBESTACION </w:t>
+      </w:r>
+      <w:r>
+        <w:rPr>
+          <w:rFonts w:ascii="Calibri" w:cs="Calibri" w:eastAsia="Calibri" w:hAnsi="Calibri"/>
+          <w:b w:val="false"/>
+          <w:bCs w:val="false"/>
+          <w:color w:val="1E293B"/>
+          <w:sz w:val="20"/>
+          <w:szCs w:val="20"/>
+        </w:rPr>
+        <w:t xml:space="preserve">, </w:t>
+      </w:r>
+      <w:r>
+        <w:rPr>
+          <w:rFonts w:ascii="Consolas" w:cs="Consolas" w:eastAsia="Consolas" w:hAnsi="Consolas"/>
+          <w:b w:val="false"/>
+          <w:bCs w:val="false"/>
+          <w:color w:val="0F172A"/>
+          <w:sz w:val="18"/>
+          <w:szCs w:val="18"/>
+        </w:rPr>
+        <w:t xml:space="preserve"> CIRCUITO </w:t>
+      </w:r>
+      <w:r>
+        <w:rPr>
+          <w:rFonts w:ascii="Calibri" w:cs="Calibri" w:eastAsia="Calibri" w:hAnsi="Calibri"/>
+          <w:b w:val="false"/>
+          <w:bCs w:val="false"/>
+          <w:color w:val="1E293B"/>
+          <w:sz w:val="20"/>
+          <w:szCs w:val="20"/>
+        </w:rPr>
+        <w:t xml:space="preserve">, </w:t>
+      </w:r>
+      <w:r>
+        <w:rPr>
+          <w:rFonts w:ascii="Consolas" w:cs="Consolas" w:eastAsia="Consolas" w:hAnsi="Consolas"/>
+          <w:b w:val="false"/>
+          <w:bCs w:val="false"/>
+          <w:color w:val="0F172A"/>
+          <w:sz w:val="18"/>
+          <w:szCs w:val="18"/>
+        </w:rPr>
+        <w:t xml:space="preserve"> KMS_PODADOS </w:t>
+      </w:r>
+      <w:r>
+        <w:rPr>
+          <w:rFonts w:ascii="Calibri" w:cs="Calibri" w:eastAsia="Calibri" w:hAnsi="Calibri"/>
+          <w:b w:val="false"/>
+          <w:bCs w:val="false"/>
+          <w:color w:val="1E293B"/>
+          <w:sz w:val="20"/>
+          <w:szCs w:val="20"/>
+        </w:rPr>
+        <w:t xml:space="preserve">).</w:t>
+      </w:r>
+    </w:p>
+    <w:p>
+      <w:pPr>
+        <w:pStyle w:val="Heading3"/>
+        <w:spacing w:after="80" w:before="160"/>
+      </w:pPr>
+      <w:r>
+        <w:rPr>
+          <w:rFonts w:ascii="Calibri" w:cs="Calibri" w:eastAsia="Calibri" w:hAnsi="Calibri"/>
+          <w:b/>
+          <w:bCs/>
+          <w:color w:val="1E293B"/>
+          <w:sz w:val="22"/>
+          <w:szCs w:val="22"/>
+        </w:rPr>
+        <w:t xml:space="preserve">🔴 Trampa 3: Antipatrón 1NF (Grupos Repetitivos en Columnas Horizontales)</w:t>
+      </w:r>
+    </w:p>
+    <w:p>
+      <w:pPr>
+        <w:pStyle w:val="ListParagraph"/>
+        <w:numPr>
+          <w:ilvl w:val="0"/>
+          <w:numId w:val="1"/>
+        </w:numPr>
+        <w:spacing w:after="40" w:before="40"/>
+      </w:pPr>
+      <w:r>
+        <w:rPr>
+          <w:rFonts w:ascii="Calibri" w:cs="Calibri" w:eastAsia="Calibri" w:hAnsi="Calibri"/>
+          <w:b/>
+          <w:bCs/>
+          <w:color w:val="002B49"/>
+          <w:sz w:val="20"/>
+          <w:szCs w:val="20"/>
+        </w:rPr>
+        <w:t xml:space="preserve">Descripción:</w:t>
+      </w:r>
+      <w:r>
+        <w:rPr>
+          <w:rFonts w:ascii="Calibri" w:cs="Calibri" w:eastAsia="Calibri" w:hAnsi="Calibri"/>
+          <w:b w:val="false"/>
+          <w:bCs w:val="false"/>
+          <w:color w:val="1E293B"/>
+          <w:sz w:val="20"/>
+          <w:szCs w:val="20"/>
+        </w:rPr>
+        <w:t xml:space="preserve"> Diseñar columnas para cada mes del año (</w:t>
+      </w:r>
+      <w:r>
+        <w:rPr>
+          <w:rFonts w:ascii="Consolas" w:cs="Consolas" w:eastAsia="Consolas" w:hAnsi="Consolas"/>
+          <w:b w:val="false"/>
+          <w:bCs w:val="false"/>
+          <w:color w:val="0F172A"/>
+          <w:sz w:val="18"/>
+          <w:szCs w:val="18"/>
+        </w:rPr>
+        <w:t xml:space="preserve"> ENE_META </w:t>
+      </w:r>
+      <w:r>
+        <w:rPr>
+          <w:rFonts w:ascii="Calibri" w:cs="Calibri" w:eastAsia="Calibri" w:hAnsi="Calibri"/>
+          <w:b w:val="false"/>
+          <w:bCs w:val="false"/>
+          <w:color w:val="1E293B"/>
+          <w:sz w:val="20"/>
+          <w:szCs w:val="20"/>
+        </w:rPr>
+        <w:t xml:space="preserve">, </w:t>
+      </w:r>
+      <w:r>
+        <w:rPr>
+          <w:rFonts w:ascii="Consolas" w:cs="Consolas" w:eastAsia="Consolas" w:hAnsi="Consolas"/>
+          <w:b w:val="false"/>
+          <w:bCs w:val="false"/>
+          <w:color w:val="0F172A"/>
+          <w:sz w:val="18"/>
+          <w:szCs w:val="18"/>
+        </w:rPr>
+        <w:t xml:space="preserve"> FEB_META </w:t>
+      </w:r>
+      <w:r>
+        <w:rPr>
+          <w:rFonts w:ascii="Calibri" w:cs="Calibri" w:eastAsia="Calibri" w:hAnsi="Calibri"/>
+          <w:b w:val="false"/>
+          <w:bCs w:val="false"/>
+          <w:color w:val="1E293B"/>
+          <w:sz w:val="20"/>
+          <w:szCs w:val="20"/>
+        </w:rPr>
+        <w:t xml:space="preserve">... </w:t>
+      </w:r>
+      <w:r>
+        <w:rPr>
+          <w:rFonts w:ascii="Consolas" w:cs="Consolas" w:eastAsia="Consolas" w:hAnsi="Consolas"/>
+          <w:b w:val="false"/>
+          <w:bCs w:val="false"/>
+          <w:color w:val="0F172A"/>
+          <w:sz w:val="18"/>
+          <w:szCs w:val="18"/>
+        </w:rPr>
+        <w:t xml:space="preserve"> DIC_META </w:t>
+      </w:r>
+      <w:r>
+        <w:rPr>
+          <w:rFonts w:ascii="Calibri" w:cs="Calibri" w:eastAsia="Calibri" w:hAnsi="Calibri"/>
+          <w:b w:val="false"/>
+          <w:bCs w:val="false"/>
+          <w:color w:val="1E293B"/>
+          <w:sz w:val="20"/>
+          <w:szCs w:val="20"/>
+        </w:rPr>
+        <w:t xml:space="preserve">) o para cada equipo (</w:t>
+      </w:r>
+      <w:r>
+        <w:rPr>
+          <w:rFonts w:ascii="Consolas" w:cs="Consolas" w:eastAsia="Consolas" w:hAnsi="Consolas"/>
+          <w:b w:val="false"/>
+          <w:bCs w:val="false"/>
+          <w:color w:val="0F172A"/>
+          <w:sz w:val="18"/>
+          <w:szCs w:val="18"/>
+        </w:rPr>
+        <w:t xml:space="preserve"> TP1_KVA </w:t>
+      </w:r>
+      <w:r>
+        <w:rPr>
+          <w:rFonts w:ascii="Calibri" w:cs="Calibri" w:eastAsia="Calibri" w:hAnsi="Calibri"/>
+          <w:b w:val="false"/>
+          <w:bCs w:val="false"/>
+          <w:color w:val="1E293B"/>
+          <w:sz w:val="20"/>
+          <w:szCs w:val="20"/>
+        </w:rPr>
+        <w:t xml:space="preserve">, </w:t>
+      </w:r>
+      <w:r>
+        <w:rPr>
+          <w:rFonts w:ascii="Consolas" w:cs="Consolas" w:eastAsia="Consolas" w:hAnsi="Consolas"/>
+          <w:b w:val="false"/>
+          <w:bCs w:val="false"/>
+          <w:color w:val="0F172A"/>
+          <w:sz w:val="18"/>
+          <w:szCs w:val="18"/>
+        </w:rPr>
+        <w:t xml:space="preserve"> TP2_KVA </w:t>
+      </w:r>
+      <w:r>
+        <w:rPr>
+          <w:rFonts w:ascii="Calibri" w:cs="Calibri" w:eastAsia="Calibri" w:hAnsi="Calibri"/>
+          <w:b w:val="false"/>
+          <w:bCs w:val="false"/>
+          <w:color w:val="1E293B"/>
+          <w:sz w:val="20"/>
+          <w:szCs w:val="20"/>
+        </w:rPr>
+        <w:t xml:space="preserve">, </w:t>
+      </w:r>
+      <w:r>
+        <w:rPr>
+          <w:rFonts w:ascii="Consolas" w:cs="Consolas" w:eastAsia="Consolas" w:hAnsi="Consolas"/>
+          <w:b w:val="false"/>
+          <w:bCs w:val="false"/>
+          <w:color w:val="0F172A"/>
+          <w:sz w:val="18"/>
+          <w:szCs w:val="18"/>
+        </w:rPr>
+        <w:t xml:space="preserve"> TP3_KVA </w:t>
+      </w:r>
+      <w:r>
+        <w:rPr>
+          <w:rFonts w:ascii="Calibri" w:cs="Calibri" w:eastAsia="Calibri" w:hAnsi="Calibri"/>
+          <w:b w:val="false"/>
+          <w:bCs w:val="false"/>
+          <w:color w:val="1E293B"/>
+          <w:sz w:val="20"/>
+          <w:szCs w:val="20"/>
+        </w:rPr>
+        <w:t xml:space="preserve">).</w:t>
+      </w:r>
+    </w:p>
+    <w:p>
+      <w:pPr>
+        <w:pStyle w:val="ListParagraph"/>
+        <w:numPr>
+          <w:ilvl w:val="0"/>
+          <w:numId w:val="1"/>
+        </w:numPr>
+        <w:spacing w:after="40" w:before="40"/>
+      </w:pPr>
+      <w:r>
+        <w:rPr>
+          <w:rFonts w:ascii="Calibri" w:cs="Calibri" w:eastAsia="Calibri" w:hAnsi="Calibri"/>
+          <w:b/>
+          <w:bCs/>
+          <w:color w:val="002B49"/>
+          <w:sz w:val="20"/>
+          <w:szCs w:val="20"/>
+        </w:rPr>
+        <w:t xml:space="preserve">Efecto Operativo:</w:t>
+      </w:r>
+      <w:r>
+        <w:rPr>
+          <w:rFonts w:ascii="Calibri" w:cs="Calibri" w:eastAsia="Calibri" w:hAnsi="Calibri"/>
+          <w:b w:val="false"/>
+          <w:bCs w:val="false"/>
+          <w:color w:val="1E293B"/>
+          <w:sz w:val="20"/>
+          <w:szCs w:val="20"/>
+        </w:rPr>
+        <w:t xml:space="preserve"> Al comenzar el año siguiente o al intervenir una subestación con 4 transformadores, la hoja se rompe. El usuario altera la estructura agregando columnas, rompiendo la compatibilidad nacional.</w:t>
+      </w:r>
+    </w:p>
+    <w:p>
+      <w:pPr>
+        <w:pStyle w:val="ListParagraph"/>
+        <w:numPr>
+          <w:ilvl w:val="0"/>
+          <w:numId w:val="1"/>
+        </w:numPr>
+        <w:spacing w:after="40" w:before="40"/>
+      </w:pPr>
+      <w:r>
+        <w:rPr>
+          <w:rFonts w:ascii="Calibri" w:cs="Calibri" w:eastAsia="Calibri" w:hAnsi="Calibri"/>
+          <w:b/>
+          <w:bCs/>
+          <w:color w:val="002B49"/>
+          <w:sz w:val="20"/>
+          <w:szCs w:val="20"/>
+        </w:rPr>
+        <w:t xml:space="preserve">Solución de Simplificación:</w:t>
+      </w:r>
+      <w:r>
+        <w:rPr>
+          <w:rFonts w:ascii="Calibri" w:cs="Calibri" w:eastAsia="Calibri" w:hAnsi="Calibri"/>
+          <w:b w:val="false"/>
+          <w:bCs w:val="false"/>
+          <w:color w:val="1E293B"/>
+          <w:sz w:val="20"/>
+          <w:szCs w:val="20"/>
+        </w:rPr>
+        <w:t xml:space="preserve"> </w:t>
+      </w:r>
+      <w:r>
+        <w:rPr>
+          <w:rFonts w:ascii="Calibri" w:cs="Calibri" w:eastAsia="Calibri" w:hAnsi="Calibri"/>
+          <w:b/>
+          <w:bCs/>
+          <w:color w:val="002B49"/>
+          <w:sz w:val="20"/>
+          <w:szCs w:val="20"/>
+        </w:rPr>
+        <w:t xml:space="preserve">Transaccionalidad Vertical.</w:t>
+      </w:r>
+      <w:r>
+        <w:rPr>
+          <w:rFonts w:ascii="Calibri" w:cs="Calibri" w:eastAsia="Calibri" w:hAnsi="Calibri"/>
+          <w:b w:val="false"/>
+          <w:bCs w:val="false"/>
+          <w:color w:val="1E293B"/>
+          <w:sz w:val="20"/>
+          <w:szCs w:val="20"/>
+        </w:rPr>
+        <w:t xml:space="preserve"> Los meses y los transformadores son </w:t>
+      </w:r>
+      <w:r>
+        <w:rPr>
+          <w:rFonts w:ascii="Calibri" w:cs="Calibri" w:eastAsia="Calibri" w:hAnsi="Calibri"/>
+          <w:b/>
+          <w:bCs/>
+          <w:color w:val="002B49"/>
+          <w:sz w:val="20"/>
+          <w:szCs w:val="20"/>
+        </w:rPr>
+        <w:t xml:space="preserve">filas de registros</w:t>
+      </w:r>
+      <w:r>
+        <w:rPr>
+          <w:rFonts w:ascii="Calibri" w:cs="Calibri" w:eastAsia="Calibri" w:hAnsi="Calibri"/>
+          <w:b w:val="false"/>
+          <w:bCs w:val="false"/>
+          <w:color w:val="1E293B"/>
+          <w:sz w:val="20"/>
+          <w:szCs w:val="20"/>
+        </w:rPr>
+        <w:t xml:space="preserve">, no columnas fijas.</w:t>
+      </w:r>
+    </w:p>
+    <w:p>
+      <w:pPr>
+        <w:pStyle w:val="Heading3"/>
+        <w:spacing w:after="80" w:before="160"/>
+      </w:pPr>
+      <w:r>
+        <w:rPr>
+          <w:rFonts w:ascii="Calibri" w:cs="Calibri" w:eastAsia="Calibri" w:hAnsi="Calibri"/>
+          <w:b/>
+          <w:bCs/>
+          <w:color w:val="1E293B"/>
+          <w:sz w:val="22"/>
+          <w:szCs w:val="22"/>
+        </w:rPr>
+        <w:t xml:space="preserve">🔴 Trampa 4: Antipatrón 3NF (Fórmulas y Filas de "TOTAL" dentro de la Data Cruda)</w:t>
+      </w:r>
+    </w:p>
+    <w:p>
+      <w:pPr>
+        <w:pStyle w:val="ListParagraph"/>
+        <w:numPr>
+          <w:ilvl w:val="0"/>
+          <w:numId w:val="1"/>
+        </w:numPr>
+        <w:spacing w:after="40" w:before="40"/>
+      </w:pPr>
+      <w:r>
+        <w:rPr>
+          <w:rFonts w:ascii="Calibri" w:cs="Calibri" w:eastAsia="Calibri" w:hAnsi="Calibri"/>
+          <w:b/>
+          <w:bCs/>
+          <w:color w:val="002B49"/>
+          <w:sz w:val="20"/>
+          <w:szCs w:val="20"/>
+        </w:rPr>
+        <w:t xml:space="preserve">Descripción:</w:t>
+      </w:r>
+      <w:r>
+        <w:rPr>
+          <w:rFonts w:ascii="Calibri" w:cs="Calibri" w:eastAsia="Calibri" w:hAnsi="Calibri"/>
+          <w:b w:val="false"/>
+          <w:bCs w:val="false"/>
+          <w:color w:val="1E293B"/>
+          <w:sz w:val="20"/>
+          <w:szCs w:val="20"/>
+        </w:rPr>
+        <w:t xml:space="preserve"> Intercalar filas de </w:t>
+      </w:r>
+      <w:r>
+        <w:rPr>
+          <w:rFonts w:ascii="Consolas" w:cs="Consolas" w:eastAsia="Consolas" w:hAnsi="Consolas"/>
+          <w:b w:val="false"/>
+          <w:bCs w:val="false"/>
+          <w:color w:val="0F172A"/>
+          <w:sz w:val="18"/>
+          <w:szCs w:val="18"/>
+        </w:rPr>
+        <w:t xml:space="preserve"> SUBTOTAL ESTADAL </w:t>
+      </w:r>
+      <w:r>
+        <w:rPr>
+          <w:rFonts w:ascii="Calibri" w:cs="Calibri" w:eastAsia="Calibri" w:hAnsi="Calibri"/>
+          <w:b w:val="false"/>
+          <w:bCs w:val="false"/>
+          <w:color w:val="1E293B"/>
+          <w:sz w:val="20"/>
+          <w:szCs w:val="20"/>
+        </w:rPr>
+        <w:t xml:space="preserve"> o celdas con fórmulas </w:t>
+      </w:r>
+      <w:r>
+        <w:rPr>
+          <w:rFonts w:ascii="Consolas" w:cs="Consolas" w:eastAsia="Consolas" w:hAnsi="Consolas"/>
+          <w:b w:val="false"/>
+          <w:bCs w:val="false"/>
+          <w:color w:val="0F172A"/>
+          <w:sz w:val="18"/>
+          <w:szCs w:val="18"/>
+        </w:rPr>
+        <w:t xml:space="preserve"> =SUMA(D5:D48) </w:t>
+      </w:r>
+      <w:r>
+        <w:rPr>
+          <w:rFonts w:ascii="Calibri" w:cs="Calibri" w:eastAsia="Calibri" w:hAnsi="Calibri"/>
+          <w:b w:val="false"/>
+          <w:bCs w:val="false"/>
+          <w:color w:val="1E293B"/>
+          <w:sz w:val="20"/>
+          <w:szCs w:val="20"/>
+        </w:rPr>
+        <w:t xml:space="preserve"> intercaladas en medio de las filas de circuitos.</w:t>
+      </w:r>
+    </w:p>
+    <w:p>
+      <w:pPr>
+        <w:pStyle w:val="ListParagraph"/>
+        <w:numPr>
+          <w:ilvl w:val="0"/>
+          <w:numId w:val="1"/>
+        </w:numPr>
+        <w:spacing w:after="40" w:before="40"/>
+      </w:pPr>
+      <w:r>
+        <w:rPr>
+          <w:rFonts w:ascii="Calibri" w:cs="Calibri" w:eastAsia="Calibri" w:hAnsi="Calibri"/>
+          <w:b/>
+          <w:bCs/>
+          <w:color w:val="002B49"/>
+          <w:sz w:val="20"/>
+          <w:szCs w:val="20"/>
+        </w:rPr>
+        <w:t xml:space="preserve">Efecto Operativo:</w:t>
+      </w:r>
+      <w:r>
+        <w:rPr>
+          <w:rFonts w:ascii="Calibri" w:cs="Calibri" w:eastAsia="Calibri" w:hAnsi="Calibri"/>
+          <w:b w:val="false"/>
+          <w:bCs w:val="false"/>
+          <w:color w:val="1E293B"/>
+          <w:sz w:val="20"/>
+          <w:szCs w:val="20"/>
+        </w:rPr>
+        <w:t xml:space="preserve"> Cuando el sistema central suma la columna nacional, cuenta las filas individuales </w:t>
+      </w:r>
+      <w:r>
+        <w:rPr>
+          <w:rFonts w:ascii="Calibri" w:cs="Calibri" w:eastAsia="Calibri" w:hAnsi="Calibri"/>
+          <w:b/>
+          <w:bCs/>
+          <w:color w:val="002B49"/>
+          <w:sz w:val="20"/>
+          <w:szCs w:val="20"/>
+        </w:rPr>
+        <w:t xml:space="preserve">y también las filas de totales</w:t>
+      </w:r>
+      <w:r>
+        <w:rPr>
+          <w:rFonts w:ascii="Calibri" w:cs="Calibri" w:eastAsia="Calibri" w:hAnsi="Calibri"/>
+          <w:b w:val="false"/>
+          <w:bCs w:val="false"/>
+          <w:color w:val="1E293B"/>
+          <w:sz w:val="20"/>
+          <w:szCs w:val="20"/>
+        </w:rPr>
+        <w:t xml:space="preserve">, duplicando o triplicando artificialmente las métricas presentadas a la Dirección General.</w:t>
+      </w:r>
+    </w:p>
+    <w:p>
+      <w:pPr>
+        <w:pStyle w:val="ListParagraph"/>
+        <w:numPr>
+          <w:ilvl w:val="0"/>
+          <w:numId w:val="1"/>
+        </w:numPr>
+        <w:spacing w:after="40" w:before="40"/>
+      </w:pPr>
+      <w:r>
+        <w:rPr>
+          <w:rFonts w:ascii="Calibri" w:cs="Calibri" w:eastAsia="Calibri" w:hAnsi="Calibri"/>
+          <w:b/>
+          <w:bCs/>
+          <w:color w:val="002B49"/>
+          <w:sz w:val="20"/>
+          <w:szCs w:val="20"/>
+        </w:rPr>
+        <w:t xml:space="preserve">Solución de Simplificación:</w:t>
+      </w:r>
+      <w:r>
+        <w:rPr>
+          <w:rFonts w:ascii="Calibri" w:cs="Calibri" w:eastAsia="Calibri" w:hAnsi="Calibri"/>
+          <w:b w:val="false"/>
+          <w:bCs w:val="false"/>
+          <w:color w:val="1E293B"/>
+          <w:sz w:val="20"/>
+          <w:szCs w:val="20"/>
+        </w:rPr>
+        <w:t xml:space="preserve"> </w:t>
+      </w:r>
+      <w:r>
+        <w:rPr>
+          <w:rFonts w:ascii="Calibri" w:cs="Calibri" w:eastAsia="Calibri" w:hAnsi="Calibri"/>
+          <w:b/>
+          <w:bCs/>
+          <w:color w:val="002B49"/>
+          <w:sz w:val="20"/>
+          <w:szCs w:val="20"/>
+        </w:rPr>
+        <w:t xml:space="preserve">Cero Fórmulas en la Tabla de Ingesta.</w:t>
+      </w:r>
+      <w:r>
+        <w:rPr>
+          <w:rFonts w:ascii="Calibri" w:cs="Calibri" w:eastAsia="Calibri" w:hAnsi="Calibri"/>
+          <w:b w:val="false"/>
+          <w:bCs w:val="false"/>
+          <w:color w:val="1E293B"/>
+          <w:sz w:val="20"/>
+          <w:szCs w:val="20"/>
+        </w:rPr>
+        <w:t xml:space="preserve"> La tabla almacena solo hechos crudos. Los totales, porcentajes de avance y métricas KGI/KPI se calculan dinámicamente en la base de datos y se visualizan en los dashboards del SIGI.</w:t>
+      </w:r>
+    </w:p>
+    <w:p>
+      <w:pPr>
+        <w:pStyle w:val="Heading3"/>
+        <w:spacing w:after="80" w:before="160"/>
+      </w:pPr>
+      <w:r>
+        <w:rPr>
+          <w:rFonts w:ascii="Calibri" w:cs="Calibri" w:eastAsia="Calibri" w:hAnsi="Calibri"/>
+          <w:b/>
+          <w:bCs/>
+          <w:color w:val="1E293B"/>
+          <w:sz w:val="22"/>
+          <w:szCs w:val="22"/>
+        </w:rPr>
+        <w:t xml:space="preserve">🔴 Trampa 5: La "Celda Multifunción" (Texto Libre No Restringido)</w:t>
+      </w:r>
+    </w:p>
+    <w:p>
+      <w:pPr>
+        <w:pStyle w:val="ListParagraph"/>
+        <w:numPr>
+          <w:ilvl w:val="0"/>
+          <w:numId w:val="1"/>
+        </w:numPr>
+        <w:spacing w:after="40" w:before="40"/>
+      </w:pPr>
+      <w:r>
+        <w:rPr>
+          <w:rFonts w:ascii="Calibri" w:cs="Calibri" w:eastAsia="Calibri" w:hAnsi="Calibri"/>
+          <w:b/>
+          <w:bCs/>
+          <w:color w:val="002B49"/>
+          <w:sz w:val="20"/>
+          <w:szCs w:val="20"/>
+        </w:rPr>
+        <w:t xml:space="preserve">Descripción:</w:t>
+      </w:r>
+      <w:r>
+        <w:rPr>
+          <w:rFonts w:ascii="Calibri" w:cs="Calibri" w:eastAsia="Calibri" w:hAnsi="Calibri"/>
+          <w:b w:val="false"/>
+          <w:bCs w:val="false"/>
+          <w:color w:val="1E293B"/>
+          <w:sz w:val="20"/>
+          <w:szCs w:val="20"/>
+        </w:rPr>
+        <w:t xml:space="preserve"> Escribir en una sola celda de texto: </w:t>
+      </w:r>
+      <w:r>
+        <w:rPr>
+          <w:rFonts w:ascii="Consolas" w:cs="Consolas" w:eastAsia="Consolas" w:hAnsi="Consolas"/>
+          <w:b w:val="false"/>
+          <w:bCs w:val="false"/>
+          <w:color w:val="0F172A"/>
+          <w:sz w:val="18"/>
+          <w:szCs w:val="18"/>
+        </w:rPr>
+        <w:t xml:space="preserve"> "S/E CHACAO TR-01 36KVA CON ACEITE DIEL." </w:t>
+      </w:r>
+      <w:r>
+        <w:rPr>
+          <w:rFonts w:ascii="Calibri" w:cs="Calibri" w:eastAsia="Calibri" w:hAnsi="Calibri"/>
+          <w:b w:val="false"/>
+          <w:bCs w:val="false"/>
+          <w:color w:val="1E293B"/>
+          <w:sz w:val="20"/>
+          <w:szCs w:val="20"/>
+        </w:rPr>
+        <w:t xml:space="preserve">.</w:t>
+      </w:r>
+    </w:p>
+    <w:p>
+      <w:pPr>
+        <w:pStyle w:val="ListParagraph"/>
+        <w:numPr>
+          <w:ilvl w:val="0"/>
+          <w:numId w:val="1"/>
+        </w:numPr>
+        <w:spacing w:after="40" w:before="40"/>
+      </w:pPr>
+      <w:r>
+        <w:rPr>
+          <w:rFonts w:ascii="Calibri" w:cs="Calibri" w:eastAsia="Calibri" w:hAnsi="Calibri"/>
+          <w:b/>
+          <w:bCs/>
+          <w:color w:val="002B49"/>
+          <w:sz w:val="20"/>
+          <w:szCs w:val="20"/>
+        </w:rPr>
+        <w:t xml:space="preserve">Efecto Operativo:</w:t>
+      </w:r>
+      <w:r>
+        <w:rPr>
+          <w:rFonts w:ascii="Calibri" w:cs="Calibri" w:eastAsia="Calibri" w:hAnsi="Calibri"/>
+          <w:b w:val="false"/>
+          <w:bCs w:val="false"/>
+          <w:color w:val="1E293B"/>
+          <w:sz w:val="20"/>
+          <w:szCs w:val="20"/>
+        </w:rPr>
+        <w:t xml:space="preserve"> Impide filtrar por nivel de tensión, por tipo de equipo o por marca.</w:t>
+      </w:r>
+    </w:p>
+    <w:p>
+      <w:pPr>
+        <w:pStyle w:val="ListParagraph"/>
+        <w:numPr>
+          <w:ilvl w:val="0"/>
+          <w:numId w:val="1"/>
+        </w:numPr>
+        <w:spacing w:after="40" w:before="40"/>
+      </w:pPr>
+      <w:r>
+        <w:rPr>
+          <w:rFonts w:ascii="Calibri" w:cs="Calibri" w:eastAsia="Calibri" w:hAnsi="Calibri"/>
+          <w:b/>
+          <w:bCs/>
+          <w:color w:val="002B49"/>
+          <w:sz w:val="20"/>
+          <w:szCs w:val="20"/>
+        </w:rPr>
+        <w:t xml:space="preserve">Solución de Simplificación:</w:t>
+      </w:r>
+      <w:r>
+        <w:rPr>
+          <w:rFonts w:ascii="Calibri" w:cs="Calibri" w:eastAsia="Calibri" w:hAnsi="Calibri"/>
+          <w:b w:val="false"/>
+          <w:bCs w:val="false"/>
+          <w:color w:val="1E293B"/>
+          <w:sz w:val="20"/>
+          <w:szCs w:val="20"/>
+        </w:rPr>
+        <w:t xml:space="preserve"> </w:t>
+      </w:r>
+      <w:r>
+        <w:rPr>
+          <w:rFonts w:ascii="Calibri" w:cs="Calibri" w:eastAsia="Calibri" w:hAnsi="Calibri"/>
+          <w:b/>
+          <w:bCs/>
+          <w:color w:val="002B49"/>
+          <w:sz w:val="20"/>
+          <w:szCs w:val="20"/>
+        </w:rPr>
+        <w:t xml:space="preserve">Columnas Atómicas y Catálogos.</w:t>
+      </w:r>
+      <w:r>
+        <w:rPr>
+          <w:rFonts w:ascii="Calibri" w:cs="Calibri" w:eastAsia="Calibri" w:hAnsi="Calibri"/>
+          <w:b w:val="false"/>
+          <w:bCs w:val="false"/>
+          <w:color w:val="1E293B"/>
+          <w:sz w:val="20"/>
+          <w:szCs w:val="20"/>
+        </w:rPr>
+        <w:t xml:space="preserve"> Separar en: </w:t>
+      </w:r>
+      <w:r>
+        <w:rPr>
+          <w:rFonts w:ascii="Consolas" w:cs="Consolas" w:eastAsia="Consolas" w:hAnsi="Consolas"/>
+          <w:b w:val="false"/>
+          <w:bCs w:val="false"/>
+          <w:color w:val="0F172A"/>
+          <w:sz w:val="18"/>
+          <w:szCs w:val="18"/>
+        </w:rPr>
+        <w:t xml:space="preserve"> SUBESTACION </w:t>
+      </w:r>
+      <w:r>
+        <w:rPr>
+          <w:rFonts w:ascii="Calibri" w:cs="Calibri" w:eastAsia="Calibri" w:hAnsi="Calibri"/>
+          <w:b w:val="false"/>
+          <w:bCs w:val="false"/>
+          <w:color w:val="1E293B"/>
+          <w:sz w:val="20"/>
+          <w:szCs w:val="20"/>
+        </w:rPr>
+        <w:t xml:space="preserve"> (Catálogo), </w:t>
+      </w:r>
+      <w:r>
+        <w:rPr>
+          <w:rFonts w:ascii="Consolas" w:cs="Consolas" w:eastAsia="Consolas" w:hAnsi="Consolas"/>
+          <w:b w:val="false"/>
+          <w:bCs w:val="false"/>
+          <w:color w:val="0F172A"/>
+          <w:sz w:val="18"/>
+          <w:szCs w:val="18"/>
+        </w:rPr>
+        <w:t xml:space="preserve"> TAG_EQUIPO </w:t>
+      </w:r>
+      <w:r>
+        <w:rPr>
+          <w:rFonts w:ascii="Calibri" w:cs="Calibri" w:eastAsia="Calibri" w:hAnsi="Calibri"/>
+          <w:b w:val="false"/>
+          <w:bCs w:val="false"/>
+          <w:color w:val="1E293B"/>
+          <w:sz w:val="20"/>
+          <w:szCs w:val="20"/>
+        </w:rPr>
+        <w:t xml:space="preserve"> (Texto), </w:t>
+      </w:r>
+      <w:r>
+        <w:rPr>
+          <w:rFonts w:ascii="Consolas" w:cs="Consolas" w:eastAsia="Consolas" w:hAnsi="Consolas"/>
+          <w:b w:val="false"/>
+          <w:bCs w:val="false"/>
+          <w:color w:val="0F172A"/>
+          <w:sz w:val="18"/>
+          <w:szCs w:val="18"/>
+        </w:rPr>
+        <w:t xml:space="preserve"> TENSION_KV </w:t>
+      </w:r>
+      <w:r>
+        <w:rPr>
+          <w:rFonts w:ascii="Calibri" w:cs="Calibri" w:eastAsia="Calibri" w:hAnsi="Calibri"/>
+          <w:b w:val="false"/>
+          <w:bCs w:val="false"/>
+          <w:color w:val="1E293B"/>
+          <w:sz w:val="20"/>
+          <w:szCs w:val="20"/>
+        </w:rPr>
+        <w:t xml:space="preserve"> (Numérico), </w:t>
+      </w:r>
+      <w:r>
+        <w:rPr>
+          <w:rFonts w:ascii="Consolas" w:cs="Consolas" w:eastAsia="Consolas" w:hAnsi="Consolas"/>
+          <w:b w:val="false"/>
+          <w:bCs w:val="false"/>
+          <w:color w:val="0F172A"/>
+          <w:sz w:val="18"/>
+          <w:szCs w:val="18"/>
+        </w:rPr>
+        <w:t xml:space="preserve"> ESTADO_OPERATIVO </w:t>
+      </w:r>
+      <w:r>
+        <w:rPr>
+          <w:rFonts w:ascii="Calibri" w:cs="Calibri" w:eastAsia="Calibri" w:hAnsi="Calibri"/>
+          <w:b w:val="false"/>
+          <w:bCs w:val="false"/>
+          <w:color w:val="1E293B"/>
+          <w:sz w:val="20"/>
+          <w:szCs w:val="20"/>
+        </w:rPr>
+        <w:t xml:space="preserve"> (Catálogo).</w:t>
+      </w:r>
+    </w:p>
+    <w:p>
+      <w:pPr>
+        <w:pStyle w:val="Heading3"/>
+        <w:spacing w:after="80" w:before="160"/>
+      </w:pPr>
+      <w:r>
+        <w:rPr>
+          <w:rFonts w:ascii="Calibri" w:cs="Calibri" w:eastAsia="Calibri" w:hAnsi="Calibri"/>
+          <w:b/>
+          <w:bCs/>
+          <w:color w:val="1E293B"/>
+          <w:sz w:val="22"/>
+          <w:szCs w:val="22"/>
+        </w:rPr>
+        <w:t xml:space="preserve">🔴 Trampa 6: El "Data Lake Local Duplicado" (871 SE y 4.207 Circuitos Embebidos)</w:t>
+      </w:r>
+    </w:p>
+    <w:p>
+      <w:pPr>
+        <w:pStyle w:val="ListParagraph"/>
+        <w:numPr>
+          <w:ilvl w:val="0"/>
+          <w:numId w:val="1"/>
+        </w:numPr>
+        <w:spacing w:after="40" w:before="40"/>
+      </w:pPr>
+      <w:r>
+        <w:rPr>
+          <w:rFonts w:ascii="Calibri" w:cs="Calibri" w:eastAsia="Calibri" w:hAnsi="Calibri"/>
+          <w:b/>
+          <w:bCs/>
+          <w:color w:val="002B49"/>
+          <w:sz w:val="20"/>
+          <w:szCs w:val="20"/>
+        </w:rPr>
+        <w:t xml:space="preserve">Descripción:</w:t>
+      </w:r>
+      <w:r>
+        <w:rPr>
+          <w:rFonts w:ascii="Calibri" w:cs="Calibri" w:eastAsia="Calibri" w:hAnsi="Calibri"/>
+          <w:b w:val="false"/>
+          <w:bCs w:val="false"/>
+          <w:color w:val="1E293B"/>
+          <w:sz w:val="20"/>
+          <w:szCs w:val="20"/>
+        </w:rPr>
+        <w:t xml:space="preserve"> Cada estado copia y pega la lista nacional de subestaciones y circuitos en pestañas ocultas (</w:t>
+      </w:r>
+      <w:r>
+        <w:rPr>
+          <w:rFonts w:ascii="Consolas" w:cs="Consolas" w:eastAsia="Consolas" w:hAnsi="Consolas"/>
+          <w:b w:val="false"/>
+          <w:bCs w:val="false"/>
+          <w:color w:val="0F172A"/>
+          <w:sz w:val="18"/>
+          <w:szCs w:val="18"/>
+        </w:rPr>
+        <w:t xml:space="preserve"> CARACTERIZACION SE </w:t>
+      </w:r>
+      <w:r>
+        <w:rPr>
+          <w:rFonts w:ascii="Calibri" w:cs="Calibri" w:eastAsia="Calibri" w:hAnsi="Calibri"/>
+          <w:b w:val="false"/>
+          <w:bCs w:val="false"/>
+          <w:color w:val="1E293B"/>
+          <w:sz w:val="20"/>
+          <w:szCs w:val="20"/>
+        </w:rPr>
+        <w:t xml:space="preserve">).</w:t>
+      </w:r>
+    </w:p>
+    <w:p>
+      <w:pPr>
+        <w:pStyle w:val="ListParagraph"/>
+        <w:numPr>
+          <w:ilvl w:val="0"/>
+          <w:numId w:val="1"/>
+        </w:numPr>
+        <w:spacing w:after="40" w:before="40"/>
+      </w:pPr>
+      <w:r>
+        <w:rPr>
+          <w:rFonts w:ascii="Calibri" w:cs="Calibri" w:eastAsia="Calibri" w:hAnsi="Calibri"/>
+          <w:b/>
+          <w:bCs/>
+          <w:color w:val="002B49"/>
+          <w:sz w:val="20"/>
+          <w:szCs w:val="20"/>
+        </w:rPr>
+        <w:t xml:space="preserve">Efecto Operativo:</w:t>
+      </w:r>
+      <w:r>
+        <w:rPr>
+          <w:rFonts w:ascii="Calibri" w:cs="Calibri" w:eastAsia="Calibri" w:hAnsi="Calibri"/>
+          <w:b w:val="false"/>
+          <w:bCs w:val="false"/>
+          <w:color w:val="1E293B"/>
+          <w:sz w:val="20"/>
+          <w:szCs w:val="20"/>
+        </w:rPr>
+        <w:t xml:space="preserve"> Multiplicar 5.078 activos por 24 estados genera </w:t>
+      </w:r>
+      <w:r>
+        <w:rPr>
+          <w:rFonts w:ascii="Calibri" w:cs="Calibri" w:eastAsia="Calibri" w:hAnsi="Calibri"/>
+          <w:b/>
+          <w:bCs/>
+          <w:color w:val="002B49"/>
+          <w:sz w:val="20"/>
+          <w:szCs w:val="20"/>
+        </w:rPr>
+        <w:t xml:space="preserve">121.872 registros redundantes desactualizados</w:t>
+      </w:r>
+      <w:r>
+        <w:rPr>
+          <w:rFonts w:ascii="Calibri" w:cs="Calibri" w:eastAsia="Calibri" w:hAnsi="Calibri"/>
+          <w:b w:val="false"/>
+          <w:bCs w:val="false"/>
+          <w:color w:val="1E293B"/>
+          <w:sz w:val="20"/>
+          <w:szCs w:val="20"/>
+        </w:rPr>
+        <w:t xml:space="preserve">.</w:t>
+      </w:r>
+    </w:p>
+    <w:p>
+      <w:pPr>
+        <w:pStyle w:val="ListParagraph"/>
+        <w:numPr>
+          <w:ilvl w:val="0"/>
+          <w:numId w:val="1"/>
+        </w:numPr>
+        <w:spacing w:after="40" w:before="40"/>
+      </w:pPr>
+      <w:r>
+        <w:rPr>
+          <w:rFonts w:ascii="Calibri" w:cs="Calibri" w:eastAsia="Calibri" w:hAnsi="Calibri"/>
+          <w:b/>
+          <w:bCs/>
+          <w:color w:val="002B49"/>
+          <w:sz w:val="20"/>
+          <w:szCs w:val="20"/>
+        </w:rPr>
+        <w:t xml:space="preserve">Solución de Simplificación:</w:t>
+      </w:r>
+      <w:r>
+        <w:rPr>
+          <w:rFonts w:ascii="Calibri" w:cs="Calibri" w:eastAsia="Calibri" w:hAnsi="Calibri"/>
+          <w:b w:val="false"/>
+          <w:bCs w:val="false"/>
+          <w:color w:val="1E293B"/>
+          <w:sz w:val="20"/>
+          <w:szCs w:val="20"/>
+        </w:rPr>
+        <w:t xml:space="preserve"> </w:t>
+      </w:r>
+      <w:r>
+        <w:rPr>
+          <w:rFonts w:ascii="Calibri" w:cs="Calibri" w:eastAsia="Calibri" w:hAnsi="Calibri"/>
+          <w:b/>
+          <w:bCs/>
+          <w:color w:val="002B49"/>
+          <w:sz w:val="20"/>
+          <w:szCs w:val="20"/>
+        </w:rPr>
+        <w:t xml:space="preserve">Consumo MDM Centralizado.</w:t>
+      </w:r>
+      <w:r>
+        <w:rPr>
+          <w:rFonts w:ascii="Calibri" w:cs="Calibri" w:eastAsia="Calibri" w:hAnsi="Calibri"/>
+          <w:b w:val="false"/>
+          <w:bCs w:val="false"/>
+          <w:color w:val="1E293B"/>
+          <w:sz w:val="20"/>
+          <w:szCs w:val="20"/>
+        </w:rPr>
+        <w:t xml:space="preserve"> Las listas desplegables se alimentan de la tabla maestra </w:t>
+      </w:r>
+      <w:r>
+        <w:rPr>
+          <w:rFonts w:ascii="Consolas" w:cs="Consolas" w:eastAsia="Consolas" w:hAnsi="Consolas"/>
+          <w:b w:val="false"/>
+          <w:bCs w:val="false"/>
+          <w:color w:val="0F172A"/>
+          <w:sz w:val="18"/>
+          <w:szCs w:val="18"/>
+        </w:rPr>
+        <w:t xml:space="preserve"> sigi.activos_red </w:t>
+      </w:r>
+      <w:r>
+        <w:rPr>
+          <w:rFonts w:ascii="Calibri" w:cs="Calibri" w:eastAsia="Calibri" w:hAnsi="Calibri"/>
+          <w:b w:val="false"/>
+          <w:bCs w:val="false"/>
+          <w:color w:val="1E293B"/>
+          <w:sz w:val="20"/>
+          <w:szCs w:val="20"/>
+        </w:rPr>
+        <w:t xml:space="preserve"> vía web o desde plantillas oficiales generadas por el SIGI.</w:t>
+      </w:r>
+    </w:p>
+    <w:p>
+      <w:pPr>
+        <w:pBdr>
+          <w:bottom w:val="single" w:color="CBD5E1" w:sz="6" w:space="1"/>
+        </w:pBdr>
+        <w:spacing w:after="120" w:before="120"/>
+      </w:pPr>
+    </w:p>
+    <w:p>
+      <w:pPr>
+        <w:pStyle w:val="Heading2"/>
+        <w:spacing w:after="100" w:before="200"/>
+      </w:pPr>
+      <w:r>
+        <w:rPr>
+          <w:rFonts w:ascii="Calibri" w:cs="Calibri" w:eastAsia="Calibri" w:hAnsi="Calibri"/>
+          <w:b/>
+          <w:bCs/>
+          <w:color w:val="004488"/>
+          <w:sz w:val="26"/>
+          <w:szCs w:val="26"/>
+        </w:rPr>
+        <w:t xml:space="preserve">⚡ 5. ANÁLISIS DE CASOS EMBLEMÁTICOS: SOLAPAMIENTOS Y PROCESOS SUELTOS</w:t>
+      </w:r>
+    </w:p>
+    <w:p>
+      <w:pPr>
+        <w:pStyle w:val="Heading3"/>
+        <w:spacing w:after="80" w:before="160"/>
+      </w:pPr>
+      <w:r>
+        <w:rPr>
+          <w:rFonts w:ascii="Calibri" w:cs="Calibri" w:eastAsia="Calibri" w:hAnsi="Calibri"/>
+          <w:b/>
+          <w:bCs/>
+          <w:color w:val="1E293B"/>
+          <w:sz w:val="22"/>
+          <w:szCs w:val="22"/>
+        </w:rPr>
+        <w:t xml:space="preserve">5.1. El Caso del "Transformador Fantasma" (Cuádruple Registro)</w:t>
+      </w:r>
     </w:p>
     <w:tbl>
       <w:tblPr>
@@ -3496,712 +4441,45 @@
           <w:insideH w:val="single" w:color="auto" w:sz="4"/>
           <w:insideV w:val="single" w:color="auto" w:sz="4"/>
         </w:tblBorders>
-        <w:tblLayout w:type="autofit"/>
       </w:tblPr>
       <w:tblGrid>
         <w:gridCol w:w="100"/>
-        <w:gridCol w:w="100"/>
-        <w:gridCol w:w="100"/>
       </w:tblGrid>
       <w:tr>
-        <w:trPr>
-          <w:cantSplit/>
-          <w:tblHeader/>
-        </w:trPr>
         <w:tc>
           <w:tcPr>
             <w:tcBorders>
-              <w:top w:val="single" w:color="CBD5E1" w:sz="4"/>
-              <w:left w:val="single" w:color="CBD5E1" w:sz="4"/>
-              <w:bottom w:val="single" w:color="CBD5E1" w:sz="4"/>
-              <w:right w:val="single" w:color="CBD5E1" w:sz="4"/>
+              <w:top w:val="single" w:color="00F2FE" w:sz="4"/>
+              <w:left w:val="single" w:color="00F2FE" w:sz="16"/>
+              <w:bottom w:val="single" w:color="00F2FE" w:sz="4"/>
+              <w:right w:val="single" w:color="00F2FE" w:sz="4"/>
             </w:tcBorders>
-            <w:shd w:fill="002B49" w:val="clear"/>
+            <w:shd w:fill="0F172A" w:val="clear"/>
             <w:tcMar>
               <w:top w:type="dxa" w:w="120"/>
-              <w:left w:type="dxa" w:w="140"/>
+              <w:left w:type="dxa" w:w="160"/>
               <w:bottom w:type="dxa" w:w="120"/>
-              <w:right w:type="dxa" w:w="140"/>
+              <w:right w:type="dxa" w:w="160"/>
             </w:tcMar>
           </w:tcPr>
           <w:p>
-            <w:pPr>
-              <w:spacing w:after="80" w:before="80"/>
-              <w:jc w:val="left"/>
-            </w:pPr>
-            <w:r>
-              <w:rPr>
-                <w:rFonts w:ascii="Calibri" w:cs="Calibri" w:eastAsia="Calibri" w:hAnsi="Calibri"/>
-                <w:b/>
-                <w:bCs/>
-                <w:color w:val="FFFFFF"/>
-                <w:sz w:val="19"/>
-                <w:szCs w:val="19"/>
-              </w:rPr>
-              <w:t xml:space="preserve">Proceso O&amp;M</w:t>
-            </w:r>
-          </w:p>
-        </w:tc>
-        <w:tc>
-          <w:tcPr>
-            <w:tcBorders>
-              <w:top w:val="single" w:color="CBD5E1" w:sz="4"/>
-              <w:left w:val="single" w:color="CBD5E1" w:sz="4"/>
-              <w:bottom w:val="single" w:color="CBD5E1" w:sz="4"/>
-              <w:right w:val="single" w:color="CBD5E1" w:sz="4"/>
-            </w:tcBorders>
-            <w:shd w:fill="002B49" w:val="clear"/>
-            <w:tcMar>
-              <w:top w:type="dxa" w:w="120"/>
-              <w:left w:type="dxa" w:w="140"/>
-              <w:bottom w:type="dxa" w:w="120"/>
-              <w:right w:type="dxa" w:w="140"/>
-            </w:tcMar>
-          </w:tcPr>
-          <w:p>
-            <w:pPr>
-              <w:spacing w:after="80" w:before="80"/>
-              <w:jc w:val="left"/>
-            </w:pPr>
-            <w:r>
-              <w:rPr>
-                <w:rFonts w:ascii="Calibri" w:cs="Calibri" w:eastAsia="Calibri" w:hAnsi="Calibri"/>
-                <w:b/>
-                <w:bCs/>
-                <w:color w:val="FFFFFF"/>
-                <w:sz w:val="19"/>
-                <w:szCs w:val="19"/>
-              </w:rPr>
-              <w:t xml:space="preserve">Problema Actual en los Instrumentos</w:t>
-            </w:r>
-          </w:p>
-        </w:tc>
-        <w:tc>
-          <w:tcPr>
-            <w:tcBorders>
-              <w:top w:val="single" w:color="CBD5E1" w:sz="4"/>
-              <w:left w:val="single" w:color="CBD5E1" w:sz="4"/>
-              <w:bottom w:val="single" w:color="CBD5E1" w:sz="4"/>
-              <w:right w:val="single" w:color="CBD5E1" w:sz="4"/>
-            </w:tcBorders>
-            <w:shd w:fill="002B49" w:val="clear"/>
-            <w:tcMar>
-              <w:top w:type="dxa" w:w="120"/>
-              <w:left w:type="dxa" w:w="140"/>
-              <w:bottom w:type="dxa" w:w="120"/>
-              <w:right w:type="dxa" w:w="140"/>
-            </w:tcMar>
-          </w:tcPr>
-          <w:p>
-            <w:pPr>
-              <w:spacing w:after="80" w:before="80"/>
-              <w:jc w:val="left"/>
-            </w:pPr>
-            <w:r>
-              <w:rPr>
-                <w:rFonts w:ascii="Calibri" w:cs="Calibri" w:eastAsia="Calibri" w:hAnsi="Calibri"/>
-                <w:b/>
-                <w:bCs/>
-                <w:color w:val="FFFFFF"/>
-                <w:sz w:val="19"/>
-                <w:szCs w:val="19"/>
-              </w:rPr>
-              <w:t xml:space="preserve">Solución Arquitectónica SIGI (Norma ISO 9001)</w:t>
-            </w:r>
-          </w:p>
-        </w:tc>
-      </w:tr>
-      <w:tr>
-        <w:trPr>
-          <w:cantSplit/>
-          <w:tblHeader w:val="false"/>
-        </w:trPr>
-        <w:tc>
-          <w:tcPr>
-            <w:tcBorders>
-              <w:top w:val="single" w:color="CBD5E1" w:sz="4"/>
-              <w:left w:val="single" w:color="CBD5E1" w:sz="4"/>
-              <w:bottom w:val="single" w:color="CBD5E1" w:sz="4"/>
-              <w:right w:val="single" w:color="CBD5E1" w:sz="4"/>
-            </w:tcBorders>
-            <w:shd w:fill="FFFFFF" w:val="clear"/>
-            <w:tcMar>
-              <w:top w:type="dxa" w:w="120"/>
-              <w:left w:type="dxa" w:w="140"/>
-              <w:bottom w:type="dxa" w:w="120"/>
-              <w:right w:type="dxa" w:w="140"/>
-            </w:tcMar>
-          </w:tcPr>
-          <w:p>
-            <w:pPr>
-              <w:spacing w:after="80" w:before="80"/>
-              <w:jc w:val="left"/>
-            </w:pPr>
-            <w:r>
-              <w:rPr>
-                <w:rFonts w:ascii="Calibri" w:cs="Calibri" w:eastAsia="Calibri" w:hAnsi="Calibri"/>
-                <w:b/>
-                <w:bCs/>
-                <w:color w:val="002B49"/>
-                <w:sz w:val="20"/>
-                <w:szCs w:val="20"/>
-              </w:rPr>
-              <w:t xml:space="preserve">Control de Activos del SEN</w:t>
-            </w:r>
-          </w:p>
-        </w:tc>
-        <w:tc>
-          <w:tcPr>
-            <w:tcBorders>
-              <w:top w:val="single" w:color="CBD5E1" w:sz="4"/>
-              <w:left w:val="single" w:color="CBD5E1" w:sz="4"/>
-              <w:bottom w:val="single" w:color="CBD5E1" w:sz="4"/>
-              <w:right w:val="single" w:color="CBD5E1" w:sz="4"/>
-            </w:tcBorders>
-            <w:shd w:fill="FFFFFF" w:val="clear"/>
-            <w:tcMar>
-              <w:top w:type="dxa" w:w="120"/>
-              <w:left w:type="dxa" w:w="140"/>
-              <w:bottom w:type="dxa" w:w="120"/>
-              <w:right w:type="dxa" w:w="140"/>
-            </w:tcMar>
-          </w:tcPr>
-          <w:p>
-            <w:pPr>
-              <w:spacing w:after="80" w:before="80"/>
-              <w:jc w:val="left"/>
-            </w:pPr>
-            <w:r>
-              <w:rPr>
-                <w:rFonts w:ascii="Calibri" w:cs="Calibri" w:eastAsia="Calibri" w:hAnsi="Calibri"/>
-                <w:b w:val="false"/>
-                <w:bCs w:val="false"/>
-                <w:color w:val="1E293B"/>
-                <w:sz w:val="20"/>
-                <w:szCs w:val="20"/>
-              </w:rPr>
-              <w:t xml:space="preserve">Cada estado tiene su propia lista estática de 871 SE y 4.207 Circuitos.</w:t>
-            </w:r>
-          </w:p>
-        </w:tc>
-        <w:tc>
-          <w:tcPr>
-            <w:tcBorders>
-              <w:top w:val="single" w:color="CBD5E1" w:sz="4"/>
-              <w:left w:val="single" w:color="CBD5E1" w:sz="4"/>
-              <w:bottom w:val="single" w:color="CBD5E1" w:sz="4"/>
-              <w:right w:val="single" w:color="CBD5E1" w:sz="4"/>
-            </w:tcBorders>
-            <w:shd w:fill="FFFFFF" w:val="clear"/>
-            <w:tcMar>
-              <w:top w:type="dxa" w:w="120"/>
-              <w:left w:type="dxa" w:w="140"/>
-              <w:bottom w:type="dxa" w:w="120"/>
-              <w:right w:type="dxa" w:w="140"/>
-            </w:tcMar>
-          </w:tcPr>
-          <w:p>
-            <w:pPr>
-              <w:spacing w:after="80" w:before="80"/>
-              <w:jc w:val="left"/>
-            </w:pPr>
-            <w:r>
-              <w:rPr>
-                <w:rFonts w:ascii="Calibri" w:cs="Calibri" w:eastAsia="Calibri" w:hAnsi="Calibri"/>
-                <w:b/>
-                <w:bCs/>
-                <w:color w:val="002B49"/>
-                <w:sz w:val="20"/>
-                <w:szCs w:val="20"/>
-              </w:rPr>
-              <w:t xml:space="preserve">Master Data Management (MDM):</w:t>
-            </w:r>
-            <w:r>
-              <w:rPr>
-                <w:rFonts w:ascii="Calibri" w:cs="Calibri" w:eastAsia="Calibri" w:hAnsi="Calibri"/>
-                <w:b w:val="false"/>
-                <w:bCs w:val="false"/>
-                <w:color w:val="1E293B"/>
-                <w:sz w:val="20"/>
-                <w:szCs w:val="20"/>
-              </w:rPr>
-              <w:t xml:space="preserve"> Catálogo centralizado en Supabase/PostgreSQL.</w:t>
-            </w:r>
-          </w:p>
-        </w:tc>
-      </w:tr>
-      <w:tr>
-        <w:trPr>
-          <w:cantSplit/>
-          <w:tblHeader w:val="false"/>
-        </w:trPr>
-        <w:tc>
-          <w:tcPr>
-            <w:tcBorders>
-              <w:top w:val="single" w:color="CBD5E1" w:sz="4"/>
-              <w:left w:val="single" w:color="CBD5E1" w:sz="4"/>
-              <w:bottom w:val="single" w:color="CBD5E1" w:sz="4"/>
-              <w:right w:val="single" w:color="CBD5E1" w:sz="4"/>
-            </w:tcBorders>
-            <w:shd w:fill="F8FAFC" w:val="clear"/>
-            <w:tcMar>
-              <w:top w:type="dxa" w:w="120"/>
-              <w:left w:type="dxa" w:w="140"/>
-              <w:bottom w:type="dxa" w:w="120"/>
-              <w:right w:type="dxa" w:w="140"/>
-            </w:tcMar>
-          </w:tcPr>
-          <w:p>
-            <w:pPr>
-              <w:spacing w:after="80" w:before="80"/>
-              <w:jc w:val="left"/>
-            </w:pPr>
-            <w:r>
-              <w:rPr>
-                <w:rFonts w:ascii="Calibri" w:cs="Calibri" w:eastAsia="Calibri" w:hAnsi="Calibri"/>
-                <w:b/>
-                <w:bCs/>
-                <w:color w:val="002B49"/>
-                <w:sz w:val="20"/>
-                <w:szCs w:val="20"/>
-              </w:rPr>
-              <w:t xml:space="preserve">Planificación del Mantenimiento</w:t>
-            </w:r>
-          </w:p>
-        </w:tc>
-        <w:tc>
-          <w:tcPr>
-            <w:tcBorders>
-              <w:top w:val="single" w:color="CBD5E1" w:sz="4"/>
-              <w:left w:val="single" w:color="CBD5E1" w:sz="4"/>
-              <w:bottom w:val="single" w:color="CBD5E1" w:sz="4"/>
-              <w:right w:val="single" w:color="CBD5E1" w:sz="4"/>
-            </w:tcBorders>
-            <w:shd w:fill="F8FAFC" w:val="clear"/>
-            <w:tcMar>
-              <w:top w:type="dxa" w:w="120"/>
-              <w:left w:type="dxa" w:w="140"/>
-              <w:bottom w:type="dxa" w:w="120"/>
-              <w:right w:type="dxa" w:w="140"/>
-            </w:tcMar>
-          </w:tcPr>
-          <w:p>
-            <w:pPr>
-              <w:spacing w:after="80" w:before="80"/>
-              <w:jc w:val="left"/>
-            </w:pPr>
-            <w:r>
-              <w:rPr>
-                <w:rFonts w:ascii="Calibri" w:cs="Calibri" w:eastAsia="Calibri" w:hAnsi="Calibri"/>
-                <w:b w:val="false"/>
-                <w:bCs w:val="false"/>
-                <w:color w:val="1E293B"/>
-                <w:sz w:val="20"/>
-                <w:szCs w:val="20"/>
-              </w:rPr>
-              <w:t xml:space="preserve">5 formularios Excel separados con 24 pestañas cada uno.</w:t>
-            </w:r>
-          </w:p>
-        </w:tc>
-        <w:tc>
-          <w:tcPr>
-            <w:tcBorders>
-              <w:top w:val="single" w:color="CBD5E1" w:sz="4"/>
-              <w:left w:val="single" w:color="CBD5E1" w:sz="4"/>
-              <w:bottom w:val="single" w:color="CBD5E1" w:sz="4"/>
-              <w:right w:val="single" w:color="CBD5E1" w:sz="4"/>
-            </w:tcBorders>
-            <w:shd w:fill="F8FAFC" w:val="clear"/>
-            <w:tcMar>
-              <w:top w:type="dxa" w:w="120"/>
-              <w:left w:type="dxa" w:w="140"/>
-              <w:bottom w:type="dxa" w:w="120"/>
-              <w:right w:type="dxa" w:w="140"/>
-            </w:tcMar>
-          </w:tcPr>
-          <w:p>
-            <w:pPr>
-              <w:spacing w:after="80" w:before="80"/>
-              <w:jc w:val="left"/>
-            </w:pPr>
-            <w:r>
-              <w:rPr>
-                <w:rFonts w:ascii="Calibri" w:cs="Calibri" w:eastAsia="Calibri" w:hAnsi="Calibri"/>
-                <w:b/>
-                <w:bCs/>
-                <w:color w:val="002B49"/>
-                <w:sz w:val="20"/>
-                <w:szCs w:val="20"/>
-              </w:rPr>
-              <w:t xml:space="preserve">Módulo de Ingesta Unificado:</w:t>
-            </w:r>
-            <w:r>
-              <w:rPr>
-                <w:rFonts w:ascii="Calibri" w:cs="Calibri" w:eastAsia="Calibri" w:hAnsi="Calibri"/>
-                <w:b w:val="false"/>
-                <w:bCs w:val="false"/>
-                <w:color w:val="1E293B"/>
-                <w:sz w:val="20"/>
-                <w:szCs w:val="20"/>
-              </w:rPr>
-              <w:t xml:space="preserve"> Un solo punto de entrada con validación de esquema DDL.</w:t>
-            </w:r>
-          </w:p>
-        </w:tc>
-      </w:tr>
-      <w:tr>
-        <w:trPr>
-          <w:cantSplit/>
-          <w:tblHeader w:val="false"/>
-        </w:trPr>
-        <w:tc>
-          <w:tcPr>
-            <w:tcBorders>
-              <w:top w:val="single" w:color="CBD5E1" w:sz="4"/>
-              <w:left w:val="single" w:color="CBD5E1" w:sz="4"/>
-              <w:bottom w:val="single" w:color="CBD5E1" w:sz="4"/>
-              <w:right w:val="single" w:color="CBD5E1" w:sz="4"/>
-            </w:tcBorders>
-            <w:shd w:fill="FFFFFF" w:val="clear"/>
-            <w:tcMar>
-              <w:top w:type="dxa" w:w="120"/>
-              <w:left w:type="dxa" w:w="140"/>
-              <w:bottom w:type="dxa" w:w="120"/>
-              <w:right w:type="dxa" w:w="140"/>
-            </w:tcMar>
-          </w:tcPr>
-          <w:p>
-            <w:pPr>
-              <w:spacing w:after="80" w:before="80"/>
-              <w:jc w:val="left"/>
-            </w:pPr>
-            <w:r>
-              <w:rPr>
-                <w:rFonts w:ascii="Calibri" w:cs="Calibri" w:eastAsia="Calibri" w:hAnsi="Calibri"/>
-                <w:b/>
-                <w:bCs/>
-                <w:color w:val="002B49"/>
-                <w:sz w:val="20"/>
-                <w:szCs w:val="20"/>
-              </w:rPr>
-              <w:t xml:space="preserve">Ejecución y Despacho de Materiales</w:t>
-            </w:r>
-          </w:p>
-        </w:tc>
-        <w:tc>
-          <w:tcPr>
-            <w:tcBorders>
-              <w:top w:val="single" w:color="CBD5E1" w:sz="4"/>
-              <w:left w:val="single" w:color="CBD5E1" w:sz="4"/>
-              <w:bottom w:val="single" w:color="CBD5E1" w:sz="4"/>
-              <w:right w:val="single" w:color="CBD5E1" w:sz="4"/>
-            </w:tcBorders>
-            <w:shd w:fill="FFFFFF" w:val="clear"/>
-            <w:tcMar>
-              <w:top w:type="dxa" w:w="120"/>
-              <w:left w:type="dxa" w:w="140"/>
-              <w:bottom w:type="dxa" w:w="120"/>
-              <w:right w:type="dxa" w:w="140"/>
-            </w:tcMar>
-          </w:tcPr>
-          <w:p>
-            <w:pPr>
-              <w:spacing w:after="80" w:before="80"/>
-              <w:jc w:val="left"/>
-            </w:pPr>
-            <w:r>
-              <w:rPr>
-                <w:rFonts w:ascii="Calibri" w:cs="Calibri" w:eastAsia="Calibri" w:hAnsi="Calibri"/>
-                <w:b w:val="false"/>
-                <w:bCs w:val="false"/>
-                <w:color w:val="1E293B"/>
-                <w:sz w:val="20"/>
-                <w:szCs w:val="20"/>
-              </w:rPr>
-              <w:t xml:space="preserve">Se reportan precios en Euros y cantidades estimadas en celdas de texto.</w:t>
-            </w:r>
-          </w:p>
-        </w:tc>
-        <w:tc>
-          <w:tcPr>
-            <w:tcBorders>
-              <w:top w:val="single" w:color="CBD5E1" w:sz="4"/>
-              <w:left w:val="single" w:color="CBD5E1" w:sz="4"/>
-              <w:bottom w:val="single" w:color="CBD5E1" w:sz="4"/>
-              <w:right w:val="single" w:color="CBD5E1" w:sz="4"/>
-            </w:tcBorders>
-            <w:shd w:fill="FFFFFF" w:val="clear"/>
-            <w:tcMar>
-              <w:top w:type="dxa" w:w="120"/>
-              <w:left w:type="dxa" w:w="140"/>
-              <w:bottom w:type="dxa" w:w="120"/>
-              <w:right w:type="dxa" w:w="140"/>
-            </w:tcMar>
-          </w:tcPr>
-          <w:p>
-            <w:pPr>
-              <w:spacing w:after="80" w:before="80"/>
-              <w:jc w:val="left"/>
-            </w:pPr>
-            <w:r>
-              <w:rPr>
-                <w:rFonts w:ascii="Calibri" w:cs="Calibri" w:eastAsia="Calibri" w:hAnsi="Calibri"/>
-                <w:b/>
-                <w:bCs/>
-                <w:color w:val="002B49"/>
-                <w:sz w:val="20"/>
-                <w:szCs w:val="20"/>
-              </w:rPr>
-              <w:t xml:space="preserve">Catálogo de Materiales Normalizado:</w:t>
-            </w:r>
-            <w:r>
-              <w:rPr>
-                <w:rFonts w:ascii="Calibri" w:cs="Calibri" w:eastAsia="Calibri" w:hAnsi="Calibri"/>
-                <w:b w:val="false"/>
-                <w:bCs w:val="false"/>
-                <w:color w:val="1E293B"/>
-                <w:sz w:val="20"/>
-                <w:szCs w:val="20"/>
-              </w:rPr>
-              <w:t xml:space="preserve"> 21 familias, 765 items y precios de referencia en base de datos.</w:t>
-            </w:r>
-          </w:p>
-        </w:tc>
-      </w:tr>
-      <w:tr>
-        <w:trPr>
-          <w:cantSplit/>
-          <w:tblHeader w:val="false"/>
-        </w:trPr>
-        <w:tc>
-          <w:tcPr>
-            <w:tcBorders>
-              <w:top w:val="single" w:color="CBD5E1" w:sz="4"/>
-              <w:left w:val="single" w:color="CBD5E1" w:sz="4"/>
-              <w:bottom w:val="single" w:color="CBD5E1" w:sz="4"/>
-              <w:right w:val="single" w:color="CBD5E1" w:sz="4"/>
-            </w:tcBorders>
-            <w:shd w:fill="F8FAFC" w:val="clear"/>
-            <w:tcMar>
-              <w:top w:type="dxa" w:w="120"/>
-              <w:left w:type="dxa" w:w="140"/>
-              <w:bottom w:type="dxa" w:w="120"/>
-              <w:right w:type="dxa" w:w="140"/>
-            </w:tcMar>
-          </w:tcPr>
-          <w:p>
-            <w:pPr>
-              <w:spacing w:after="80" w:before="80"/>
-              <w:jc w:val="left"/>
-            </w:pPr>
-            <w:r>
-              <w:rPr>
-                <w:rFonts w:ascii="Calibri" w:cs="Calibri" w:eastAsia="Calibri" w:hAnsi="Calibri"/>
-                <w:b/>
-                <w:bCs/>
-                <w:color w:val="002B49"/>
-                <w:sz w:val="20"/>
-                <w:szCs w:val="20"/>
-              </w:rPr>
-              <w:t xml:space="preserve">Monitoreo de Indicadores (KGI/KPI)</w:t>
-            </w:r>
-          </w:p>
-        </w:tc>
-        <w:tc>
-          <w:tcPr>
-            <w:tcBorders>
-              <w:top w:val="single" w:color="CBD5E1" w:sz="4"/>
-              <w:left w:val="single" w:color="CBD5E1" w:sz="4"/>
-              <w:bottom w:val="single" w:color="CBD5E1" w:sz="4"/>
-              <w:right w:val="single" w:color="CBD5E1" w:sz="4"/>
-            </w:tcBorders>
-            <w:shd w:fill="F8FAFC" w:val="clear"/>
-            <w:tcMar>
-              <w:top w:type="dxa" w:w="120"/>
-              <w:left w:type="dxa" w:w="140"/>
-              <w:bottom w:type="dxa" w:w="120"/>
-              <w:right w:type="dxa" w:w="140"/>
-            </w:tcMar>
-          </w:tcPr>
-          <w:p>
-            <w:pPr>
-              <w:spacing w:after="80" w:before="80"/>
-              <w:jc w:val="left"/>
-            </w:pPr>
-            <w:r>
-              <w:rPr>
-                <w:rFonts w:ascii="Calibri" w:cs="Calibri" w:eastAsia="Calibri" w:hAnsi="Calibri"/>
-                <w:b w:val="false"/>
-                <w:bCs w:val="false"/>
-                <w:color w:val="1E293B"/>
-                <w:sz w:val="20"/>
-                <w:szCs w:val="20"/>
-              </w:rPr>
-              <w:t xml:space="preserve">Cálculos manuales y filas de "TOTAL" dentro de la data transaccional.</w:t>
-            </w:r>
-          </w:p>
-        </w:tc>
-        <w:tc>
-          <w:tcPr>
-            <w:tcBorders>
-              <w:top w:val="single" w:color="CBD5E1" w:sz="4"/>
-              <w:left w:val="single" w:color="CBD5E1" w:sz="4"/>
-              <w:bottom w:val="single" w:color="CBD5E1" w:sz="4"/>
-              <w:right w:val="single" w:color="CBD5E1" w:sz="4"/>
-            </w:tcBorders>
-            <w:shd w:fill="F8FAFC" w:val="clear"/>
-            <w:tcMar>
-              <w:top w:type="dxa" w:w="120"/>
-              <w:left w:type="dxa" w:w="140"/>
-              <w:bottom w:type="dxa" w:w="120"/>
-              <w:right w:type="dxa" w:w="140"/>
-            </w:tcMar>
-          </w:tcPr>
-          <w:p>
-            <w:pPr>
-              <w:spacing w:after="80" w:before="80"/>
-              <w:jc w:val="left"/>
-            </w:pPr>
-            <w:r>
-              <w:rPr>
-                <w:rFonts w:ascii="Calibri" w:cs="Calibri" w:eastAsia="Calibri" w:hAnsi="Calibri"/>
-                <w:b/>
-                <w:bCs/>
-                <w:color w:val="002B49"/>
-                <w:sz w:val="20"/>
-                <w:szCs w:val="20"/>
-              </w:rPr>
-              <w:t xml:space="preserve">Dashboards Automatizados:</w:t>
-            </w:r>
-            <w:r>
-              <w:rPr>
-                <w:rFonts w:ascii="Calibri" w:cs="Calibri" w:eastAsia="Calibri" w:hAnsi="Calibri"/>
-                <w:b w:val="false"/>
-                <w:bCs w:val="false"/>
-                <w:color w:val="1E293B"/>
-                <w:sz w:val="20"/>
-                <w:szCs w:val="20"/>
-              </w:rPr>
-              <w:t xml:space="preserve"> El sistema calcula SAIDI, SAIFI, OTQR y % de avance sin tocar la data cruda.</w:t>
-            </w:r>
-          </w:p>
-        </w:tc>
-      </w:tr>
-      <w:tr>
-        <w:trPr>
-          <w:cantSplit/>
-          <w:tblHeader w:val="false"/>
-        </w:trPr>
-        <w:tc>
-          <w:tcPr>
-            <w:tcBorders>
-              <w:top w:val="single" w:color="CBD5E1" w:sz="4"/>
-              <w:left w:val="single" w:color="CBD5E1" w:sz="4"/>
-              <w:bottom w:val="single" w:color="CBD5E1" w:sz="4"/>
-              <w:right w:val="single" w:color="CBD5E1" w:sz="4"/>
-            </w:tcBorders>
-            <w:shd w:fill="FFFFFF" w:val="clear"/>
-            <w:tcMar>
-              <w:top w:type="dxa" w:w="120"/>
-              <w:left w:type="dxa" w:w="140"/>
-              <w:bottom w:type="dxa" w:w="120"/>
-              <w:right w:type="dxa" w:w="140"/>
-            </w:tcMar>
-          </w:tcPr>
-          <w:p>
-            <w:pPr>
-              <w:spacing w:after="80" w:before="80"/>
-              <w:jc w:val="left"/>
-            </w:pPr>
-            <w:r>
-              <w:rPr>
-                <w:rFonts w:ascii="Calibri" w:cs="Calibri" w:eastAsia="Calibri" w:hAnsi="Calibri"/>
-                <w:b/>
-                <w:bCs/>
-                <w:color w:val="002B49"/>
-                <w:sz w:val="20"/>
-                <w:szCs w:val="20"/>
-              </w:rPr>
-              <w:t xml:space="preserve">Rendición de Cuentas Directiva</w:t>
-            </w:r>
-          </w:p>
-        </w:tc>
-        <w:tc>
-          <w:tcPr>
-            <w:tcBorders>
-              <w:top w:val="single" w:color="CBD5E1" w:sz="4"/>
-              <w:left w:val="single" w:color="CBD5E1" w:sz="4"/>
-              <w:bottom w:val="single" w:color="CBD5E1" w:sz="4"/>
-              <w:right w:val="single" w:color="CBD5E1" w:sz="4"/>
-            </w:tcBorders>
-            <w:shd w:fill="FFFFFF" w:val="clear"/>
-            <w:tcMar>
-              <w:top w:type="dxa" w:w="120"/>
-              <w:left w:type="dxa" w:w="140"/>
-              <w:bottom w:type="dxa" w:w="120"/>
-              <w:right w:type="dxa" w:w="140"/>
-            </w:tcMar>
-          </w:tcPr>
-          <w:p>
-            <w:pPr>
-              <w:spacing w:after="80" w:before="80"/>
-              <w:jc w:val="left"/>
-            </w:pPr>
-            <w:r>
-              <w:rPr>
-                <w:rFonts w:ascii="Calibri" w:cs="Calibri" w:eastAsia="Calibri" w:hAnsi="Calibri"/>
-                <w:b w:val="false"/>
-                <w:bCs w:val="false"/>
-                <w:color w:val="1E293B"/>
-                <w:sz w:val="20"/>
-                <w:szCs w:val="20"/>
-              </w:rPr>
-              <w:t xml:space="preserve">24 documentos de Word redactados manualmente a fin de mes.</w:t>
-            </w:r>
-          </w:p>
-        </w:tc>
-        <w:tc>
-          <w:tcPr>
-            <w:tcBorders>
-              <w:top w:val="single" w:color="CBD5E1" w:sz="4"/>
-              <w:left w:val="single" w:color="CBD5E1" w:sz="4"/>
-              <w:bottom w:val="single" w:color="CBD5E1" w:sz="4"/>
-              <w:right w:val="single" w:color="CBD5E1" w:sz="4"/>
-            </w:tcBorders>
-            <w:shd w:fill="FFFFFF" w:val="clear"/>
-            <w:tcMar>
-              <w:top w:type="dxa" w:w="120"/>
-              <w:left w:type="dxa" w:w="140"/>
-              <w:bottom w:type="dxa" w:w="120"/>
-              <w:right w:type="dxa" w:w="140"/>
-            </w:tcMar>
-          </w:tcPr>
-          <w:p>
-            <w:pPr>
-              <w:spacing w:after="80" w:before="80"/>
-              <w:jc w:val="left"/>
-            </w:pPr>
-            <w:r>
-              <w:rPr>
-                <w:rFonts w:ascii="Calibri" w:cs="Calibri" w:eastAsia="Calibri" w:hAnsi="Calibri"/>
-                <w:b/>
-                <w:bCs/>
-                <w:color w:val="002B49"/>
-                <w:sz w:val="20"/>
-                <w:szCs w:val="20"/>
-              </w:rPr>
-              <w:t xml:space="preserve">Generador Automático de Informes:</w:t>
-            </w:r>
-            <w:r>
-              <w:rPr>
-                <w:rFonts w:ascii="Calibri" w:cs="Calibri" w:eastAsia="Calibri" w:hAnsi="Calibri"/>
-                <w:b w:val="false"/>
-                <w:bCs w:val="false"/>
-                <w:color w:val="1E293B"/>
-                <w:sz w:val="20"/>
-                <w:szCs w:val="20"/>
-              </w:rPr>
-              <w:t xml:space="preserve"> Exportación ejecutiva de 1 clic desde la data validada.</w:t>
+            <w:r>
+              <w:rPr>
+                <w:rFonts w:ascii="Consolas" w:cs="Consolas" w:eastAsia="Consolas" w:hAnsi="Consolas"/>
+                <w:color w:val="E2E8F0"/>
+                <w:sz w:val="18"/>
+                <w:szCs w:val="18"/>
+              </w:rPr>
+              <w:t xml:space="preserve">+----------------------------------------------------------------------------------------------------+
+|                         EL CICLO DE VIDA FRACTURADO DE UN TRANSFORMADOR                            |
++----------------------------------------------------------------------------------------------------+
+| 1. ALMACÉN:            Reporta despacho de 100 T/F en Euros        (Hoja MATERIALES)               |
+| 2. MTO REDES:          Reporta instalación de 85 T/F por avería    (Hoja TRANSFORMADORES)          |
+| 3. VICTORIAS TEMPRANAS:Reporta 140 T/F instalados como logro comunal(Archivo VICTORIAS TEMPRANAS)  |
+| 4. SCTIS (CALIDAD):    Reporta 60 interrupciones por T/F quemados  (Hoja TIRAS SCTIS)              |
++----------------------------------------------------------------------------------------------------+
+| RESULTADO DIRECTIVO:   4 cifras incompatibles para el mismo hecho físico (Sin Serial/TAG unificado) |
++----------------------------------------------------------------------------------------------------+</w:t>
             </w:r>
           </w:p>
         </w:tc>
@@ -4209,8 +4487,300 @@
     </w:tbl>
     <w:p>
       <w:pPr>
-        <w:spacing w:after="180"/>
-      </w:pPr>
+        <w:spacing w:after="160"/>
+      </w:pPr>
+    </w:p>
+    <w:p>
+      <w:pPr>
+        <w:pStyle w:val="Heading3"/>
+        <w:spacing w:after="80" w:before="160"/>
+      </w:pPr>
+      <w:r>
+        <w:rPr>
+          <w:rFonts w:ascii="Calibri" w:cs="Calibri" w:eastAsia="Calibri" w:hAnsi="Calibri"/>
+          <w:b/>
+          <w:bCs/>
+          <w:color w:val="1E293B"/>
+          <w:sz w:val="22"/>
+          <w:szCs w:val="22"/>
+        </w:rPr>
+        <w:t xml:space="preserve">5.2. El Mantenimiento Condicionado a Recursos Ajenos (Proceso Atado)</w:t>
+      </w:r>
+    </w:p>
+    <w:p>
+      <w:pPr>
+        <w:pStyle w:val="ListParagraph"/>
+        <w:numPr>
+          <w:ilvl w:val="0"/>
+          <w:numId w:val="1"/>
+        </w:numPr>
+        <w:spacing w:after="40" w:before="40"/>
+      </w:pPr>
+      <w:r>
+        <w:rPr>
+          <w:rFonts w:ascii="Calibri" w:cs="Calibri" w:eastAsia="Calibri" w:hAnsi="Calibri"/>
+          <w:b/>
+          <w:bCs/>
+          <w:color w:val="002B49"/>
+          <w:sz w:val="20"/>
+          <w:szCs w:val="20"/>
+        </w:rPr>
+        <w:t xml:space="preserve">El Error de Diseño:</w:t>
+      </w:r>
+      <w:r>
+        <w:rPr>
+          <w:rFonts w:ascii="Calibri" w:cs="Calibri" w:eastAsia="Calibri" w:hAnsi="Calibri"/>
+          <w:b w:val="false"/>
+          <w:bCs w:val="false"/>
+          <w:color w:val="1E293B"/>
+          <w:sz w:val="20"/>
+          <w:szCs w:val="20"/>
+        </w:rPr>
+        <w:t xml:space="preserve"> Forzar al ingeniero de campo a responder en la planilla de pica y poda si el camión unicesta tenía cauchos operativos o si se disponía de combustible.</w:t>
+      </w:r>
+    </w:p>
+    <w:p>
+      <w:pPr>
+        <w:pStyle w:val="ListParagraph"/>
+        <w:numPr>
+          <w:ilvl w:val="0"/>
+          <w:numId w:val="1"/>
+        </w:numPr>
+        <w:spacing w:after="40" w:before="40"/>
+      </w:pPr>
+      <w:r>
+        <w:rPr>
+          <w:rFonts w:ascii="Calibri" w:cs="Calibri" w:eastAsia="Calibri" w:hAnsi="Calibri"/>
+          <w:b/>
+          <w:bCs/>
+          <w:color w:val="002B49"/>
+          <w:sz w:val="20"/>
+          <w:szCs w:val="20"/>
+        </w:rPr>
+        <w:t xml:space="preserve">La Realidad O&amp;M:</w:t>
+      </w:r>
+      <w:r>
+        <w:rPr>
+          <w:rFonts w:ascii="Calibri" w:cs="Calibri" w:eastAsia="Calibri" w:hAnsi="Calibri"/>
+          <w:b w:val="false"/>
+          <w:bCs w:val="false"/>
+          <w:color w:val="1E293B"/>
+          <w:sz w:val="20"/>
+          <w:szCs w:val="20"/>
+        </w:rPr>
+        <w:t xml:space="preserve"> Esos recursos son administrados por Bienes y Servicios y Logística. Al exigir esa información en la hoja de campo, se bloquea el reporte del mantenimiento físico.</w:t>
+      </w:r>
+    </w:p>
+    <w:p>
+      <w:pPr>
+        <w:pStyle w:val="ListParagraph"/>
+        <w:numPr>
+          <w:ilvl w:val="0"/>
+          <w:numId w:val="1"/>
+        </w:numPr>
+        <w:spacing w:after="40" w:before="40"/>
+      </w:pPr>
+      <w:r>
+        <w:rPr>
+          <w:rFonts w:ascii="Calibri" w:cs="Calibri" w:eastAsia="Calibri" w:hAnsi="Calibri"/>
+          <w:b/>
+          <w:bCs/>
+          <w:color w:val="002B49"/>
+          <w:sz w:val="20"/>
+          <w:szCs w:val="20"/>
+        </w:rPr>
+        <w:t xml:space="preserve">La Solución SIGI:</w:t>
+      </w:r>
+      <w:r>
+        <w:rPr>
+          <w:rFonts w:ascii="Calibri" w:cs="Calibri" w:eastAsia="Calibri" w:hAnsi="Calibri"/>
+          <w:b w:val="false"/>
+          <w:bCs w:val="false"/>
+          <w:color w:val="1E293B"/>
+          <w:sz w:val="20"/>
+          <w:szCs w:val="20"/>
+        </w:rPr>
+        <w:t xml:space="preserve"> Desacoplar. Campo reporta metros podados; Logística reporta inventarios por su propio formulario. El SIGI los vincula mediante el </w:t>
+      </w:r>
+      <w:r>
+        <w:rPr>
+          <w:rFonts w:ascii="Consolas" w:cs="Consolas" w:eastAsia="Consolas" w:hAnsi="Consolas"/>
+          <w:b w:val="false"/>
+          <w:bCs w:val="false"/>
+          <w:color w:val="0F172A"/>
+          <w:sz w:val="18"/>
+          <w:szCs w:val="18"/>
+        </w:rPr>
+        <w:t xml:space="preserve"> COD_ESTADO </w:t>
+      </w:r>
+      <w:r>
+        <w:rPr>
+          <w:rFonts w:ascii="Calibri" w:cs="Calibri" w:eastAsia="Calibri" w:hAnsi="Calibri"/>
+          <w:b w:val="false"/>
+          <w:bCs w:val="false"/>
+          <w:color w:val="1E293B"/>
+          <w:sz w:val="20"/>
+          <w:szCs w:val="20"/>
+        </w:rPr>
+        <w:t xml:space="preserve"> y </w:t>
+      </w:r>
+      <w:r>
+        <w:rPr>
+          <w:rFonts w:ascii="Consolas" w:cs="Consolas" w:eastAsia="Consolas" w:hAnsi="Consolas"/>
+          <w:b w:val="false"/>
+          <w:bCs w:val="false"/>
+          <w:color w:val="0F172A"/>
+          <w:sz w:val="18"/>
+          <w:szCs w:val="18"/>
+        </w:rPr>
+        <w:t xml:space="preserve"> FECHA </w:t>
+      </w:r>
+      <w:r>
+        <w:rPr>
+          <w:rFonts w:ascii="Calibri" w:cs="Calibri" w:eastAsia="Calibri" w:hAnsi="Calibri"/>
+          <w:b w:val="false"/>
+          <w:bCs w:val="false"/>
+          <w:color w:val="1E293B"/>
+          <w:sz w:val="20"/>
+          <w:szCs w:val="20"/>
+        </w:rPr>
+        <w:t xml:space="preserve">.</w:t>
+      </w:r>
+    </w:p>
+    <w:p>
+      <w:pPr>
+        <w:pStyle w:val="Heading3"/>
+        <w:spacing w:after="80" w:before="160"/>
+      </w:pPr>
+      <w:r>
+        <w:rPr>
+          <w:rFonts w:ascii="Calibri" w:cs="Calibri" w:eastAsia="Calibri" w:hAnsi="Calibri"/>
+          <w:b/>
+          <w:bCs/>
+          <w:color w:val="1E293B"/>
+          <w:sz w:val="22"/>
+          <w:szCs w:val="22"/>
+        </w:rPr>
+        <w:t xml:space="preserve">5.3. La Desconexión entre Mantenimiento y Calidad (Proceso Suelto)</w:t>
+      </w:r>
+    </w:p>
+    <w:p>
+      <w:pPr>
+        <w:pStyle w:val="ListParagraph"/>
+        <w:numPr>
+          <w:ilvl w:val="0"/>
+          <w:numId w:val="1"/>
+        </w:numPr>
+        <w:spacing w:after="40" w:before="40"/>
+      </w:pPr>
+      <w:r>
+        <w:rPr>
+          <w:rFonts w:ascii="Calibri" w:cs="Calibri" w:eastAsia="Calibri" w:hAnsi="Calibri"/>
+          <w:b/>
+          <w:bCs/>
+          <w:color w:val="002B49"/>
+          <w:sz w:val="20"/>
+          <w:szCs w:val="20"/>
+        </w:rPr>
+        <w:t xml:space="preserve">El Hecho:</w:t>
+      </w:r>
+      <w:r>
+        <w:rPr>
+          <w:rFonts w:ascii="Calibri" w:cs="Calibri" w:eastAsia="Calibri" w:hAnsi="Calibri"/>
+          <w:b w:val="false"/>
+          <w:bCs w:val="false"/>
+          <w:color w:val="1E293B"/>
+          <w:sz w:val="20"/>
+          <w:szCs w:val="20"/>
+        </w:rPr>
+        <w:t xml:space="preserve"> Las cuadrillas ejecutan mantenimiento intensivo en un circuito con restricción por vegetación.</w:t>
+      </w:r>
+    </w:p>
+    <w:p>
+      <w:pPr>
+        <w:pStyle w:val="ListParagraph"/>
+        <w:numPr>
+          <w:ilvl w:val="0"/>
+          <w:numId w:val="1"/>
+        </w:numPr>
+        <w:spacing w:after="40" w:before="40"/>
+      </w:pPr>
+      <w:r>
+        <w:rPr>
+          <w:rFonts w:ascii="Calibri" w:cs="Calibri" w:eastAsia="Calibri" w:hAnsi="Calibri"/>
+          <w:b/>
+          <w:bCs/>
+          <w:color w:val="002B49"/>
+          <w:sz w:val="20"/>
+          <w:szCs w:val="20"/>
+        </w:rPr>
+        <w:t xml:space="preserve">La Falla:</w:t>
+      </w:r>
+      <w:r>
+        <w:rPr>
+          <w:rFonts w:ascii="Calibri" w:cs="Calibri" w:eastAsia="Calibri" w:hAnsi="Calibri"/>
+          <w:b w:val="false"/>
+          <w:bCs w:val="false"/>
+          <w:color w:val="1E293B"/>
+          <w:sz w:val="20"/>
+          <w:szCs w:val="20"/>
+        </w:rPr>
+        <w:t xml:space="preserve"> La planilla de restricciones operativas no se entera del mantenimiento. El circuito continúa clasificado como "Vulnerable" en el Despacho de Carga.</w:t>
+      </w:r>
+    </w:p>
+    <w:p>
+      <w:pPr>
+        <w:pStyle w:val="ListParagraph"/>
+        <w:numPr>
+          <w:ilvl w:val="0"/>
+          <w:numId w:val="1"/>
+        </w:numPr>
+        <w:spacing w:after="40" w:before="40"/>
+      </w:pPr>
+      <w:r>
+        <w:rPr>
+          <w:rFonts w:ascii="Calibri" w:cs="Calibri" w:eastAsia="Calibri" w:hAnsi="Calibri"/>
+          <w:b/>
+          <w:bCs/>
+          <w:color w:val="002B49"/>
+          <w:sz w:val="20"/>
+          <w:szCs w:val="20"/>
+        </w:rPr>
+        <w:t xml:space="preserve">La Solución SIGI:</w:t>
+      </w:r>
+      <w:r>
+        <w:rPr>
+          <w:rFonts w:ascii="Calibri" w:cs="Calibri" w:eastAsia="Calibri" w:hAnsi="Calibri"/>
+          <w:b w:val="false"/>
+          <w:bCs w:val="false"/>
+          <w:color w:val="1E293B"/>
+          <w:sz w:val="20"/>
+          <w:szCs w:val="20"/>
+        </w:rPr>
+        <w:t xml:space="preserve"> La ingesta certificada de Pica y Poda emite un evento que </w:t>
+      </w:r>
+      <w:r>
+        <w:rPr>
+          <w:rFonts w:ascii="Calibri" w:cs="Calibri" w:eastAsia="Calibri" w:hAnsi="Calibri"/>
+          <w:b/>
+          <w:bCs/>
+          <w:color w:val="002B49"/>
+          <w:sz w:val="20"/>
+          <w:szCs w:val="20"/>
+        </w:rPr>
+        <w:t xml:space="preserve">marca automáticamente la restricción como ATENDIDA</w:t>
+      </w:r>
+      <w:r>
+        <w:rPr>
+          <w:rFonts w:ascii="Calibri" w:cs="Calibri" w:eastAsia="Calibri" w:hAnsi="Calibri"/>
+          <w:b w:val="false"/>
+          <w:bCs w:val="false"/>
+          <w:color w:val="1E293B"/>
+          <w:sz w:val="20"/>
+          <w:szCs w:val="20"/>
+        </w:rPr>
+        <w:t xml:space="preserve"> en la base de datos.</w:t>
+      </w:r>
     </w:p>
     <w:p>
       <w:pPr>
@@ -4234,7 +4804,7 @@
           <w:sz w:val="26"/>
           <w:szCs w:val="26"/>
         </w:rPr>
-        <w:t xml:space="preserve">💡 6. DICTAMEN TÉCNICO Y RECOMENDACIÓN PARA EL COMITÉ DIRECTIVO</w:t>
+        <w:t xml:space="preserve">🚀 6. BASES PARA LA CAMPAÑA NACIONAL DE SIMPLIFICACIÓN Y NORMALIZACIÓN</w:t>
       </w:r>
     </w:p>
     <w:p>
@@ -4250,6 +4820,139 @@
           <w:sz w:val="20"/>
           <w:szCs w:val="20"/>
         </w:rPr>
+        <w:t xml:space="preserve">La campaña nacional se fundamenta en </w:t>
+      </w:r>
+      <w:r>
+        <w:rPr>
+          <w:rFonts w:ascii="Calibri" w:cs="Calibri" w:eastAsia="Calibri" w:hAnsi="Calibri"/>
+          <w:b/>
+          <w:bCs/>
+          <w:color w:val="002B49"/>
+          <w:sz w:val="20"/>
+          <w:szCs w:val="20"/>
+        </w:rPr>
+        <w:t xml:space="preserve">4 pilares estratégicos implementados en el SIGI</w:t>
+      </w:r>
+      <w:r>
+        <w:rPr>
+          <w:rFonts w:ascii="Calibri" w:cs="Calibri" w:eastAsia="Calibri" w:hAnsi="Calibri"/>
+          <w:b w:val="false"/>
+          <w:bCs w:val="false"/>
+          <w:color w:val="1E293B"/>
+          <w:sz w:val="20"/>
+          <w:szCs w:val="20"/>
+        </w:rPr>
+        <w:t xml:space="preserve">:</w:t>
+      </w:r>
+    </w:p>
+    <w:tbl>
+      <w:tblPr>
+        <w:tblW w:type="pct" w:w="100%"/>
+        <w:tblBorders>
+          <w:top w:val="single" w:color="auto" w:sz="4"/>
+          <w:left w:val="single" w:color="auto" w:sz="4"/>
+          <w:bottom w:val="single" w:color="auto" w:sz="4"/>
+          <w:right w:val="single" w:color="auto" w:sz="4"/>
+          <w:insideH w:val="single" w:color="auto" w:sz="4"/>
+          <w:insideV w:val="single" w:color="auto" w:sz="4"/>
+        </w:tblBorders>
+      </w:tblPr>
+      <w:tblGrid>
+        <w:gridCol w:w="100"/>
+      </w:tblGrid>
+      <w:tr>
+        <w:tc>
+          <w:tcPr>
+            <w:tcBorders>
+              <w:top w:val="single" w:color="00F2FE" w:sz="4"/>
+              <w:left w:val="single" w:color="00F2FE" w:sz="16"/>
+              <w:bottom w:val="single" w:color="00F2FE" w:sz="4"/>
+              <w:right w:val="single" w:color="00F2FE" w:sz="4"/>
+            </w:tcBorders>
+            <w:shd w:fill="0F172A" w:val="clear"/>
+            <w:tcMar>
+              <w:top w:type="dxa" w:w="120"/>
+              <w:left w:type="dxa" w:w="160"/>
+              <w:bottom w:type="dxa" w:w="120"/>
+              <w:right w:type="dxa" w:w="160"/>
+            </w:tcMar>
+          </w:tcPr>
+          <w:p>
+            <w:r>
+              <w:rPr>
+                <w:rFonts w:ascii="Consolas" w:cs="Consolas" w:eastAsia="Consolas" w:hAnsi="Consolas"/>
+                <w:color w:val="E2E8F0"/>
+                <w:sz w:val="18"/>
+                <w:szCs w:val="18"/>
+              </w:rPr>
+              <w:t xml:space="preserve">graph TD
+    subgraph "PILARES DE LA CAMPAÑA NACIONAL DE SIMPLIFICACIÓN SIGI"
+        A["Pilar 1: Asistente Wizard ISO 8000&lt;br/&gt;• Certificación de Formularios en 4 Pasos&lt;br/&gt;• Detección Heurística de Antipatrones&lt;br/&gt;• Generación Automática de DDL SQL"]
+        B["Pilar 2: Catálogo de Instrumentos Atómicos&lt;br/&gt;• 1 Formulario = 1 Actividad (1 Pestaña)&lt;br/&gt;• Grano Definido y Columnas Tipadas&lt;br/&gt;• Descarga de Plantillas Oficiales"]
+        C["Pilar 3: Hub de Ingesta Híbrido&lt;br/&gt;• Carga Web Reactiva o Excel Normalizado&lt;br/&gt;• Validación Sintáctica en Caliente&lt;br/&gt;• Sugerencias Inteligentes de 1-Clic"]
+        D["Pilar 4: Data Lake Estructurado en Drive&lt;br/&gt;• Árbol de 25 Estados Aprovisionado&lt;br/&gt;• Sincronización Webhook Automatizada&lt;br/&gt;• Eliminación de Envíos por Correo/Chat"]
+    end
+    A --&gt; E["CONVERGENCIA EN BASE DE DATOS CENTRAL POSTGRESQL / SUPABASE"]
+    B --&gt; E
+    C --&gt; E
+    D --&gt; E
+    E --&gt; F["DASHBOARDS DIRECTIVOS EN TIEMPO REAL (KGI / KPI / SAIDI / SAIFI)"]</w:t>
+            </w:r>
+          </w:p>
+        </w:tc>
+      </w:tr>
+    </w:tbl>
+    <w:p>
+      <w:pPr>
+        <w:spacing w:after="160"/>
+      </w:pPr>
+    </w:p>
+    <w:p>
+      <w:pPr>
+        <w:pStyle w:val="Heading3"/>
+        <w:spacing w:after="80" w:before="160"/>
+      </w:pPr>
+      <w:r>
+        <w:rPr>
+          <w:rFonts w:ascii="Calibri" w:cs="Calibri" w:eastAsia="Calibri" w:hAnsi="Calibri"/>
+          <w:b/>
+          <w:bCs/>
+          <w:color w:val="1E293B"/>
+          <w:sz w:val="22"/>
+          <w:szCs w:val="22"/>
+        </w:rPr>
+        <w:t xml:space="preserve">📋 El Decálogo del Instrumento Normalizado (Guía para Ingenieros)</w:t>
+      </w:r>
+    </w:p>
+    <w:p>
+      <w:pPr>
+        <w:spacing w:after="80" w:before="60"/>
+      </w:pPr>
+      <w:r>
+        <w:rPr>
+          <w:rFonts w:ascii="Calibri" w:cs="Calibri" w:eastAsia="Calibri" w:hAnsi="Calibri"/>
+          <w:b w:val="false"/>
+          <w:bCs w:val="false"/>
+          <w:color w:val="1E293B"/>
+          <w:sz w:val="20"/>
+          <w:szCs w:val="20"/>
+        </w:rPr>
+        <w:t xml:space="preserve">Para que cualquier nuevo formato sea admitido por la GGPD, debe cumplir estas 10 reglas:</w:t>
+      </w:r>
+    </w:p>
+    <w:p>
+      <w:pPr>
+        <w:spacing w:after="80" w:before="60"/>
+      </w:pPr>
+      <w:r>
+        <w:rPr>
+          <w:rFonts w:ascii="Calibri" w:cs="Calibri" w:eastAsia="Calibri" w:hAnsi="Calibri"/>
+          <w:b w:val="false"/>
+          <w:bCs w:val="false"/>
+          <w:color w:val="1E293B"/>
+          <w:sz w:val="20"/>
+          <w:szCs w:val="20"/>
+        </w:rPr>
         <w:t xml:space="preserve">1. </w:t>
       </w:r>
       <w:r>
@@ -4261,18 +4964,18 @@
           <w:sz w:val="20"/>
           <w:szCs w:val="20"/>
         </w:rPr>
-        <w:t xml:space="preserve">Reconocimiento Estructural:</w:t>
-      </w:r>
-      <w:r>
-        <w:rPr>
-          <w:rFonts w:ascii="Calibri" w:cs="Calibri" w:eastAsia="Calibri" w:hAnsi="Calibri"/>
-          <w:b w:val="false"/>
-          <w:bCs w:val="false"/>
-          <w:color w:val="1E293B"/>
-          <w:sz w:val="20"/>
-          <w:szCs w:val="20"/>
-        </w:rPr>
-        <w:t xml:space="preserve"> La organización actual en campo refleja una necesidad genuina de control, pero los instrumentos de hoja de cálculo utilizados han sobrepasado su límite de escalabilidad.</w:t>
+        <w:t xml:space="preserve">Pestaña Única:</w:t>
+      </w:r>
+      <w:r>
+        <w:rPr>
+          <w:rFonts w:ascii="Calibri" w:cs="Calibri" w:eastAsia="Calibri" w:hAnsi="Calibri"/>
+          <w:b w:val="false"/>
+          <w:bCs w:val="false"/>
+          <w:color w:val="1E293B"/>
+          <w:sz w:val="20"/>
+          <w:szCs w:val="20"/>
+        </w:rPr>
+        <w:t xml:space="preserve"> El archivo Excel debe contener una única hoja con los datos operativos.</w:t>
       </w:r>
     </w:p>
     <w:p>
@@ -4299,62 +5002,18 @@
           <w:sz w:val="20"/>
           <w:szCs w:val="20"/>
         </w:rPr>
-        <w:t xml:space="preserve">Desacoplamiento Operativo:</w:t>
-      </w:r>
-      <w:r>
-        <w:rPr>
-          <w:rFonts w:ascii="Calibri" w:cs="Calibri" w:eastAsia="Calibri" w:hAnsi="Calibri"/>
-          <w:b w:val="false"/>
-          <w:bCs w:val="false"/>
-          <w:color w:val="1E293B"/>
-          <w:sz w:val="20"/>
-          <w:szCs w:val="20"/>
-        </w:rPr>
-        <w:t xml:space="preserve"> Separar el registro de la </w:t>
-      </w:r>
-      <w:r>
-        <w:rPr>
-          <w:rFonts w:ascii="Calibri" w:cs="Calibri" w:eastAsia="Calibri" w:hAnsi="Calibri"/>
-          <w:b/>
-          <w:bCs/>
-          <w:color w:val="002B49"/>
-          <w:sz w:val="20"/>
-          <w:szCs w:val="20"/>
-        </w:rPr>
-        <w:t xml:space="preserve">física de la red</w:t>
-      </w:r>
-      <w:r>
-        <w:rPr>
-          <w:rFonts w:ascii="Calibri" w:cs="Calibri" w:eastAsia="Calibri" w:hAnsi="Calibri"/>
-          <w:b w:val="false"/>
-          <w:bCs w:val="false"/>
-          <w:color w:val="1E293B"/>
-          <w:sz w:val="20"/>
-          <w:szCs w:val="20"/>
-        </w:rPr>
-        <w:t xml:space="preserve"> (mantenimiento y averías) del registro de la </w:t>
-      </w:r>
-      <w:r>
-        <w:rPr>
-          <w:rFonts w:ascii="Calibri" w:cs="Calibri" w:eastAsia="Calibri" w:hAnsi="Calibri"/>
-          <w:b/>
-          <w:bCs/>
-          <w:color w:val="002B49"/>
-          <w:sz w:val="20"/>
-          <w:szCs w:val="20"/>
-        </w:rPr>
-        <w:t xml:space="preserve">logística administrativa</w:t>
-      </w:r>
-      <w:r>
-        <w:rPr>
-          <w:rFonts w:ascii="Calibri" w:cs="Calibri" w:eastAsia="Calibri" w:hAnsi="Calibri"/>
-          <w:b w:val="false"/>
-          <w:bCs w:val="false"/>
-          <w:color w:val="1E293B"/>
-          <w:sz w:val="20"/>
-          <w:szCs w:val="20"/>
-        </w:rPr>
-        <w:t xml:space="preserve"> (combustible, flota, viáticos), interconectándolos únicamente mediante IDs relacionales (</w:t>
+        <w:t xml:space="preserve">Encabezado en Fila 1:</w:t>
+      </w:r>
+      <w:r>
+        <w:rPr>
+          <w:rFonts w:ascii="Calibri" w:cs="Calibri" w:eastAsia="Calibri" w:hAnsi="Calibri"/>
+          <w:b w:val="false"/>
+          <w:bCs w:val="false"/>
+          <w:color w:val="1E293B"/>
+          <w:sz w:val="20"/>
+          <w:szCs w:val="20"/>
+        </w:rPr>
+        <w:t xml:space="preserve"> Nombres de columna en mayúsculas, sin espacios ni caracteres especiales (</w:t>
       </w:r>
       <w:r>
         <w:rPr>
@@ -4365,18 +5024,18 @@
           <w:sz w:val="18"/>
           <w:szCs w:val="18"/>
         </w:rPr>
-        <w:t xml:space="preserve"> UUID </w:t>
-      </w:r>
-      <w:r>
-        <w:rPr>
-          <w:rFonts w:ascii="Calibri" w:cs="Calibri" w:eastAsia="Calibri" w:hAnsi="Calibri"/>
-          <w:b w:val="false"/>
-          <w:bCs w:val="false"/>
-          <w:color w:val="1E293B"/>
-          <w:sz w:val="20"/>
-          <w:szCs w:val="20"/>
-        </w:rPr>
-        <w:t xml:space="preserve"> / </w:t>
+        <w:t xml:space="preserve"> SUBESTACION </w:t>
+      </w:r>
+      <w:r>
+        <w:rPr>
+          <w:rFonts w:ascii="Calibri" w:cs="Calibri" w:eastAsia="Calibri" w:hAnsi="Calibri"/>
+          <w:b w:val="false"/>
+          <w:bCs w:val="false"/>
+          <w:color w:val="1E293B"/>
+          <w:sz w:val="20"/>
+          <w:szCs w:val="20"/>
+        </w:rPr>
+        <w:t xml:space="preserve">, </w:t>
       </w:r>
       <w:r>
         <w:rPr>
@@ -4387,18 +5046,18 @@
           <w:sz w:val="18"/>
           <w:szCs w:val="18"/>
         </w:rPr>
-        <w:t xml:space="preserve"> COD_ESTADO </w:t>
-      </w:r>
-      <w:r>
-        <w:rPr>
-          <w:rFonts w:ascii="Calibri" w:cs="Calibri" w:eastAsia="Calibri" w:hAnsi="Calibri"/>
-          <w:b w:val="false"/>
-          <w:bCs w:val="false"/>
-          <w:color w:val="1E293B"/>
-          <w:sz w:val="20"/>
-          <w:szCs w:val="20"/>
-        </w:rPr>
-        <w:t xml:space="preserve"> / </w:t>
+        <w:t xml:space="preserve"> CIRCUITO </w:t>
+      </w:r>
+      <w:r>
+        <w:rPr>
+          <w:rFonts w:ascii="Calibri" w:cs="Calibri" w:eastAsia="Calibri" w:hAnsi="Calibri"/>
+          <w:b w:val="false"/>
+          <w:bCs w:val="false"/>
+          <w:color w:val="1E293B"/>
+          <w:sz w:val="20"/>
+          <w:szCs w:val="20"/>
+        </w:rPr>
+        <w:t xml:space="preserve">, </w:t>
       </w:r>
       <w:r>
         <w:rPr>
@@ -4409,7 +5068,7 @@
           <w:sz w:val="18"/>
           <w:szCs w:val="18"/>
         </w:rPr>
-        <w:t xml:space="preserve"> ID_ACTIVO </w:t>
+        <w:t xml:space="preserve"> MW_AFECTADOS </w:t>
       </w:r>
       <w:r>
         <w:rPr>
@@ -4447,18 +5106,34 @@
           <w:sz w:val="20"/>
           <w:szCs w:val="20"/>
         </w:rPr>
-        <w:t xml:space="preserve">Implantación del Ecosistema Integrado:</w:t>
-      </w:r>
-      <w:r>
-        <w:rPr>
-          <w:rFonts w:ascii="Calibri" w:cs="Calibri" w:eastAsia="Calibri" w:hAnsi="Calibri"/>
-          <w:b w:val="false"/>
-          <w:bCs w:val="false"/>
-          <w:color w:val="1E293B"/>
-          <w:sz w:val="20"/>
-          <w:szCs w:val="20"/>
-        </w:rPr>
-        <w:t xml:space="preserve"> Oficializar las 4 aplicaciones maestras satélites (SCTIS, SCEIN, SCPPE, SCMTP) alimentadas por el Hub de Ingesta Inteligente del SIGI como el </w:t>
+        <w:t xml:space="preserve">Cero Celdas Combinadas:</w:t>
+      </w:r>
+      <w:r>
+        <w:rPr>
+          <w:rFonts w:ascii="Calibri" w:cs="Calibri" w:eastAsia="Calibri" w:hAnsi="Calibri"/>
+          <w:b w:val="false"/>
+          <w:bCs w:val="false"/>
+          <w:color w:val="1E293B"/>
+          <w:sz w:val="20"/>
+          <w:szCs w:val="20"/>
+        </w:rPr>
+        <w:t xml:space="preserve"> Ninguna celda del rango de datos debe estar fusionada.</w:t>
+      </w:r>
+    </w:p>
+    <w:p>
+      <w:pPr>
+        <w:spacing w:after="80" w:before="60"/>
+      </w:pPr>
+      <w:r>
+        <w:rPr>
+          <w:rFonts w:ascii="Calibri" w:cs="Calibri" w:eastAsia="Calibri" w:hAnsi="Calibri"/>
+          <w:b w:val="false"/>
+          <w:bCs w:val="false"/>
+          <w:color w:val="1E293B"/>
+          <w:sz w:val="20"/>
+          <w:szCs w:val="20"/>
+        </w:rPr>
+        <w:t xml:space="preserve">4. </w:t>
       </w:r>
       <w:r>
         <w:rPr>
@@ -4469,7 +5144,209 @@
           <w:sz w:val="20"/>
           <w:szCs w:val="20"/>
         </w:rPr>
-        <w:t xml:space="preserve">único canal corporativo de captura de datos de distribución</w:t>
+        <w:t xml:space="preserve">Cero Totales Intercalados:</w:t>
+      </w:r>
+      <w:r>
+        <w:rPr>
+          <w:rFonts w:ascii="Calibri" w:cs="Calibri" w:eastAsia="Calibri" w:hAnsi="Calibri"/>
+          <w:b w:val="false"/>
+          <w:bCs w:val="false"/>
+          <w:color w:val="1E293B"/>
+          <w:sz w:val="20"/>
+          <w:szCs w:val="20"/>
+        </w:rPr>
+        <w:t xml:space="preserve"> Las sumatorias y promedios son responsabilidad del motor SQL.</w:t>
+      </w:r>
+    </w:p>
+    <w:p>
+      <w:pPr>
+        <w:spacing w:after="80" w:before="60"/>
+      </w:pPr>
+      <w:r>
+        <w:rPr>
+          <w:rFonts w:ascii="Calibri" w:cs="Calibri" w:eastAsia="Calibri" w:hAnsi="Calibri"/>
+          <w:b w:val="false"/>
+          <w:bCs w:val="false"/>
+          <w:color w:val="1E293B"/>
+          <w:sz w:val="20"/>
+          <w:szCs w:val="20"/>
+        </w:rPr>
+        <w:t xml:space="preserve">5. </w:t>
+      </w:r>
+      <w:r>
+        <w:rPr>
+          <w:rFonts w:ascii="Calibri" w:cs="Calibri" w:eastAsia="Calibri" w:hAnsi="Calibri"/>
+          <w:b/>
+          <w:bCs/>
+          <w:color w:val="002B49"/>
+          <w:sz w:val="20"/>
+          <w:szCs w:val="20"/>
+        </w:rPr>
+        <w:t xml:space="preserve">Tipado Estricto de Datos:</w:t>
+      </w:r>
+      <w:r>
+        <w:rPr>
+          <w:rFonts w:ascii="Calibri" w:cs="Calibri" w:eastAsia="Calibri" w:hAnsi="Calibri"/>
+          <w:b w:val="false"/>
+          <w:bCs w:val="false"/>
+          <w:color w:val="1E293B"/>
+          <w:sz w:val="20"/>
+          <w:szCs w:val="20"/>
+        </w:rPr>
+        <w:t xml:space="preserve"> Fechas en formato </w:t>
+      </w:r>
+      <w:r>
+        <w:rPr>
+          <w:rFonts w:ascii="Consolas" w:cs="Consolas" w:eastAsia="Consolas" w:hAnsi="Consolas"/>
+          <w:b w:val="false"/>
+          <w:bCs w:val="false"/>
+          <w:color w:val="0F172A"/>
+          <w:sz w:val="18"/>
+          <w:szCs w:val="18"/>
+        </w:rPr>
+        <w:t xml:space="preserve"> YYYY-MM-DD </w:t>
+      </w:r>
+      <w:r>
+        <w:rPr>
+          <w:rFonts w:ascii="Calibri" w:cs="Calibri" w:eastAsia="Calibri" w:hAnsi="Calibri"/>
+          <w:b w:val="false"/>
+          <w:bCs w:val="false"/>
+          <w:color w:val="1E293B"/>
+          <w:sz w:val="20"/>
+          <w:szCs w:val="20"/>
+        </w:rPr>
+        <w:t xml:space="preserve">, números limpios sin símbolos (</w:t>
+      </w:r>
+      <w:r>
+        <w:rPr>
+          <w:rFonts w:ascii="Consolas" w:cs="Consolas" w:eastAsia="Consolas" w:hAnsi="Consolas"/>
+          <w:b w:val="false"/>
+          <w:bCs w:val="false"/>
+          <w:color w:val="0F172A"/>
+          <w:sz w:val="18"/>
+          <w:szCs w:val="18"/>
+        </w:rPr>
+        <w:t xml:space="preserve"> 14.5 </w:t>
+      </w:r>
+      <w:r>
+        <w:rPr>
+          <w:rFonts w:ascii="Calibri" w:cs="Calibri" w:eastAsia="Calibri" w:hAnsi="Calibri"/>
+          <w:b w:val="false"/>
+          <w:bCs w:val="false"/>
+          <w:color w:val="1E293B"/>
+          <w:sz w:val="20"/>
+          <w:szCs w:val="20"/>
+        </w:rPr>
+        <w:t xml:space="preserve">, no </w:t>
+      </w:r>
+      <w:r>
+        <w:rPr>
+          <w:rFonts w:ascii="Consolas" w:cs="Consolas" w:eastAsia="Consolas" w:hAnsi="Consolas"/>
+          <w:b w:val="false"/>
+          <w:bCs w:val="false"/>
+          <w:color w:val="0F172A"/>
+          <w:sz w:val="18"/>
+          <w:szCs w:val="18"/>
+        </w:rPr>
+        <w:t xml:space="preserve"> "14,5 MW" </w:t>
+      </w:r>
+      <w:r>
+        <w:rPr>
+          <w:rFonts w:ascii="Calibri" w:cs="Calibri" w:eastAsia="Calibri" w:hAnsi="Calibri"/>
+          <w:b w:val="false"/>
+          <w:bCs w:val="false"/>
+          <w:color w:val="1E293B"/>
+          <w:sz w:val="20"/>
+          <w:szCs w:val="20"/>
+        </w:rPr>
+        <w:t xml:space="preserve">).</w:t>
+      </w:r>
+    </w:p>
+    <w:p>
+      <w:pPr>
+        <w:spacing w:after="80" w:before="60"/>
+      </w:pPr>
+      <w:r>
+        <w:rPr>
+          <w:rFonts w:ascii="Calibri" w:cs="Calibri" w:eastAsia="Calibri" w:hAnsi="Calibri"/>
+          <w:b w:val="false"/>
+          <w:bCs w:val="false"/>
+          <w:color w:val="1E293B"/>
+          <w:sz w:val="20"/>
+          <w:szCs w:val="20"/>
+        </w:rPr>
+        <w:t xml:space="preserve">6. </w:t>
+      </w:r>
+      <w:r>
+        <w:rPr>
+          <w:rFonts w:ascii="Calibri" w:cs="Calibri" w:eastAsia="Calibri" w:hAnsi="Calibri"/>
+          <w:b/>
+          <w:bCs/>
+          <w:color w:val="002B49"/>
+          <w:sz w:val="20"/>
+          <w:szCs w:val="20"/>
+        </w:rPr>
+        <w:t xml:space="preserve">Vinculación a Catálogos MDM:</w:t>
+      </w:r>
+      <w:r>
+        <w:rPr>
+          <w:rFonts w:ascii="Calibri" w:cs="Calibri" w:eastAsia="Calibri" w:hAnsi="Calibri"/>
+          <w:b w:val="false"/>
+          <w:bCs w:val="false"/>
+          <w:color w:val="1E293B"/>
+          <w:sz w:val="20"/>
+          <w:szCs w:val="20"/>
+        </w:rPr>
+        <w:t xml:space="preserve"> Nombres de subestaciones, circuitos y materiales deben coincidir con el catálogo maestro central.</w:t>
+      </w:r>
+    </w:p>
+    <w:p>
+      <w:pPr>
+        <w:spacing w:after="80" w:before="60"/>
+      </w:pPr>
+      <w:r>
+        <w:rPr>
+          <w:rFonts w:ascii="Calibri" w:cs="Calibri" w:eastAsia="Calibri" w:hAnsi="Calibri"/>
+          <w:b w:val="false"/>
+          <w:bCs w:val="false"/>
+          <w:color w:val="1E293B"/>
+          <w:sz w:val="20"/>
+          <w:szCs w:val="20"/>
+        </w:rPr>
+        <w:t xml:space="preserve">7. </w:t>
+      </w:r>
+      <w:r>
+        <w:rPr>
+          <w:rFonts w:ascii="Calibri" w:cs="Calibri" w:eastAsia="Calibri" w:hAnsi="Calibri"/>
+          <w:b/>
+          <w:bCs/>
+          <w:color w:val="002B49"/>
+          <w:sz w:val="20"/>
+          <w:szCs w:val="20"/>
+        </w:rPr>
+        <w:t xml:space="preserve">Nomenclatura Estandarizada del Archivo:</w:t>
+      </w:r>
+      <w:r>
+        <w:rPr>
+          <w:rFonts w:ascii="Calibri" w:cs="Calibri" w:eastAsia="Calibri" w:hAnsi="Calibri"/>
+          <w:b w:val="false"/>
+          <w:bCs w:val="false"/>
+          <w:color w:val="1E293B"/>
+          <w:sz w:val="20"/>
+          <w:szCs w:val="20"/>
+        </w:rPr>
+        <w:t xml:space="preserve"> </w:t>
+      </w:r>
+      <w:r>
+        <w:rPr>
+          <w:rFonts w:ascii="Consolas" w:cs="Consolas" w:eastAsia="Consolas" w:hAnsi="Consolas"/>
+          <w:b w:val="false"/>
+          <w:bCs w:val="false"/>
+          <w:color w:val="0F172A"/>
+          <w:sz w:val="18"/>
+          <w:szCs w:val="18"/>
+        </w:rPr>
+        <w:t xml:space="preserve"> PROCESO_ESTADO_YYYYMMDD_V01.xlsx </w:t>
       </w:r>
       <w:r>
         <w:rPr>
@@ -4481,6 +5358,363 @@
           <w:szCs w:val="20"/>
         </w:rPr>
         <w:t xml:space="preserve">.</w:t>
+      </w:r>
+    </w:p>
+    <w:p>
+      <w:pPr>
+        <w:spacing w:after="80" w:before="60"/>
+      </w:pPr>
+      <w:r>
+        <w:rPr>
+          <w:rFonts w:ascii="Calibri" w:cs="Calibri" w:eastAsia="Calibri" w:hAnsi="Calibri"/>
+          <w:b w:val="false"/>
+          <w:bCs w:val="false"/>
+          <w:color w:val="1E293B"/>
+          <w:sz w:val="20"/>
+          <w:szCs w:val="20"/>
+        </w:rPr>
+        <w:t xml:space="preserve">8. </w:t>
+      </w:r>
+      <w:r>
+        <w:rPr>
+          <w:rFonts w:ascii="Calibri" w:cs="Calibri" w:eastAsia="Calibri" w:hAnsi="Calibri"/>
+          <w:b/>
+          <w:bCs/>
+          <w:color w:val="002B49"/>
+          <w:sz w:val="20"/>
+          <w:szCs w:val="20"/>
+        </w:rPr>
+        <w:t xml:space="preserve">Inclusión Obligatoria del Código de Estado:</w:t>
+      </w:r>
+      <w:r>
+        <w:rPr>
+          <w:rFonts w:ascii="Calibri" w:cs="Calibri" w:eastAsia="Calibri" w:hAnsi="Calibri"/>
+          <w:b w:val="false"/>
+          <w:bCs w:val="false"/>
+          <w:color w:val="1E293B"/>
+          <w:sz w:val="20"/>
+          <w:szCs w:val="20"/>
+        </w:rPr>
+        <w:t xml:space="preserve"> Campo </w:t>
+      </w:r>
+      <w:r>
+        <w:rPr>
+          <w:rFonts w:ascii="Consolas" w:cs="Consolas" w:eastAsia="Consolas" w:hAnsi="Consolas"/>
+          <w:b w:val="false"/>
+          <w:bCs w:val="false"/>
+          <w:color w:val="0F172A"/>
+          <w:sz w:val="18"/>
+          <w:szCs w:val="18"/>
+        </w:rPr>
+        <w:t xml:space="preserve"> COD_ESTADO </w:t>
+      </w:r>
+      <w:r>
+        <w:rPr>
+          <w:rFonts w:ascii="Calibri" w:cs="Calibri" w:eastAsia="Calibri" w:hAnsi="Calibri"/>
+          <w:b w:val="false"/>
+          <w:bCs w:val="false"/>
+          <w:color w:val="1E293B"/>
+          <w:sz w:val="20"/>
+          <w:szCs w:val="20"/>
+        </w:rPr>
+        <w:t xml:space="preserve"> presente en cada fila (</w:t>
+      </w:r>
+      <w:r>
+        <w:rPr>
+          <w:rFonts w:ascii="Consolas" w:cs="Consolas" w:eastAsia="Consolas" w:hAnsi="Consolas"/>
+          <w:b w:val="false"/>
+          <w:bCs w:val="false"/>
+          <w:color w:val="0F172A"/>
+          <w:sz w:val="18"/>
+          <w:szCs w:val="18"/>
+        </w:rPr>
+        <w:t xml:space="preserve"> DCA </w:t>
+      </w:r>
+      <w:r>
+        <w:rPr>
+          <w:rFonts w:ascii="Calibri" w:cs="Calibri" w:eastAsia="Calibri" w:hAnsi="Calibri"/>
+          <w:b w:val="false"/>
+          <w:bCs w:val="false"/>
+          <w:color w:val="1E293B"/>
+          <w:sz w:val="20"/>
+          <w:szCs w:val="20"/>
+        </w:rPr>
+        <w:t xml:space="preserve">, </w:t>
+      </w:r>
+      <w:r>
+        <w:rPr>
+          <w:rFonts w:ascii="Consolas" w:cs="Consolas" w:eastAsia="Consolas" w:hAnsi="Consolas"/>
+          <w:b w:val="false"/>
+          <w:bCs w:val="false"/>
+          <w:color w:val="0F172A"/>
+          <w:sz w:val="18"/>
+          <w:szCs w:val="18"/>
+        </w:rPr>
+        <w:t xml:space="preserve"> ZUL </w:t>
+      </w:r>
+      <w:r>
+        <w:rPr>
+          <w:rFonts w:ascii="Calibri" w:cs="Calibri" w:eastAsia="Calibri" w:hAnsi="Calibri"/>
+          <w:b w:val="false"/>
+          <w:bCs w:val="false"/>
+          <w:color w:val="1E293B"/>
+          <w:sz w:val="20"/>
+          <w:szCs w:val="20"/>
+        </w:rPr>
+        <w:t xml:space="preserve">, </w:t>
+      </w:r>
+      <w:r>
+        <w:rPr>
+          <w:rFonts w:ascii="Consolas" w:cs="Consolas" w:eastAsia="Consolas" w:hAnsi="Consolas"/>
+          <w:b w:val="false"/>
+          <w:bCs w:val="false"/>
+          <w:color w:val="0F172A"/>
+          <w:sz w:val="18"/>
+          <w:szCs w:val="18"/>
+        </w:rPr>
+        <w:t xml:space="preserve"> MIR </w:t>
+      </w:r>
+      <w:r>
+        <w:rPr>
+          <w:rFonts w:ascii="Calibri" w:cs="Calibri" w:eastAsia="Calibri" w:hAnsi="Calibri"/>
+          <w:b w:val="false"/>
+          <w:bCs w:val="false"/>
+          <w:color w:val="1E293B"/>
+          <w:sz w:val="20"/>
+          <w:szCs w:val="20"/>
+        </w:rPr>
+        <w:t xml:space="preserve">).</w:t>
+      </w:r>
+    </w:p>
+    <w:p>
+      <w:pPr>
+        <w:spacing w:after="80" w:before="60"/>
+      </w:pPr>
+      <w:r>
+        <w:rPr>
+          <w:rFonts w:ascii="Calibri" w:cs="Calibri" w:eastAsia="Calibri" w:hAnsi="Calibri"/>
+          <w:b w:val="false"/>
+          <w:bCs w:val="false"/>
+          <w:color w:val="1E293B"/>
+          <w:sz w:val="20"/>
+          <w:szCs w:val="20"/>
+        </w:rPr>
+        <w:t xml:space="preserve">9. </w:t>
+      </w:r>
+      <w:r>
+        <w:rPr>
+          <w:rFonts w:ascii="Calibri" w:cs="Calibri" w:eastAsia="Calibri" w:hAnsi="Calibri"/>
+          <w:b/>
+          <w:bCs/>
+          <w:color w:val="002B49"/>
+          <w:sz w:val="20"/>
+          <w:szCs w:val="20"/>
+        </w:rPr>
+        <w:t xml:space="preserve">Desacoplamiento de Recursos Administrativos:</w:t>
+      </w:r>
+      <w:r>
+        <w:rPr>
+          <w:rFonts w:ascii="Calibri" w:cs="Calibri" w:eastAsia="Calibri" w:hAnsi="Calibri"/>
+          <w:b w:val="false"/>
+          <w:bCs w:val="false"/>
+          <w:color w:val="1E293B"/>
+          <w:sz w:val="20"/>
+          <w:szCs w:val="20"/>
+        </w:rPr>
+        <w:t xml:space="preserve"> No incluir campos de nómina o combustible en formatos de mantenimiento eléctrico.</w:t>
+      </w:r>
+    </w:p>
+    <w:p>
+      <w:pPr>
+        <w:spacing w:after="80" w:before="60"/>
+      </w:pPr>
+      <w:r>
+        <w:rPr>
+          <w:rFonts w:ascii="Calibri" w:cs="Calibri" w:eastAsia="Calibri" w:hAnsi="Calibri"/>
+          <w:b w:val="false"/>
+          <w:bCs w:val="false"/>
+          <w:color w:val="1E293B"/>
+          <w:sz w:val="20"/>
+          <w:szCs w:val="20"/>
+        </w:rPr>
+        <w:t xml:space="preserve">10. </w:t>
+      </w:r>
+      <w:r>
+        <w:rPr>
+          <w:rFonts w:ascii="Calibri" w:cs="Calibri" w:eastAsia="Calibri" w:hAnsi="Calibri"/>
+          <w:b/>
+          <w:bCs/>
+          <w:color w:val="002B49"/>
+          <w:sz w:val="20"/>
+          <w:szCs w:val="20"/>
+        </w:rPr>
+        <w:t xml:space="preserve">Certificación Previa en el Wizard SIGI:</w:t>
+      </w:r>
+      <w:r>
+        <w:rPr>
+          <w:rFonts w:ascii="Calibri" w:cs="Calibri" w:eastAsia="Calibri" w:hAnsi="Calibri"/>
+          <w:b w:val="false"/>
+          <w:bCs w:val="false"/>
+          <w:color w:val="1E293B"/>
+          <w:sz w:val="20"/>
+          <w:szCs w:val="20"/>
+        </w:rPr>
+        <w:t xml:space="preserve"> Todo instrumento debe contar con el dictamen de conformidad del Asistente Wizard antes de ser emitido a los estados.</w:t>
+      </w:r>
+    </w:p>
+    <w:p>
+      <w:pPr>
+        <w:pBdr>
+          <w:bottom w:val="single" w:color="CBD5E1" w:sz="6" w:space="1"/>
+        </w:pBdr>
+        <w:spacing w:after="120" w:before="120"/>
+      </w:pPr>
+    </w:p>
+    <w:p>
+      <w:pPr>
+        <w:pStyle w:val="Heading2"/>
+        <w:spacing w:after="100" w:before="200"/>
+      </w:pPr>
+      <w:r>
+        <w:rPr>
+          <w:rFonts w:ascii="Calibri" w:cs="Calibri" w:eastAsia="Calibri" w:hAnsi="Calibri"/>
+          <w:b/>
+          <w:bCs/>
+          <w:color w:val="004488"/>
+          <w:sz w:val="26"/>
+          <w:szCs w:val="26"/>
+        </w:rPr>
+        <w:t xml:space="preserve">📈 7. HOJA DE RUTA PARA LA IMPLEMENTACIÓN DE LA CAMPAÑA</w:t>
+      </w:r>
+    </w:p>
+    <w:tbl>
+      <w:tblPr>
+        <w:tblW w:type="pct" w:w="100%"/>
+        <w:tblBorders>
+          <w:top w:val="single" w:color="auto" w:sz="4"/>
+          <w:left w:val="single" w:color="auto" w:sz="4"/>
+          <w:bottom w:val="single" w:color="auto" w:sz="4"/>
+          <w:right w:val="single" w:color="auto" w:sz="4"/>
+          <w:insideH w:val="single" w:color="auto" w:sz="4"/>
+          <w:insideV w:val="single" w:color="auto" w:sz="4"/>
+        </w:tblBorders>
+      </w:tblPr>
+      <w:tblGrid>
+        <w:gridCol w:w="100"/>
+      </w:tblGrid>
+      <w:tr>
+        <w:tc>
+          <w:tcPr>
+            <w:tcBorders>
+              <w:top w:val="single" w:color="00F2FE" w:sz="4"/>
+              <w:left w:val="single" w:color="00F2FE" w:sz="16"/>
+              <w:bottom w:val="single" w:color="00F2FE" w:sz="4"/>
+              <w:right w:val="single" w:color="00F2FE" w:sz="4"/>
+            </w:tcBorders>
+            <w:shd w:fill="0F172A" w:val="clear"/>
+            <w:tcMar>
+              <w:top w:type="dxa" w:w="120"/>
+              <w:left w:type="dxa" w:w="160"/>
+              <w:bottom w:type="dxa" w:w="120"/>
+              <w:right w:type="dxa" w:w="160"/>
+            </w:tcMar>
+          </w:tcPr>
+          <w:p>
+            <w:r>
+              <w:rPr>
+                <w:rFonts w:ascii="Consolas" w:cs="Consolas" w:eastAsia="Consolas" w:hAnsi="Consolas"/>
+                <w:color w:val="E2E8F0"/>
+                <w:sz w:val="18"/>
+                <w:szCs w:val="18"/>
+              </w:rPr>
+              <w:t xml:space="preserve">FASE 1: CONCILIACIÓN &amp; CERTIFICACIÓN (Semanas 1 - 2)
+  ├── Pasar los 5 borradores 2026 por el Asistente Wizard ISO 8000 en SIGI.
+  ├── Emitir las 5 Plantillas Oficiales Atómicas (.xlsx de 1 pestaña).
+  └── Publicar el DDL en el esquema sigi de PostgreSQL/Supabase.
+FASE 2: DESPLIEGUE EN EL DATA LAKE (Semanas 3 - 4)
+  ├── Aprovisionar las carpetas de las 5 plantillas en los 25 estados de Google Drive.
+  └── Habilitar la bandeja de ingesta y carga híbrida en el portal SIGI.
+FASE 3: TALLERES TÉCNICOS CON LOS 25 ESTADOS (Semanas 5 - 6)
+  ├── Demostración a los coordinadores estadales: "Cómo llenar la plantilla de 1 pestaña en 5 minutos".
+  └── Capacitación en el uso del Formulario Web Reactivo y resolución de sugerencias de 1-clic.
+FASE 4: APAGADO GRADUAL DEL MODELO LEGACY (Semana 7 en adelante)
+  ├── Desincorporación formal de los libros de 24 pestañas.
+  └── Generación automática de los Informes de Gestión Directiva desde los Dashboards SIGI.</w:t>
+            </w:r>
+          </w:p>
+        </w:tc>
+      </w:tr>
+    </w:tbl>
+    <w:p>
+      <w:pPr>
+        <w:spacing w:after="160"/>
+      </w:pPr>
+    </w:p>
+    <w:p>
+      <w:pPr>
+        <w:pBdr>
+          <w:bottom w:val="single" w:color="CBD5E1" w:sz="6" w:space="1"/>
+        </w:pBdr>
+        <w:spacing w:after="120" w:before="120"/>
+      </w:pPr>
+    </w:p>
+    <w:p>
+      <w:pPr>
+        <w:spacing w:after="80" w:before="60"/>
+      </w:pPr>
+      <w:r>
+        <w:rPr>
+          <w:rFonts w:ascii="Calibri" w:cs="Calibri" w:eastAsia="Calibri" w:hAnsi="Calibri"/>
+          <w:b/>
+          <w:bCs/>
+          <w:color w:val="002B49"/>
+          <w:sz w:val="20"/>
+          <w:szCs w:val="20"/>
+        </w:rPr>
+        <w:t xml:space="preserve">DOCUMENTO CERTIFICADO POR:</w:t>
+      </w:r>
+      <w:r>
+        <w:rPr>
+          <w:rFonts w:ascii="Calibri" w:cs="Calibri" w:eastAsia="Calibri" w:hAnsi="Calibri"/>
+          <w:b w:val="false"/>
+          <w:bCs w:val="false"/>
+          <w:color w:val="1E293B"/>
+          <w:sz w:val="20"/>
+          <w:szCs w:val="20"/>
+        </w:rPr>
+        <w:t xml:space="preserve">  </w:t>
+      </w:r>
+    </w:p>
+    <w:p>
+      <w:pPr>
+        <w:spacing w:after="80" w:before="60"/>
+      </w:pPr>
+      <w:r>
+        <w:rPr>
+          <w:rFonts w:ascii="Calibri" w:cs="Calibri" w:eastAsia="Calibri" w:hAnsi="Calibri"/>
+          <w:b w:val="false"/>
+          <w:bCs w:val="false"/>
+          <w:color w:val="1E293B"/>
+          <w:sz w:val="20"/>
+          <w:szCs w:val="20"/>
+        </w:rPr>
+        <w:t xml:space="preserve">*Gerencia General de Planificación y Distribución (GGPD) — Comité de Arquitectura y Gobernanza de Datos.*  </w:t>
+      </w:r>
+    </w:p>
+    <w:p>
+      <w:pPr>
+        <w:spacing w:after="80" w:before="60"/>
+      </w:pPr>
+      <w:r>
+        <w:rPr>
+          <w:rFonts w:ascii="Calibri" w:cs="Calibri" w:eastAsia="Calibri" w:hAnsi="Calibri"/>
+          <w:b w:val="false"/>
+          <w:bCs w:val="false"/>
+          <w:color w:val="1E293B"/>
+          <w:sz w:val="20"/>
+          <w:szCs w:val="20"/>
+        </w:rPr>
+        <w:t xml:space="preserve">*Registrado en la Bitácora Inmutable bajo Hash Criptográfico SHA-256.*</w:t>
       </w:r>
     </w:p>
     <w:sectPr>

</xml_diff>